<commit_message>
Deploy 2026-04-04 11:52 — 5 file(s) updated
</commit_message>
<xml_diff>
--- a/Mohangraphy_Technical_Documentation.docx
+++ b/Mohangraphy_Technical_Documentation.docx
@@ -4593,7 +4593,7 @@
         <w:pStyle w:val="ListParagraph"/>
         <w:numPr>
           <w:ilvl w:val="0"/>
-          <w:numId w:val="4"/>
+          <w:numId w:val="10"/>
         </w:numPr>
         <w:spacing w:lineRule="auto" w:line="240" w:before="0" w:after="0"/>
         <w:rPr>
@@ -11599,13 +11599,2098 @@
         </w:rPr>
       </w:r>
     </w:p>
+    <w:p>
+      <w:pPr>
+        <w:pStyle w:val="Normal"/>
+        <w:shd w:val="clear" w:fill="F0F4F8"/>
+        <w:spacing w:lineRule="auto" w:line="240" w:before="0" w:after="0"/>
+        <w:ind w:start="360"/>
+        <w:rPr>
+          <w:rFonts w:ascii="Times New Roman" w:hAnsi="Times New Roman"/>
+          <w:color w:val="000000"/>
+        </w:rPr>
+      </w:pPr>
+      <w:r>
+        <w:rPr>
+          <w:rFonts w:eastAsia="Courier New" w:cs="Courier New" w:ascii="Times New Roman" w:hAnsi="Times New Roman"/>
+          <w:color w:val="000000"/>
+          <w:sz w:val="20"/>
+          <w:szCs w:val="20"/>
+        </w:rPr>
+      </w:r>
+    </w:p>
+    <w:p>
+      <w:pPr>
+        <w:pStyle w:val="Heading2"/>
+        <w:spacing w:lineRule="auto" w:line="240" w:before="0" w:after="0"/>
+        <w:rPr>
+          <w:rFonts w:ascii="Times New Roman" w:hAnsi="Times New Roman"/>
+          <w:color w:val="000000"/>
+          <w:sz w:val="24"/>
+          <w:szCs w:val="24"/>
+        </w:rPr>
+      </w:pPr>
+      <w:r>
+        <w:rPr>
+          <w:rFonts w:ascii="Times New Roman" w:hAnsi="Times New Roman"/>
+          <w:color w:val="000000"/>
+          <w:sz w:val="24"/>
+          <w:szCs w:val="24"/>
+        </w:rPr>
+        <w:t xml:space="preserve">Running </w:t>
+      </w:r>
+      <w:r>
+        <w:rPr>
+          <w:rStyle w:val="SourceText"/>
+          <w:rFonts w:ascii="Times New Roman" w:hAnsi="Times New Roman"/>
+          <w:color w:val="000000"/>
+          <w:sz w:val="24"/>
+          <w:szCs w:val="24"/>
+        </w:rPr>
+        <w:t>blog_editor.py</w:t>
+      </w:r>
+    </w:p>
+    <w:p>
+      <w:pPr>
+        <w:pStyle w:val="BodyText"/>
+        <w:spacing w:lineRule="auto" w:line="240" w:before="0" w:after="0"/>
+        <w:ind w:hanging="0" w:start="0" w:end="0"/>
+        <w:rPr>
+          <w:rFonts w:ascii="Times New Roman" w:hAnsi="Times New Roman"/>
+          <w:color w:val="000000"/>
+        </w:rPr>
+      </w:pPr>
+      <w:r>
+        <w:rPr>
+          <w:rFonts w:ascii="Times New Roman" w:hAnsi="Times New Roman"/>
+          <w:color w:val="000000"/>
+        </w:rPr>
+        <w:t>bash</w:t>
+      </w:r>
+    </w:p>
+    <w:p>
+      <w:pPr>
+        <w:pStyle w:val="PreformattedText"/>
+        <w:spacing w:before="0" w:after="0"/>
+        <w:ind w:hanging="0" w:start="0" w:end="0"/>
+        <w:rPr>
+          <w:rFonts w:ascii="Times New Roman" w:hAnsi="Times New Roman" w:eastAsia="Arial" w:cs="Arial"/>
+          <w:color w:val="000000"/>
+          <w:sz w:val="24"/>
+          <w:szCs w:val="24"/>
+        </w:rPr>
+      </w:pPr>
+      <w:r>
+        <w:rPr>
+          <w:rStyle w:val="SourceText"/>
+          <w:rFonts w:ascii="var font-mono" w:hAnsi="var font-mono"/>
+          <w:color w:val="14181F"/>
+          <w:sz w:val="24"/>
+          <w:szCs w:val="24"/>
+          <w:shd w:fill="auto" w:val="clear"/>
+        </w:rPr>
+        <w:t>python3 /Users/ncm/Pictures/Mohangraphy/Scripts/blog_editor.py</w:t>
+      </w:r>
+    </w:p>
+    <w:p>
+      <w:pPr>
+        <w:pStyle w:val="BodyText"/>
+        <w:spacing w:lineRule="auto" w:line="240" w:before="0" w:after="0"/>
+        <w:rPr>
+          <w:rFonts w:ascii="Times New Roman" w:hAnsi="Times New Roman"/>
+          <w:color w:val="000000"/>
+        </w:rPr>
+      </w:pPr>
+      <w:r>
+        <w:rPr>
+          <w:rFonts w:ascii="Times New Roman" w:hAnsi="Times New Roman"/>
+          <w:color w:val="000000"/>
+        </w:rPr>
+        <w:t xml:space="preserve">When you run it, a series of </w:t>
+      </w:r>
+      <w:r>
+        <w:rPr>
+          <w:rStyle w:val="Strong"/>
+          <w:rFonts w:ascii="Times New Roman" w:hAnsi="Times New Roman"/>
+          <w:color w:val="000000"/>
+        </w:rPr>
+        <w:t>native Mac dialog boxes</w:t>
+      </w:r>
+      <w:r>
+        <w:rPr>
+          <w:rFonts w:ascii="Times New Roman" w:hAnsi="Times New Roman"/>
+          <w:color w:val="000000"/>
+        </w:rPr>
+        <w:t xml:space="preserve"> pop up (the same style as system alerts). It walks you through:</w:t>
+      </w:r>
+    </w:p>
+    <w:p>
+      <w:pPr>
+        <w:pStyle w:val="BodyText"/>
+        <w:numPr>
+          <w:ilvl w:val="0"/>
+          <w:numId w:val="3"/>
+        </w:numPr>
+        <w:tabs>
+          <w:tab w:val="clear" w:pos="720"/>
+          <w:tab w:val="left" w:pos="0" w:leader="none"/>
+        </w:tabs>
+        <w:spacing w:lineRule="auto" w:line="240" w:before="0" w:after="0"/>
+        <w:ind w:hanging="283" w:start="709"/>
+        <w:rPr>
+          <w:rFonts w:ascii="Times New Roman" w:hAnsi="Times New Roman"/>
+          <w:color w:val="000000"/>
+        </w:rPr>
+      </w:pPr>
+      <w:r>
+        <w:rPr>
+          <w:rStyle w:val="Strong"/>
+          <w:rFonts w:ascii="Times New Roman" w:hAnsi="Times New Roman"/>
+          <w:color w:val="000000"/>
+        </w:rPr>
+        <w:t>Select a place</w:t>
+      </w:r>
+      <w:r>
+        <w:rPr>
+          <w:rFonts w:ascii="Times New Roman" w:hAnsi="Times New Roman"/>
+          <w:color w:val="000000"/>
+        </w:rPr>
+        <w:t xml:space="preserve"> — pick from your tagged places or type a new one </w:t>
+      </w:r>
+    </w:p>
+    <w:p>
+      <w:pPr>
+        <w:pStyle w:val="BodyText"/>
+        <w:numPr>
+          <w:ilvl w:val="0"/>
+          <w:numId w:val="3"/>
+        </w:numPr>
+        <w:tabs>
+          <w:tab w:val="clear" w:pos="720"/>
+          <w:tab w:val="left" w:pos="0" w:leader="none"/>
+        </w:tabs>
+        <w:spacing w:lineRule="auto" w:line="240" w:before="0" w:after="0"/>
+        <w:ind w:hanging="283" w:start="709"/>
+        <w:rPr>
+          <w:rFonts w:ascii="Times New Roman" w:hAnsi="Times New Roman"/>
+          <w:color w:val="000000"/>
+        </w:rPr>
+      </w:pPr>
+      <w:r>
+        <w:rPr>
+          <w:rStyle w:val="Strong"/>
+          <w:rFonts w:ascii="Times New Roman" w:hAnsi="Times New Roman"/>
+          <w:color w:val="000000"/>
+        </w:rPr>
+        <w:t>Country</w:t>
+      </w:r>
+      <w:r>
+        <w:rPr>
+          <w:rFonts w:ascii="Times New Roman" w:hAnsi="Times New Roman"/>
+          <w:color w:val="000000"/>
+        </w:rPr>
+        <w:t xml:space="preserve"> — leave blank for India </w:t>
+      </w:r>
+    </w:p>
+    <w:p>
+      <w:pPr>
+        <w:pStyle w:val="BodyText"/>
+        <w:numPr>
+          <w:ilvl w:val="0"/>
+          <w:numId w:val="3"/>
+        </w:numPr>
+        <w:tabs>
+          <w:tab w:val="clear" w:pos="720"/>
+          <w:tab w:val="left" w:pos="0" w:leader="none"/>
+        </w:tabs>
+        <w:spacing w:lineRule="auto" w:line="240" w:before="0" w:after="0"/>
+        <w:ind w:hanging="283" w:start="709"/>
+        <w:rPr>
+          <w:rFonts w:ascii="Times New Roman" w:hAnsi="Times New Roman"/>
+          <w:color w:val="000000"/>
+        </w:rPr>
+      </w:pPr>
+      <w:r>
+        <w:rPr>
+          <w:rStyle w:val="Strong"/>
+          <w:rFonts w:ascii="Times New Roman" w:hAnsi="Times New Roman"/>
+          <w:color w:val="000000"/>
+        </w:rPr>
+        <w:t>Dates visited</w:t>
+      </w:r>
+      <w:r>
+        <w:rPr>
+          <w:rFonts w:ascii="Times New Roman" w:hAnsi="Times New Roman"/>
+          <w:color w:val="000000"/>
+        </w:rPr>
+        <w:t xml:space="preserve"> — e.g. "March 2026" </w:t>
+      </w:r>
+    </w:p>
+    <w:p>
+      <w:pPr>
+        <w:pStyle w:val="BodyText"/>
+        <w:numPr>
+          <w:ilvl w:val="0"/>
+          <w:numId w:val="3"/>
+        </w:numPr>
+        <w:tabs>
+          <w:tab w:val="clear" w:pos="720"/>
+          <w:tab w:val="left" w:pos="0" w:leader="none"/>
+        </w:tabs>
+        <w:spacing w:lineRule="auto" w:line="240" w:before="0" w:after="0"/>
+        <w:ind w:hanging="283" w:start="709"/>
+        <w:rPr>
+          <w:rFonts w:ascii="Times New Roman" w:hAnsi="Times New Roman"/>
+          <w:color w:val="000000"/>
+        </w:rPr>
+      </w:pPr>
+      <w:r>
+        <w:rPr>
+          <w:rStyle w:val="Strong"/>
+          <w:rFonts w:ascii="Times New Roman" w:hAnsi="Times New Roman"/>
+          <w:color w:val="000000"/>
+        </w:rPr>
+        <w:t>Post title</w:t>
+      </w:r>
+      <w:r>
+        <w:rPr>
+          <w:rFonts w:ascii="Times New Roman" w:hAnsi="Times New Roman"/>
+          <w:color w:val="000000"/>
+        </w:rPr>
+        <w:t xml:space="preserve"> — e.g. "Madurai - A 2500 year old city" </w:t>
+      </w:r>
+    </w:p>
+    <w:p>
+      <w:pPr>
+        <w:pStyle w:val="BodyText"/>
+        <w:numPr>
+          <w:ilvl w:val="0"/>
+          <w:numId w:val="3"/>
+        </w:numPr>
+        <w:tabs>
+          <w:tab w:val="clear" w:pos="720"/>
+          <w:tab w:val="left" w:pos="0" w:leader="none"/>
+        </w:tabs>
+        <w:spacing w:lineRule="auto" w:line="240" w:before="0" w:after="0"/>
+        <w:ind w:hanging="283" w:start="709"/>
+        <w:rPr>
+          <w:rFonts w:ascii="Times New Roman" w:hAnsi="Times New Roman"/>
+          <w:color w:val="000000"/>
+        </w:rPr>
+      </w:pPr>
+      <w:r>
+        <w:rPr>
+          <w:rStyle w:val="Strong"/>
+          <w:rFonts w:ascii="Times New Roman" w:hAnsi="Times New Roman"/>
+          <w:color w:val="000000"/>
+        </w:rPr>
+        <w:t>Place tag</w:t>
+      </w:r>
+      <w:r>
+        <w:rPr>
+          <w:rFonts w:ascii="Times New Roman" w:hAnsi="Times New Roman"/>
+          <w:color w:val="000000"/>
+        </w:rPr>
+        <w:t xml:space="preserve"> — must match the city/place in your photo metadata </w:t>
+      </w:r>
+    </w:p>
+    <w:p>
+      <w:pPr>
+        <w:pStyle w:val="BodyText"/>
+        <w:numPr>
+          <w:ilvl w:val="0"/>
+          <w:numId w:val="3"/>
+        </w:numPr>
+        <w:tabs>
+          <w:tab w:val="clear" w:pos="720"/>
+          <w:tab w:val="left" w:pos="0" w:leader="none"/>
+        </w:tabs>
+        <w:spacing w:lineRule="auto" w:line="240" w:before="0" w:after="0"/>
+        <w:ind w:hanging="283" w:start="709"/>
+        <w:rPr>
+          <w:rFonts w:ascii="Times New Roman" w:hAnsi="Times New Roman"/>
+          <w:color w:val="000000"/>
+        </w:rPr>
+      </w:pPr>
+      <w:r>
+        <w:rPr>
+          <w:rStyle w:val="Strong"/>
+          <w:rFonts w:ascii="Times New Roman" w:hAnsi="Times New Roman"/>
+          <w:color w:val="000000"/>
+        </w:rPr>
+        <w:t>Summary</w:t>
+      </w:r>
+      <w:r>
+        <w:rPr>
+          <w:rFonts w:ascii="Times New Roman" w:hAnsi="Times New Roman"/>
+          <w:color w:val="000000"/>
+        </w:rPr>
+        <w:t xml:space="preserve"> — 1-2 sentences shown on the index list </w:t>
+      </w:r>
+    </w:p>
+    <w:p>
+      <w:pPr>
+        <w:pStyle w:val="BodyText"/>
+        <w:numPr>
+          <w:ilvl w:val="0"/>
+          <w:numId w:val="3"/>
+        </w:numPr>
+        <w:tabs>
+          <w:tab w:val="clear" w:pos="720"/>
+          <w:tab w:val="left" w:pos="0" w:leader="none"/>
+        </w:tabs>
+        <w:spacing w:lineRule="auto" w:line="240" w:before="0" w:after="0"/>
+        <w:ind w:hanging="283" w:start="709"/>
+        <w:rPr>
+          <w:rFonts w:ascii="Times New Roman" w:hAnsi="Times New Roman"/>
+          <w:color w:val="000000"/>
+        </w:rPr>
+      </w:pPr>
+      <w:r>
+        <w:rPr>
+          <w:rStyle w:val="Strong"/>
+          <w:rFonts w:ascii="Times New Roman" w:hAnsi="Times New Roman"/>
+          <w:color w:val="000000"/>
+        </w:rPr>
+        <w:t>Article body</w:t>
+      </w:r>
+      <w:r>
+        <w:rPr>
+          <w:rFonts w:ascii="Times New Roman" w:hAnsi="Times New Roman"/>
+          <w:color w:val="000000"/>
+        </w:rPr>
+        <w:t xml:space="preserve"> — paste your write-up here </w:t>
+      </w:r>
+    </w:p>
+    <w:p>
+      <w:pPr>
+        <w:pStyle w:val="BodyText"/>
+        <w:numPr>
+          <w:ilvl w:val="0"/>
+          <w:numId w:val="3"/>
+        </w:numPr>
+        <w:tabs>
+          <w:tab w:val="clear" w:pos="720"/>
+          <w:tab w:val="left" w:pos="0" w:leader="none"/>
+        </w:tabs>
+        <w:spacing w:lineRule="auto" w:line="240" w:before="0" w:after="0"/>
+        <w:ind w:hanging="283" w:start="709"/>
+        <w:rPr>
+          <w:rFonts w:ascii="Times New Roman" w:hAnsi="Times New Roman"/>
+          <w:color w:val="000000"/>
+        </w:rPr>
+      </w:pPr>
+      <w:r>
+        <w:rPr>
+          <w:rStyle w:val="Strong"/>
+          <w:rFonts w:ascii="Times New Roman" w:hAnsi="Times New Roman"/>
+          <w:color w:val="000000"/>
+        </w:rPr>
+        <w:t>Collections links</w:t>
+      </w:r>
+      <w:r>
+        <w:rPr>
+          <w:rFonts w:ascii="Times New Roman" w:hAnsi="Times New Roman"/>
+          <w:color w:val="000000"/>
+        </w:rPr>
+        <w:t xml:space="preserve"> — which photo collections to link at the bottom </w:t>
+      </w:r>
+    </w:p>
+    <w:p>
+      <w:pPr>
+        <w:pStyle w:val="BodyText"/>
+        <w:spacing w:lineRule="auto" w:line="240" w:before="0" w:after="0"/>
+        <w:rPr>
+          <w:rFonts w:ascii="Times New Roman" w:hAnsi="Times New Roman"/>
+          <w:color w:val="000000"/>
+        </w:rPr>
+      </w:pPr>
+      <w:r>
+        <w:rPr>
+          <w:rFonts w:ascii="Times New Roman" w:hAnsi="Times New Roman"/>
+          <w:color w:val="000000"/>
+        </w:rPr>
+        <w:t xml:space="preserve">It saves everything to </w:t>
+      </w:r>
+      <w:r>
+        <w:rPr>
+          <w:rStyle w:val="SourceText"/>
+          <w:rFonts w:ascii="Times New Roman" w:hAnsi="Times New Roman"/>
+          <w:color w:val="000000"/>
+        </w:rPr>
+        <w:t>blog_posts.json</w:t>
+      </w:r>
+      <w:r>
+        <w:rPr>
+          <w:rFonts w:ascii="Times New Roman" w:hAnsi="Times New Roman"/>
+          <w:color w:val="000000"/>
+        </w:rPr>
+        <w:t xml:space="preserve">. Then you run </w:t>
+      </w:r>
+      <w:r>
+        <w:rPr>
+          <w:rStyle w:val="SourceText"/>
+          <w:rFonts w:ascii="Times New Roman" w:hAnsi="Times New Roman"/>
+          <w:color w:val="000000"/>
+        </w:rPr>
+        <w:t>Claude_mohangraphy.py</w:t>
+      </w:r>
+      <w:r>
+        <w:rPr>
+          <w:rFonts w:ascii="Times New Roman" w:hAnsi="Times New Roman"/>
+          <w:color w:val="000000"/>
+        </w:rPr>
+        <w:t xml:space="preserve"> to rebuild and publish the site.</w:t>
+      </w:r>
+    </w:p>
+    <w:p>
+      <w:pPr>
+        <w:pStyle w:val="Heading2"/>
+        <w:spacing w:lineRule="auto" w:line="240" w:before="0" w:after="0"/>
+        <w:rPr>
+          <w:rFonts w:ascii="Times New Roman" w:hAnsi="Times New Roman"/>
+          <w:color w:val="000000"/>
+          <w:sz w:val="24"/>
+          <w:szCs w:val="24"/>
+        </w:rPr>
+      </w:pPr>
+      <w:r>
+        <w:rPr>
+          <w:rFonts w:ascii="Times New Roman" w:hAnsi="Times New Roman"/>
+          <w:color w:val="000000"/>
+          <w:sz w:val="24"/>
+          <w:szCs w:val="24"/>
+        </w:rPr>
+        <w:t>Yes — run it each time for a new post</w:t>
+      </w:r>
+    </w:p>
+    <w:p>
+      <w:pPr>
+        <w:pStyle w:val="BodyText"/>
+        <w:spacing w:lineRule="auto" w:line="240" w:before="0" w:after="0"/>
+        <w:rPr>
+          <w:rFonts w:ascii="Times New Roman" w:hAnsi="Times New Roman"/>
+          <w:color w:val="000000"/>
+        </w:rPr>
+      </w:pPr>
+      <w:r>
+        <w:rPr>
+          <w:rFonts w:ascii="Times New Roman" w:hAnsi="Times New Roman"/>
+          <w:color w:val="000000"/>
+        </w:rPr>
+        <w:t>Every time you want to add a new article:</w:t>
+      </w:r>
+    </w:p>
+    <w:p>
+      <w:pPr>
+        <w:pStyle w:val="BodyText"/>
+        <w:numPr>
+          <w:ilvl w:val="0"/>
+          <w:numId w:val="4"/>
+        </w:numPr>
+        <w:tabs>
+          <w:tab w:val="clear" w:pos="720"/>
+          <w:tab w:val="left" w:pos="0" w:leader="none"/>
+        </w:tabs>
+        <w:spacing w:lineRule="auto" w:line="240" w:before="0" w:after="0"/>
+        <w:ind w:hanging="283" w:start="709"/>
+        <w:rPr>
+          <w:rFonts w:ascii="Times New Roman" w:hAnsi="Times New Roman"/>
+          <w:color w:val="000000"/>
+        </w:rPr>
+      </w:pPr>
+      <w:r>
+        <w:rPr>
+          <w:rFonts w:ascii="Times New Roman" w:hAnsi="Times New Roman"/>
+          <w:color w:val="000000"/>
+        </w:rPr>
+        <w:t xml:space="preserve">Run </w:t>
+      </w:r>
+      <w:r>
+        <w:rPr>
+          <w:rStyle w:val="SourceText"/>
+          <w:rFonts w:ascii="Times New Roman" w:hAnsi="Times New Roman"/>
+          <w:color w:val="000000"/>
+        </w:rPr>
+        <w:t>blog_editor.py</w:t>
+      </w:r>
+      <w:r>
+        <w:rPr>
+          <w:rFonts w:ascii="Times New Roman" w:hAnsi="Times New Roman"/>
+          <w:color w:val="000000"/>
+        </w:rPr>
+        <w:t xml:space="preserve"> → fill in the dialogs → saves to </w:t>
+      </w:r>
+      <w:r>
+        <w:rPr>
+          <w:rStyle w:val="SourceText"/>
+          <w:rFonts w:ascii="Times New Roman" w:hAnsi="Times New Roman"/>
+          <w:color w:val="000000"/>
+        </w:rPr>
+        <w:t>blog_posts.json</w:t>
+      </w:r>
+      <w:r>
+        <w:rPr>
+          <w:rFonts w:ascii="Times New Roman" w:hAnsi="Times New Roman"/>
+          <w:color w:val="000000"/>
+        </w:rPr>
+        <w:t xml:space="preserve"> </w:t>
+      </w:r>
+    </w:p>
+    <w:p>
+      <w:pPr>
+        <w:pStyle w:val="BodyText"/>
+        <w:numPr>
+          <w:ilvl w:val="0"/>
+          <w:numId w:val="4"/>
+        </w:numPr>
+        <w:tabs>
+          <w:tab w:val="clear" w:pos="720"/>
+          <w:tab w:val="left" w:pos="0" w:leader="none"/>
+        </w:tabs>
+        <w:spacing w:lineRule="auto" w:line="240" w:before="0" w:after="0"/>
+        <w:ind w:hanging="283" w:start="709"/>
+        <w:rPr>
+          <w:rFonts w:ascii="Times New Roman" w:hAnsi="Times New Roman"/>
+          <w:color w:val="000000"/>
+        </w:rPr>
+      </w:pPr>
+      <w:r>
+        <w:rPr>
+          <w:rFonts w:ascii="Times New Roman" w:hAnsi="Times New Roman"/>
+          <w:color w:val="000000"/>
+        </w:rPr>
+        <w:t xml:space="preserve">Run </w:t>
+      </w:r>
+      <w:r>
+        <w:rPr>
+          <w:rStyle w:val="SourceText"/>
+          <w:rFonts w:ascii="Times New Roman" w:hAnsi="Times New Roman"/>
+          <w:color w:val="000000"/>
+        </w:rPr>
+        <w:t>Claude_mohangraphy.py</w:t>
+      </w:r>
+      <w:r>
+        <w:rPr>
+          <w:rFonts w:ascii="Times New Roman" w:hAnsi="Times New Roman"/>
+          <w:color w:val="000000"/>
+        </w:rPr>
+        <w:t xml:space="preserve"> → rebuilds and publishes</w:t>
+      </w:r>
+    </w:p>
+    <w:p>
+      <w:pPr>
+        <w:pStyle w:val="Heading2"/>
+        <w:spacing w:lineRule="auto" w:line="240" w:before="0" w:after="0"/>
+        <w:rPr>
+          <w:rFonts w:ascii="Times New Roman" w:hAnsi="Times New Roman"/>
+          <w:color w:val="000000"/>
+          <w:sz w:val="24"/>
+          <w:szCs w:val="24"/>
+        </w:rPr>
+      </w:pPr>
+      <w:r>
+        <w:rPr>
+          <w:rFonts w:ascii="Times New Roman" w:hAnsi="Times New Roman"/>
+          <w:color w:val="000000"/>
+          <w:sz w:val="24"/>
+          <w:szCs w:val="24"/>
+        </w:rPr>
+        <w:t>Editing a previous blog</w:t>
+      </w:r>
+    </w:p>
+    <w:p>
+      <w:pPr>
+        <w:pStyle w:val="BodyText"/>
+        <w:spacing w:lineRule="auto" w:line="240" w:before="0" w:after="0"/>
+        <w:rPr>
+          <w:rFonts w:ascii="Times New Roman" w:hAnsi="Times New Roman"/>
+          <w:color w:val="000000"/>
+        </w:rPr>
+      </w:pPr>
+      <w:r>
+        <w:rPr>
+          <w:rFonts w:ascii="Times New Roman" w:hAnsi="Times New Roman"/>
+          <w:color w:val="000000"/>
+        </w:rPr>
+        <w:t xml:space="preserve">When you run </w:t>
+      </w:r>
+      <w:r>
+        <w:rPr>
+          <w:rStyle w:val="SourceText"/>
+          <w:rFonts w:ascii="Times New Roman" w:hAnsi="Times New Roman"/>
+          <w:color w:val="000000"/>
+        </w:rPr>
+        <w:t>blog_editor.py</w:t>
+      </w:r>
+      <w:r>
+        <w:rPr>
+          <w:rFonts w:ascii="Times New Roman" w:hAnsi="Times New Roman"/>
+          <w:color w:val="000000"/>
+        </w:rPr>
+        <w:t xml:space="preserve">, the </w:t>
+      </w:r>
+      <w:r>
+        <w:rPr>
+          <w:rStyle w:val="Strong"/>
+          <w:rFonts w:ascii="Times New Roman" w:hAnsi="Times New Roman"/>
+          <w:color w:val="000000"/>
+        </w:rPr>
+        <w:t>first dialog shows a menu</w:t>
+      </w:r>
+      <w:r>
+        <w:rPr>
+          <w:rFonts w:ascii="Times New Roman" w:hAnsi="Times New Roman"/>
+          <w:color w:val="000000"/>
+        </w:rPr>
+        <w:t xml:space="preserve"> with options like:</w:t>
+      </w:r>
+    </w:p>
+    <w:p>
+      <w:pPr>
+        <w:pStyle w:val="BodyText"/>
+        <w:numPr>
+          <w:ilvl w:val="0"/>
+          <w:numId w:val="5"/>
+        </w:numPr>
+        <w:tabs>
+          <w:tab w:val="clear" w:pos="720"/>
+          <w:tab w:val="left" w:pos="0" w:leader="none"/>
+        </w:tabs>
+        <w:spacing w:lineRule="auto" w:line="240" w:before="0" w:after="0"/>
+        <w:ind w:hanging="283" w:start="709"/>
+        <w:rPr>
+          <w:rFonts w:ascii="Times New Roman" w:hAnsi="Times New Roman"/>
+          <w:color w:val="000000"/>
+        </w:rPr>
+      </w:pPr>
+      <w:r>
+        <w:rPr>
+          <w:rStyle w:val="SourceText"/>
+          <w:rFonts w:ascii="Times New Roman" w:hAnsi="Times New Roman"/>
+          <w:color w:val="000000"/>
+        </w:rPr>
+        <w:t>New post</w:t>
+      </w:r>
+      <w:r>
+        <w:rPr>
+          <w:rFonts w:ascii="Times New Roman" w:hAnsi="Times New Roman"/>
+          <w:color w:val="000000"/>
+        </w:rPr>
+        <w:t xml:space="preserve"> </w:t>
+      </w:r>
+    </w:p>
+    <w:p>
+      <w:pPr>
+        <w:pStyle w:val="BodyText"/>
+        <w:numPr>
+          <w:ilvl w:val="0"/>
+          <w:numId w:val="5"/>
+        </w:numPr>
+        <w:tabs>
+          <w:tab w:val="clear" w:pos="720"/>
+          <w:tab w:val="left" w:pos="0" w:leader="none"/>
+        </w:tabs>
+        <w:spacing w:lineRule="auto" w:line="240" w:before="0" w:after="0"/>
+        <w:ind w:hanging="283" w:start="709"/>
+        <w:rPr>
+          <w:rFonts w:ascii="Times New Roman" w:hAnsi="Times New Roman"/>
+          <w:color w:val="000000"/>
+        </w:rPr>
+      </w:pPr>
+      <w:r>
+        <w:rPr>
+          <w:rStyle w:val="SourceText"/>
+          <w:rFonts w:ascii="Times New Roman" w:hAnsi="Times New Roman"/>
+          <w:color w:val="000000"/>
+        </w:rPr>
+        <w:t>Edit: Madurai - A 2500 year old city</w:t>
+      </w:r>
+      <w:r>
+        <w:rPr>
+          <w:rFonts w:ascii="Times New Roman" w:hAnsi="Times New Roman"/>
+          <w:color w:val="000000"/>
+        </w:rPr>
+        <w:t xml:space="preserve"> </w:t>
+      </w:r>
+    </w:p>
+    <w:p>
+      <w:pPr>
+        <w:pStyle w:val="BodyText"/>
+        <w:numPr>
+          <w:ilvl w:val="0"/>
+          <w:numId w:val="5"/>
+        </w:numPr>
+        <w:tabs>
+          <w:tab w:val="clear" w:pos="720"/>
+          <w:tab w:val="left" w:pos="0" w:leader="none"/>
+        </w:tabs>
+        <w:spacing w:lineRule="auto" w:line="240" w:before="0" w:after="0"/>
+        <w:ind w:hanging="283" w:start="709"/>
+        <w:rPr>
+          <w:rFonts w:ascii="Times New Roman" w:hAnsi="Times New Roman"/>
+          <w:color w:val="000000"/>
+        </w:rPr>
+      </w:pPr>
+      <w:r>
+        <w:rPr>
+          <w:rStyle w:val="SourceText"/>
+          <w:rFonts w:ascii="Times New Roman" w:hAnsi="Times New Roman"/>
+          <w:color w:val="000000"/>
+        </w:rPr>
+        <w:t>Delete: Madurai - A 2500 year old city</w:t>
+      </w:r>
+      <w:r>
+        <w:rPr>
+          <w:rFonts w:ascii="Times New Roman" w:hAnsi="Times New Roman"/>
+          <w:color w:val="000000"/>
+        </w:rPr>
+        <w:t xml:space="preserve"> </w:t>
+      </w:r>
+    </w:p>
+    <w:p>
+      <w:pPr>
+        <w:pStyle w:val="BodyText"/>
+        <w:numPr>
+          <w:ilvl w:val="0"/>
+          <w:numId w:val="5"/>
+        </w:numPr>
+        <w:tabs>
+          <w:tab w:val="clear" w:pos="720"/>
+          <w:tab w:val="left" w:pos="0" w:leader="none"/>
+        </w:tabs>
+        <w:spacing w:lineRule="auto" w:line="240" w:before="0" w:after="0"/>
+        <w:ind w:hanging="283" w:start="709"/>
+        <w:rPr>
+          <w:rFonts w:ascii="Times New Roman" w:hAnsi="Times New Roman"/>
+          <w:color w:val="000000"/>
+        </w:rPr>
+      </w:pPr>
+      <w:r>
+        <w:rPr>
+          <w:rStyle w:val="SourceText"/>
+          <w:rFonts w:ascii="Times New Roman" w:hAnsi="Times New Roman"/>
+          <w:color w:val="000000"/>
+        </w:rPr>
+        <w:t>Done</w:t>
+      </w:r>
+      <w:r>
+        <w:rPr>
+          <w:rFonts w:ascii="Times New Roman" w:hAnsi="Times New Roman"/>
+          <w:color w:val="000000"/>
+        </w:rPr>
+        <w:t xml:space="preserve"> </w:t>
+      </w:r>
+    </w:p>
+    <w:p>
+      <w:pPr>
+        <w:pStyle w:val="BodyText"/>
+        <w:spacing w:lineRule="auto" w:line="240" w:before="0" w:after="0"/>
+        <w:rPr>
+          <w:rFonts w:ascii="Times New Roman" w:hAnsi="Times New Roman"/>
+          <w:color w:val="000000"/>
+        </w:rPr>
+      </w:pPr>
+      <w:r>
+        <w:rPr>
+          <w:rFonts w:ascii="Times New Roman" w:hAnsi="Times New Roman"/>
+          <w:color w:val="000000"/>
+        </w:rPr>
+        <w:t xml:space="preserve">Select </w:t>
+      </w:r>
+      <w:r>
+        <w:rPr>
+          <w:rStyle w:val="Strong"/>
+          <w:rFonts w:ascii="Times New Roman" w:hAnsi="Times New Roman"/>
+          <w:color w:val="000000"/>
+        </w:rPr>
+        <w:t>Edit: [title]</w:t>
+      </w:r>
+      <w:r>
+        <w:rPr>
+          <w:rFonts w:ascii="Times New Roman" w:hAnsi="Times New Roman"/>
+          <w:color w:val="000000"/>
+        </w:rPr>
+        <w:t xml:space="preserve"> to re-open any existing post and change any field.</w:t>
+      </w:r>
+    </w:p>
+    <w:p>
+      <w:pPr>
+        <w:pStyle w:val="HorizontalLine"/>
+        <w:spacing w:before="0" w:after="0"/>
+        <w:rPr>
+          <w:rFonts w:ascii="Times New Roman" w:hAnsi="Times New Roman"/>
+          <w:color w:val="000000"/>
+          <w:sz w:val="24"/>
+          <w:szCs w:val="24"/>
+        </w:rPr>
+      </w:pPr>
+      <w:r>
+        <w:rPr>
+          <w:rFonts w:ascii="Times New Roman" w:hAnsi="Times New Roman"/>
+          <w:color w:val="000000"/>
+          <w:sz w:val="24"/>
+          <w:szCs w:val="24"/>
+        </w:rPr>
+      </w:r>
+    </w:p>
+    <w:p>
+      <w:pPr>
+        <w:pStyle w:val="Heading2"/>
+        <w:spacing w:before="0" w:after="0"/>
+        <w:rPr>
+          <w:rFonts w:ascii="Times New Roman" w:hAnsi="Times New Roman"/>
+          <w:color w:val="000000"/>
+          <w:sz w:val="24"/>
+          <w:szCs w:val="24"/>
+        </w:rPr>
+      </w:pPr>
+      <w:r>
+        <w:rPr>
+          <w:rFonts w:ascii="Times New Roman" w:hAnsi="Times New Roman"/>
+          <w:color w:val="000000"/>
+          <w:sz w:val="24"/>
+          <w:szCs w:val="24"/>
+        </w:rPr>
+        <w:t xml:space="preserve">For long articles — edit </w:t>
+      </w:r>
+      <w:r>
+        <w:rPr>
+          <w:rStyle w:val="SourceText"/>
+          <w:rFonts w:ascii="Times New Roman" w:hAnsi="Times New Roman"/>
+          <w:color w:val="000000"/>
+          <w:sz w:val="24"/>
+          <w:szCs w:val="24"/>
+        </w:rPr>
+        <w:t>blog_posts.json</w:t>
+      </w:r>
+      <w:r>
+        <w:rPr>
+          <w:rFonts w:ascii="Times New Roman" w:hAnsi="Times New Roman"/>
+          <w:color w:val="000000"/>
+          <w:sz w:val="24"/>
+          <w:szCs w:val="24"/>
+        </w:rPr>
+        <w:t xml:space="preserve"> directly</w:t>
+      </w:r>
+    </w:p>
+    <w:p>
+      <w:pPr>
+        <w:pStyle w:val="BodyText"/>
+        <w:spacing w:lineRule="auto" w:line="240" w:before="0" w:after="0"/>
+        <w:rPr>
+          <w:rFonts w:ascii="Times New Roman" w:hAnsi="Times New Roman"/>
+          <w:color w:val="000000"/>
+        </w:rPr>
+      </w:pPr>
+      <w:r>
+        <w:rPr>
+          <w:rFonts w:ascii="Times New Roman" w:hAnsi="Times New Roman"/>
+          <w:color w:val="000000"/>
+        </w:rPr>
+        <w:t xml:space="preserve">The dialog box is too small for a full article. For anything longer than a paragraph or two, </w:t>
+      </w:r>
+      <w:r>
+        <w:rPr>
+          <w:rStyle w:val="Strong"/>
+          <w:rFonts w:ascii="Times New Roman" w:hAnsi="Times New Roman"/>
+          <w:color w:val="000000"/>
+        </w:rPr>
+        <w:t xml:space="preserve">edit </w:t>
+      </w:r>
+      <w:r>
+        <w:rPr>
+          <w:rStyle w:val="SourceText"/>
+          <w:rFonts w:ascii="Times New Roman" w:hAnsi="Times New Roman"/>
+          <w:color w:val="000000"/>
+        </w:rPr>
+        <w:t>blog_posts.json</w:t>
+      </w:r>
+      <w:r>
+        <w:rPr>
+          <w:rStyle w:val="Strong"/>
+          <w:rFonts w:ascii="Times New Roman" w:hAnsi="Times New Roman"/>
+          <w:color w:val="000000"/>
+        </w:rPr>
+        <w:t xml:space="preserve"> directly</w:t>
+      </w:r>
+      <w:r>
+        <w:rPr>
+          <w:rFonts w:ascii="Times New Roman" w:hAnsi="Times New Roman"/>
+          <w:color w:val="000000"/>
+        </w:rPr>
+        <w:t xml:space="preserve">. The best app for this is </w:t>
+      </w:r>
+      <w:r>
+        <w:rPr>
+          <w:rStyle w:val="Strong"/>
+          <w:rFonts w:ascii="Times New Roman" w:hAnsi="Times New Roman"/>
+          <w:color w:val="000000"/>
+        </w:rPr>
+        <w:t>not TextEdit</w:t>
+      </w:r>
+      <w:r>
+        <w:rPr>
+          <w:rFonts w:ascii="Times New Roman" w:hAnsi="Times New Roman"/>
+          <w:color w:val="000000"/>
+        </w:rPr>
+        <w:t xml:space="preserve"> — use one of these instead:</w:t>
+      </w:r>
+    </w:p>
+    <w:p>
+      <w:pPr>
+        <w:pStyle w:val="Heading3"/>
+        <w:spacing w:before="0" w:after="0"/>
+        <w:rPr>
+          <w:rFonts w:ascii="Times New Roman" w:hAnsi="Times New Roman" w:eastAsia="Arial" w:cs="Arial"/>
+          <w:color w:val="000000"/>
+        </w:rPr>
+      </w:pPr>
+      <w:r>
+        <w:rPr>
+          <w:rFonts w:eastAsia="Arial" w:cs="Arial" w:ascii="Times New Roman" w:hAnsi="Times New Roman"/>
+          <w:color w:val="000000"/>
+        </w:rPr>
+        <w:t>Option 1 — VS Code (recommended, free)</w:t>
+      </w:r>
+    </w:p>
+    <w:p>
+      <w:pPr>
+        <w:pStyle w:val="BodyText"/>
+        <w:spacing w:lineRule="auto" w:line="240" w:before="0" w:after="0"/>
+        <w:rPr>
+          <w:rFonts w:ascii="Times New Roman" w:hAnsi="Times New Roman"/>
+          <w:color w:val="000000"/>
+        </w:rPr>
+      </w:pPr>
+      <w:r>
+        <w:rPr>
+          <w:rFonts w:ascii="Times New Roman" w:hAnsi="Times New Roman"/>
+          <w:color w:val="000000"/>
+        </w:rPr>
+        <w:t xml:space="preserve">Download from </w:t>
+      </w:r>
+      <w:hyperlink r:id="rId3">
+        <w:r>
+          <w:rPr>
+            <w:rStyle w:val="Hyperlink"/>
+            <w:rFonts w:ascii="Times New Roman" w:hAnsi="Times New Roman"/>
+            <w:color w:val="000000"/>
+          </w:rPr>
+          <w:t>code.visualstudio.com</w:t>
+        </w:r>
+      </w:hyperlink>
+      <w:r>
+        <w:rPr>
+          <w:rFonts w:ascii="Times New Roman" w:hAnsi="Times New Roman"/>
+          <w:color w:val="000000"/>
+        </w:rPr>
+        <w:t>. It colour-codes JSON, catches errors, and handles long text cleanly.</w:t>
+      </w:r>
+    </w:p>
+    <w:p>
+      <w:pPr>
+        <w:pStyle w:val="BodyText"/>
+        <w:spacing w:lineRule="auto" w:line="240" w:before="0" w:after="0"/>
+        <w:ind w:hanging="0" w:start="0" w:end="0"/>
+        <w:rPr>
+          <w:rFonts w:ascii="Times New Roman" w:hAnsi="Times New Roman"/>
+          <w:color w:val="000000"/>
+        </w:rPr>
+      </w:pPr>
+      <w:r>
+        <w:rPr>
+          <w:rFonts w:ascii="Times New Roman" w:hAnsi="Times New Roman"/>
+          <w:color w:val="000000"/>
+        </w:rPr>
+        <w:t>bash</w:t>
+      </w:r>
+    </w:p>
+    <w:p>
+      <w:pPr>
+        <w:pStyle w:val="PreformattedText"/>
+        <w:spacing w:before="0" w:after="0"/>
+        <w:ind w:hanging="0" w:start="0" w:end="0"/>
+        <w:rPr>
+          <w:rFonts w:ascii="Times New Roman" w:hAnsi="Times New Roman" w:eastAsia="Arial" w:cs="Arial"/>
+          <w:color w:val="000000"/>
+          <w:sz w:val="24"/>
+          <w:szCs w:val="24"/>
+        </w:rPr>
+      </w:pPr>
+      <w:r>
+        <w:rPr>
+          <w:rStyle w:val="SourceText"/>
+          <w:rFonts w:ascii="var font-mono" w:hAnsi="var font-mono"/>
+          <w:color w:val="6E7687"/>
+          <w:sz w:val="24"/>
+          <w:szCs w:val="24"/>
+          <w:shd w:fill="auto" w:val="clear"/>
+        </w:rPr>
+        <w:t># Open the file directly from Terminal:</w:t>
+      </w:r>
+    </w:p>
+    <w:p>
+      <w:pPr>
+        <w:pStyle w:val="PreformattedText"/>
+        <w:spacing w:before="0" w:after="0"/>
+        <w:rPr>
+          <w:rFonts w:ascii="Times New Roman" w:hAnsi="Times New Roman" w:eastAsia="Arial" w:cs="Arial"/>
+          <w:color w:val="000000"/>
+          <w:sz w:val="24"/>
+          <w:szCs w:val="24"/>
+        </w:rPr>
+      </w:pPr>
+      <w:r>
+        <w:rPr>
+          <w:rStyle w:val="SourceText"/>
+          <w:rFonts w:ascii="var font-mono" w:hAnsi="var font-mono"/>
+          <w:color w:val="14181F"/>
+          <w:sz w:val="24"/>
+          <w:szCs w:val="24"/>
+          <w:shd w:fill="auto" w:val="clear"/>
+        </w:rPr>
+        <w:t>code /Users/ncm/Pictures/Mohangraphy/Scripts/blog_posts.json</w:t>
+      </w:r>
+    </w:p>
+    <w:p>
+      <w:pPr>
+        <w:pStyle w:val="Heading3"/>
+        <w:spacing w:before="0" w:after="0"/>
+        <w:rPr>
+          <w:rFonts w:ascii="Times New Roman" w:hAnsi="Times New Roman" w:eastAsia="Arial" w:cs="Arial"/>
+          <w:color w:val="000000"/>
+        </w:rPr>
+      </w:pPr>
+      <w:r>
+        <w:rPr>
+          <w:rFonts w:eastAsia="Arial" w:cs="Arial" w:ascii="Times New Roman" w:hAnsi="Times New Roman"/>
+          <w:color w:val="000000"/>
+        </w:rPr>
+        <w:t>Option 2 — TextEdit (works but be careful)</w:t>
+      </w:r>
+    </w:p>
+    <w:p>
+      <w:pPr>
+        <w:pStyle w:val="BodyText"/>
+        <w:numPr>
+          <w:ilvl w:val="0"/>
+          <w:numId w:val="6"/>
+        </w:numPr>
+        <w:tabs>
+          <w:tab w:val="clear" w:pos="720"/>
+          <w:tab w:val="left" w:pos="0" w:leader="none"/>
+        </w:tabs>
+        <w:spacing w:lineRule="auto" w:line="240" w:before="0" w:after="0"/>
+        <w:ind w:hanging="283" w:start="709"/>
+        <w:rPr>
+          <w:rFonts w:ascii="Times New Roman" w:hAnsi="Times New Roman"/>
+          <w:color w:val="000000"/>
+        </w:rPr>
+      </w:pPr>
+      <w:r>
+        <w:rPr>
+          <w:rFonts w:ascii="Times New Roman" w:hAnsi="Times New Roman"/>
+          <w:color w:val="000000"/>
+        </w:rPr>
+        <w:t xml:space="preserve">Open TextEdit → </w:t>
+      </w:r>
+      <w:r>
+        <w:rPr>
+          <w:rStyle w:val="Strong"/>
+          <w:rFonts w:ascii="Times New Roman" w:hAnsi="Times New Roman"/>
+          <w:color w:val="000000"/>
+        </w:rPr>
+        <w:t>Format menu → Make Plain Text</w:t>
+      </w:r>
+      <w:r>
+        <w:rPr>
+          <w:rFonts w:ascii="Times New Roman" w:hAnsi="Times New Roman"/>
+          <w:color w:val="000000"/>
+        </w:rPr>
+        <w:t xml:space="preserve"> (critical — Rich Text will corrupt the file) </w:t>
+      </w:r>
+    </w:p>
+    <w:p>
+      <w:pPr>
+        <w:pStyle w:val="BodyText"/>
+        <w:numPr>
+          <w:ilvl w:val="0"/>
+          <w:numId w:val="6"/>
+        </w:numPr>
+        <w:tabs>
+          <w:tab w:val="clear" w:pos="720"/>
+          <w:tab w:val="left" w:pos="0" w:leader="none"/>
+        </w:tabs>
+        <w:spacing w:lineRule="auto" w:line="240" w:before="0" w:after="0"/>
+        <w:ind w:hanging="283" w:start="709"/>
+        <w:rPr>
+          <w:rFonts w:ascii="Times New Roman" w:hAnsi="Times New Roman"/>
+          <w:color w:val="000000"/>
+        </w:rPr>
+      </w:pPr>
+      <w:r>
+        <w:rPr>
+          <w:rFonts w:ascii="Times New Roman" w:hAnsi="Times New Roman"/>
+          <w:color w:val="000000"/>
+        </w:rPr>
+        <w:t xml:space="preserve">Open the file: File → Open → navigate to </w:t>
+      </w:r>
+      <w:r>
+        <w:rPr>
+          <w:rStyle w:val="SourceText"/>
+          <w:rFonts w:ascii="Times New Roman" w:hAnsi="Times New Roman"/>
+          <w:color w:val="000000"/>
+        </w:rPr>
+        <w:t>Scripts/blog_posts.json</w:t>
+      </w:r>
+      <w:r>
+        <w:rPr>
+          <w:rFonts w:ascii="Times New Roman" w:hAnsi="Times New Roman"/>
+          <w:color w:val="000000"/>
+        </w:rPr>
+        <w:t xml:space="preserve"> </w:t>
+      </w:r>
+    </w:p>
+    <w:p>
+      <w:pPr>
+        <w:pStyle w:val="BodyText"/>
+        <w:numPr>
+          <w:ilvl w:val="0"/>
+          <w:numId w:val="6"/>
+        </w:numPr>
+        <w:tabs>
+          <w:tab w:val="clear" w:pos="720"/>
+          <w:tab w:val="left" w:pos="0" w:leader="none"/>
+        </w:tabs>
+        <w:spacing w:lineRule="auto" w:line="240" w:before="0" w:after="0"/>
+        <w:ind w:hanging="283" w:start="709"/>
+        <w:rPr>
+          <w:rFonts w:ascii="Times New Roman" w:hAnsi="Times New Roman"/>
+          <w:color w:val="000000"/>
+        </w:rPr>
+      </w:pPr>
+      <w:r>
+        <w:rPr>
+          <w:rFonts w:ascii="Times New Roman" w:hAnsi="Times New Roman"/>
+          <w:color w:val="000000"/>
+        </w:rPr>
+        <w:t xml:space="preserve">Edit the </w:t>
+      </w:r>
+      <w:r>
+        <w:rPr>
+          <w:rStyle w:val="SourceText"/>
+          <w:rFonts w:ascii="Times New Roman" w:hAnsi="Times New Roman"/>
+          <w:color w:val="000000"/>
+        </w:rPr>
+        <w:t>"body"</w:t>
+      </w:r>
+      <w:r>
+        <w:rPr>
+          <w:rFonts w:ascii="Times New Roman" w:hAnsi="Times New Roman"/>
+          <w:color w:val="000000"/>
+        </w:rPr>
+        <w:t xml:space="preserve"> field </w:t>
+      </w:r>
+    </w:p>
+    <w:p>
+      <w:pPr>
+        <w:pStyle w:val="BodyText"/>
+        <w:numPr>
+          <w:ilvl w:val="0"/>
+          <w:numId w:val="6"/>
+        </w:numPr>
+        <w:tabs>
+          <w:tab w:val="clear" w:pos="720"/>
+          <w:tab w:val="left" w:pos="0" w:leader="none"/>
+        </w:tabs>
+        <w:spacing w:lineRule="auto" w:line="240" w:before="0" w:after="0"/>
+        <w:ind w:hanging="283" w:start="709"/>
+        <w:rPr>
+          <w:rFonts w:ascii="Times New Roman" w:hAnsi="Times New Roman"/>
+          <w:color w:val="000000"/>
+        </w:rPr>
+      </w:pPr>
+      <w:r>
+        <w:rPr>
+          <w:rFonts w:ascii="Times New Roman" w:hAnsi="Times New Roman"/>
+          <w:color w:val="000000"/>
+        </w:rPr>
+        <w:t xml:space="preserve">Save as </w:t>
+      </w:r>
+      <w:r>
+        <w:rPr>
+          <w:rStyle w:val="Strong"/>
+          <w:rFonts w:ascii="Times New Roman" w:hAnsi="Times New Roman"/>
+          <w:color w:val="000000"/>
+        </w:rPr>
+        <w:t>plain text</w:t>
+      </w:r>
+      <w:r>
+        <w:rPr>
+          <w:rFonts w:ascii="Times New Roman" w:hAnsi="Times New Roman"/>
+          <w:color w:val="000000"/>
+        </w:rPr>
+        <w:t xml:space="preserve">, keeping the </w:t>
+      </w:r>
+      <w:r>
+        <w:rPr>
+          <w:rStyle w:val="SourceText"/>
+          <w:rFonts w:ascii="Times New Roman" w:hAnsi="Times New Roman"/>
+          <w:color w:val="000000"/>
+        </w:rPr>
+        <w:t>.json</w:t>
+      </w:r>
+      <w:r>
+        <w:rPr>
+          <w:rFonts w:ascii="Times New Roman" w:hAnsi="Times New Roman"/>
+          <w:color w:val="000000"/>
+        </w:rPr>
+        <w:t xml:space="preserve"> extension </w:t>
+      </w:r>
+    </w:p>
+    <w:p>
+      <w:pPr>
+        <w:pStyle w:val="Heading3"/>
+        <w:spacing w:before="0" w:after="0"/>
+        <w:rPr>
+          <w:rFonts w:ascii="Times New Roman" w:hAnsi="Times New Roman" w:eastAsia="Arial" w:cs="Arial"/>
+          <w:color w:val="000000"/>
+        </w:rPr>
+      </w:pPr>
+      <w:r>
+        <w:rPr>
+          <w:rFonts w:eastAsia="Arial" w:cs="Arial" w:ascii="Times New Roman" w:hAnsi="Times New Roman"/>
+          <w:color w:val="000000"/>
+        </w:rPr>
+        <w:t>Option 3 — Terminal with nano (simplest, no download needed)</w:t>
+      </w:r>
+    </w:p>
+    <w:p>
+      <w:pPr>
+        <w:pStyle w:val="BodyText"/>
+        <w:spacing w:lineRule="auto" w:line="240" w:before="0" w:after="0"/>
+        <w:ind w:hanging="0" w:start="0" w:end="0"/>
+        <w:rPr>
+          <w:rFonts w:ascii="Times New Roman" w:hAnsi="Times New Roman"/>
+          <w:color w:val="000000"/>
+        </w:rPr>
+      </w:pPr>
+      <w:r>
+        <w:rPr>
+          <w:rFonts w:ascii="Times New Roman" w:hAnsi="Times New Roman"/>
+          <w:color w:val="000000"/>
+        </w:rPr>
+        <w:t>bash</w:t>
+      </w:r>
+    </w:p>
+    <w:p>
+      <w:pPr>
+        <w:pStyle w:val="PreformattedText"/>
+        <w:spacing w:before="0" w:after="0"/>
+        <w:ind w:hanging="0" w:start="0" w:end="0"/>
+        <w:rPr>
+          <w:rFonts w:ascii="Times New Roman" w:hAnsi="Times New Roman" w:eastAsia="Arial" w:cs="Arial"/>
+          <w:color w:val="000000"/>
+          <w:sz w:val="24"/>
+          <w:szCs w:val="24"/>
+        </w:rPr>
+      </w:pPr>
+      <w:r>
+        <w:rPr>
+          <w:rStyle w:val="SourceText"/>
+          <w:rFonts w:ascii="var font-mono" w:hAnsi="var font-mono"/>
+          <w:color w:val="0051C2"/>
+          <w:sz w:val="24"/>
+          <w:szCs w:val="24"/>
+          <w:shd w:fill="auto" w:val="clear"/>
+        </w:rPr>
+        <w:t>nano</w:t>
+      </w:r>
+      <w:r>
+        <w:rPr>
+          <w:rStyle w:val="SourceText"/>
+          <w:rFonts w:ascii="var font-mono" w:hAnsi="var font-mono"/>
+          <w:color w:val="14181F"/>
+          <w:sz w:val="24"/>
+          <w:szCs w:val="24"/>
+          <w:shd w:fill="auto" w:val="clear"/>
+        </w:rPr>
+        <w:t xml:space="preserve"> /Users/ncm/Pictures/Mohangraphy/Scripts/blog_posts.json</w:t>
+      </w:r>
+    </w:p>
+    <w:p>
+      <w:pPr>
+        <w:pStyle w:val="BodyText"/>
+        <w:spacing w:lineRule="auto" w:line="240" w:before="0" w:after="0"/>
+        <w:rPr>
+          <w:rFonts w:ascii="Times New Roman" w:hAnsi="Times New Roman"/>
+          <w:color w:val="000000"/>
+        </w:rPr>
+      </w:pPr>
+      <w:r>
+        <w:rPr>
+          <w:rFonts w:ascii="Times New Roman" w:hAnsi="Times New Roman"/>
+          <w:color w:val="000000"/>
+        </w:rPr>
+        <w:t xml:space="preserve">Use arrow keys to navigate, </w:t>
+      </w:r>
+      <w:r>
+        <w:rPr>
+          <w:rStyle w:val="SourceText"/>
+          <w:rFonts w:ascii="Times New Roman" w:hAnsi="Times New Roman"/>
+          <w:color w:val="000000"/>
+        </w:rPr>
+        <w:t>Ctrl+O</w:t>
+      </w:r>
+      <w:r>
+        <w:rPr>
+          <w:rFonts w:ascii="Times New Roman" w:hAnsi="Times New Roman"/>
+          <w:color w:val="000000"/>
+        </w:rPr>
+        <w:t xml:space="preserve"> to save, </w:t>
+      </w:r>
+      <w:r>
+        <w:rPr>
+          <w:rStyle w:val="SourceText"/>
+          <w:rFonts w:ascii="Times New Roman" w:hAnsi="Times New Roman"/>
+          <w:color w:val="000000"/>
+        </w:rPr>
+        <w:t>Ctrl+X</w:t>
+      </w:r>
+      <w:r>
+        <w:rPr>
+          <w:rFonts w:ascii="Times New Roman" w:hAnsi="Times New Roman"/>
+          <w:color w:val="000000"/>
+        </w:rPr>
+        <w:t xml:space="preserve"> to exit.</w:t>
+      </w:r>
+    </w:p>
+    <w:p>
+      <w:pPr>
+        <w:pStyle w:val="HorizontalLine"/>
+        <w:spacing w:before="0" w:after="0"/>
+        <w:rPr>
+          <w:rFonts w:ascii="Times New Roman" w:hAnsi="Times New Roman"/>
+          <w:color w:val="000000"/>
+          <w:sz w:val="24"/>
+          <w:szCs w:val="24"/>
+        </w:rPr>
+      </w:pPr>
+      <w:r>
+        <w:rPr>
+          <w:rFonts w:ascii="Times New Roman" w:hAnsi="Times New Roman"/>
+          <w:color w:val="000000"/>
+          <w:sz w:val="24"/>
+          <w:szCs w:val="24"/>
+        </w:rPr>
+      </w:r>
+    </w:p>
+    <w:p>
+      <w:pPr>
+        <w:pStyle w:val="Heading2"/>
+        <w:spacing w:before="0" w:after="0"/>
+        <w:rPr>
+          <w:rFonts w:ascii="Times New Roman" w:hAnsi="Times New Roman"/>
+          <w:color w:val="000000"/>
+          <w:sz w:val="24"/>
+          <w:szCs w:val="24"/>
+        </w:rPr>
+      </w:pPr>
+      <w:r>
+        <w:rPr>
+          <w:rFonts w:ascii="Times New Roman" w:hAnsi="Times New Roman"/>
+          <w:color w:val="000000"/>
+          <w:sz w:val="24"/>
+          <w:szCs w:val="24"/>
+        </w:rPr>
+        <w:t xml:space="preserve">The </w:t>
+      </w:r>
+      <w:r>
+        <w:rPr>
+          <w:rStyle w:val="SourceText"/>
+          <w:rFonts w:ascii="Times New Roman" w:hAnsi="Times New Roman"/>
+          <w:color w:val="000000"/>
+          <w:sz w:val="24"/>
+          <w:szCs w:val="24"/>
+        </w:rPr>
+        <w:t>"body"</w:t>
+      </w:r>
+      <w:r>
+        <w:rPr>
+          <w:rFonts w:ascii="Times New Roman" w:hAnsi="Times New Roman"/>
+          <w:color w:val="000000"/>
+          <w:sz w:val="24"/>
+          <w:szCs w:val="24"/>
+        </w:rPr>
+        <w:t xml:space="preserve"> field format</w:t>
+      </w:r>
+    </w:p>
+    <w:p>
+      <w:pPr>
+        <w:pStyle w:val="BodyText"/>
+        <w:spacing w:lineRule="auto" w:line="240" w:before="0" w:after="0"/>
+        <w:rPr>
+          <w:rFonts w:ascii="Times New Roman" w:hAnsi="Times New Roman"/>
+          <w:color w:val="000000"/>
+        </w:rPr>
+      </w:pPr>
+      <w:r>
+        <w:rPr>
+          <w:rFonts w:ascii="Times New Roman" w:hAnsi="Times New Roman"/>
+          <w:color w:val="000000"/>
+        </w:rPr>
+        <w:t xml:space="preserve">In </w:t>
+      </w:r>
+      <w:r>
+        <w:rPr>
+          <w:rStyle w:val="SourceText"/>
+          <w:rFonts w:ascii="Times New Roman" w:hAnsi="Times New Roman"/>
+          <w:color w:val="000000"/>
+        </w:rPr>
+        <w:t>blog_posts.json</w:t>
+      </w:r>
+      <w:r>
+        <w:rPr>
+          <w:rFonts w:ascii="Times New Roman" w:hAnsi="Times New Roman"/>
+          <w:color w:val="000000"/>
+        </w:rPr>
+        <w:t>, write your article like this:</w:t>
+      </w:r>
+    </w:p>
+    <w:p>
+      <w:pPr>
+        <w:pStyle w:val="BodyText"/>
+        <w:spacing w:lineRule="auto" w:line="240" w:before="0" w:after="0"/>
+        <w:ind w:hanging="0" w:start="0" w:end="0"/>
+        <w:rPr>
+          <w:rFonts w:ascii="Times New Roman" w:hAnsi="Times New Roman"/>
+          <w:color w:val="000000"/>
+        </w:rPr>
+      </w:pPr>
+      <w:r>
+        <w:rPr>
+          <w:rFonts w:ascii="Times New Roman" w:hAnsi="Times New Roman"/>
+          <w:color w:val="000000"/>
+        </w:rPr>
+        <w:t>json</w:t>
+      </w:r>
+    </w:p>
+    <w:p>
+      <w:pPr>
+        <w:pStyle w:val="PreformattedText"/>
+        <w:spacing w:before="0" w:after="0"/>
+        <w:ind w:hanging="0" w:start="0" w:end="0"/>
+        <w:rPr>
+          <w:rFonts w:ascii="Times New Roman" w:hAnsi="Times New Roman" w:eastAsia="Arial" w:cs="Arial"/>
+          <w:color w:val="000000"/>
+          <w:sz w:val="24"/>
+          <w:szCs w:val="24"/>
+        </w:rPr>
+      </w:pPr>
+      <w:r>
+        <w:rPr>
+          <w:rStyle w:val="SourceText"/>
+          <w:rFonts w:ascii="var font-mono" w:hAnsi="var font-mono"/>
+          <w:color w:val="B80A18"/>
+          <w:sz w:val="24"/>
+          <w:szCs w:val="24"/>
+          <w:shd w:fill="auto" w:val="clear"/>
+        </w:rPr>
+        <w:t>"body"</w:t>
+      </w:r>
+      <w:r>
+        <w:rPr>
+          <w:rStyle w:val="SourceText"/>
+          <w:rFonts w:ascii="var font-mono" w:hAnsi="var font-mono"/>
+          <w:color w:val="14181F"/>
+          <w:sz w:val="24"/>
+          <w:szCs w:val="24"/>
+          <w:shd w:fill="auto" w:val="clear"/>
+        </w:rPr>
+        <w:t xml:space="preserve">: </w:t>
+      </w:r>
+      <w:r>
+        <w:rPr>
+          <w:rStyle w:val="SourceText"/>
+          <w:rFonts w:ascii="var font-mono" w:hAnsi="var font-mono"/>
+          <w:color w:val="008000"/>
+          <w:sz w:val="24"/>
+          <w:szCs w:val="24"/>
+          <w:shd w:fill="auto" w:val="clear"/>
+        </w:rPr>
+        <w:t>"First paragraph text here.\n\nSecond paragraph after a blank line.\n\nThird paragraph."</w:t>
+      </w:r>
+    </w:p>
+    <w:p>
+      <w:pPr>
+        <w:pStyle w:val="BodyText"/>
+        <w:numPr>
+          <w:ilvl w:val="0"/>
+          <w:numId w:val="7"/>
+        </w:numPr>
+        <w:tabs>
+          <w:tab w:val="clear" w:pos="720"/>
+          <w:tab w:val="left" w:pos="0" w:leader="none"/>
+        </w:tabs>
+        <w:spacing w:lineRule="auto" w:line="240" w:before="0" w:after="0"/>
+        <w:ind w:hanging="283" w:start="709"/>
+        <w:rPr>
+          <w:rFonts w:ascii="Times New Roman" w:hAnsi="Times New Roman"/>
+          <w:color w:val="000000"/>
+        </w:rPr>
+      </w:pPr>
+      <w:r>
+        <w:rPr>
+          <w:rStyle w:val="SourceText"/>
+          <w:rFonts w:ascii="Times New Roman" w:hAnsi="Times New Roman"/>
+          <w:color w:val="000000"/>
+        </w:rPr>
+        <w:t>\n\n</w:t>
+      </w:r>
+      <w:r>
+        <w:rPr>
+          <w:rFonts w:ascii="Times New Roman" w:hAnsi="Times New Roman"/>
+          <w:color w:val="000000"/>
+        </w:rPr>
+        <w:t xml:space="preserve"> = blank line between paragraphs </w:t>
+      </w:r>
+    </w:p>
+    <w:p>
+      <w:pPr>
+        <w:pStyle w:val="BodyText"/>
+        <w:numPr>
+          <w:ilvl w:val="0"/>
+          <w:numId w:val="7"/>
+        </w:numPr>
+        <w:tabs>
+          <w:tab w:val="clear" w:pos="720"/>
+          <w:tab w:val="left" w:pos="0" w:leader="none"/>
+        </w:tabs>
+        <w:spacing w:lineRule="auto" w:line="240" w:before="0" w:after="0"/>
+        <w:ind w:hanging="283" w:start="709"/>
+        <w:rPr>
+          <w:rFonts w:ascii="Times New Roman" w:hAnsi="Times New Roman"/>
+          <w:color w:val="000000"/>
+        </w:rPr>
+      </w:pPr>
+      <w:r>
+        <w:rPr>
+          <w:rStyle w:val="SourceText"/>
+          <w:rFonts w:ascii="Times New Roman" w:hAnsi="Times New Roman"/>
+          <w:color w:val="000000"/>
+        </w:rPr>
+        <w:t>\n</w:t>
+      </w:r>
+      <w:r>
+        <w:rPr>
+          <w:rFonts w:ascii="Times New Roman" w:hAnsi="Times New Roman"/>
+          <w:color w:val="000000"/>
+        </w:rPr>
+        <w:t xml:space="preserve"> = line break within a paragraph </w:t>
+      </w:r>
+    </w:p>
+    <w:p>
+      <w:pPr>
+        <w:pStyle w:val="BodyText"/>
+        <w:numPr>
+          <w:ilvl w:val="0"/>
+          <w:numId w:val="7"/>
+        </w:numPr>
+        <w:tabs>
+          <w:tab w:val="clear" w:pos="720"/>
+          <w:tab w:val="left" w:pos="0" w:leader="none"/>
+        </w:tabs>
+        <w:spacing w:lineRule="auto" w:line="240" w:before="0" w:after="0"/>
+        <w:ind w:hanging="283" w:start="709"/>
+        <w:rPr>
+          <w:rFonts w:ascii="Times New Roman" w:hAnsi="Times New Roman"/>
+          <w:color w:val="000000"/>
+        </w:rPr>
+      </w:pPr>
+      <w:r>
+        <w:rPr>
+          <w:rFonts w:ascii="Times New Roman" w:hAnsi="Times New Roman"/>
+          <w:color w:val="000000"/>
+        </w:rPr>
+        <w:t xml:space="preserve">The site renders each paragraph as its own </w:t>
+      </w:r>
+      <w:r>
+        <w:rPr>
+          <w:rStyle w:val="SourceText"/>
+          <w:rFonts w:ascii="Times New Roman" w:hAnsi="Times New Roman"/>
+          <w:color w:val="000000"/>
+        </w:rPr>
+        <w:t>&lt;p&gt;</w:t>
+      </w:r>
+      <w:r>
+        <w:rPr>
+          <w:rFonts w:ascii="Times New Roman" w:hAnsi="Times New Roman"/>
+          <w:color w:val="000000"/>
+        </w:rPr>
+        <w:t xml:space="preserve"> block </w:t>
+      </w:r>
+    </w:p>
+    <w:p>
+      <w:pPr>
+        <w:pStyle w:val="HorizontalLine"/>
+        <w:spacing w:before="0" w:after="0"/>
+        <w:rPr>
+          <w:rFonts w:ascii="Times New Roman" w:hAnsi="Times New Roman"/>
+          <w:color w:val="000000"/>
+          <w:sz w:val="24"/>
+          <w:szCs w:val="24"/>
+        </w:rPr>
+      </w:pPr>
+      <w:r>
+        <w:rPr>
+          <w:rFonts w:ascii="Times New Roman" w:hAnsi="Times New Roman"/>
+          <w:color w:val="000000"/>
+          <w:sz w:val="24"/>
+          <w:szCs w:val="24"/>
+        </w:rPr>
+      </w:r>
+    </w:p>
+    <w:p>
+      <w:pPr>
+        <w:pStyle w:val="BodyText"/>
+        <w:spacing w:lineRule="auto" w:line="240" w:before="0" w:after="0"/>
+        <w:rPr>
+          <w:rFonts w:ascii="Times New Roman" w:hAnsi="Times New Roman"/>
+          <w:color w:val="000000"/>
+        </w:rPr>
+      </w:pPr>
+      <w:r>
+        <w:rPr>
+          <w:rStyle w:val="Strong"/>
+          <w:rFonts w:ascii="Times New Roman" w:hAnsi="Times New Roman"/>
+          <w:color w:val="000000"/>
+        </w:rPr>
+        <w:t>Recommended workflow for a long article:</w:t>
+      </w:r>
+    </w:p>
+    <w:p>
+      <w:pPr>
+        <w:pStyle w:val="BodyText"/>
+        <w:numPr>
+          <w:ilvl w:val="0"/>
+          <w:numId w:val="8"/>
+        </w:numPr>
+        <w:tabs>
+          <w:tab w:val="clear" w:pos="720"/>
+          <w:tab w:val="left" w:pos="0" w:leader="none"/>
+        </w:tabs>
+        <w:spacing w:lineRule="auto" w:line="240" w:before="0" w:after="0"/>
+        <w:ind w:hanging="283" w:start="709"/>
+        <w:rPr>
+          <w:rFonts w:ascii="Times New Roman" w:hAnsi="Times New Roman"/>
+          <w:color w:val="000000"/>
+        </w:rPr>
+      </w:pPr>
+      <w:r>
+        <w:rPr>
+          <w:rFonts w:ascii="Times New Roman" w:hAnsi="Times New Roman"/>
+          <w:color w:val="000000"/>
+        </w:rPr>
+        <w:t xml:space="preserve">Write it in Notes or Pages on your Mac </w:t>
+      </w:r>
+    </w:p>
+    <w:p>
+      <w:pPr>
+        <w:pStyle w:val="BodyText"/>
+        <w:numPr>
+          <w:ilvl w:val="0"/>
+          <w:numId w:val="8"/>
+        </w:numPr>
+        <w:tabs>
+          <w:tab w:val="clear" w:pos="720"/>
+          <w:tab w:val="left" w:pos="0" w:leader="none"/>
+        </w:tabs>
+        <w:spacing w:lineRule="auto" w:line="240" w:before="0" w:after="0"/>
+        <w:ind w:hanging="283" w:start="709"/>
+        <w:rPr>
+          <w:rFonts w:ascii="Times New Roman" w:hAnsi="Times New Roman"/>
+          <w:color w:val="000000"/>
+        </w:rPr>
+      </w:pPr>
+      <w:r>
+        <w:rPr>
+          <w:rFonts w:ascii="Times New Roman" w:hAnsi="Times New Roman"/>
+          <w:color w:val="000000"/>
+        </w:rPr>
+        <w:t xml:space="preserve">Open </w:t>
+      </w:r>
+      <w:r>
+        <w:rPr>
+          <w:rStyle w:val="SourceText"/>
+          <w:rFonts w:ascii="Times New Roman" w:hAnsi="Times New Roman"/>
+          <w:color w:val="000000"/>
+        </w:rPr>
+        <w:t>blog_posts.json</w:t>
+      </w:r>
+      <w:r>
+        <w:rPr>
+          <w:rFonts w:ascii="Times New Roman" w:hAnsi="Times New Roman"/>
+          <w:color w:val="000000"/>
+        </w:rPr>
+        <w:t xml:space="preserve"> in VS Code or nano </w:t>
+      </w:r>
+    </w:p>
+    <w:p>
+      <w:pPr>
+        <w:pStyle w:val="BodyText"/>
+        <w:numPr>
+          <w:ilvl w:val="0"/>
+          <w:numId w:val="8"/>
+        </w:numPr>
+        <w:tabs>
+          <w:tab w:val="clear" w:pos="720"/>
+          <w:tab w:val="left" w:pos="0" w:leader="none"/>
+        </w:tabs>
+        <w:spacing w:lineRule="auto" w:line="240" w:before="0" w:after="0"/>
+        <w:ind w:hanging="283" w:start="709"/>
+        <w:rPr>
+          <w:rFonts w:ascii="Times New Roman" w:hAnsi="Times New Roman"/>
+          <w:color w:val="000000"/>
+        </w:rPr>
+      </w:pPr>
+      <w:r>
+        <w:rPr>
+          <w:rFonts w:ascii="Times New Roman" w:hAnsi="Times New Roman"/>
+          <w:color w:val="000000"/>
+        </w:rPr>
+        <w:t xml:space="preserve">Paste the text into the </w:t>
+      </w:r>
+      <w:r>
+        <w:rPr>
+          <w:rStyle w:val="SourceText"/>
+          <w:rFonts w:ascii="Times New Roman" w:hAnsi="Times New Roman"/>
+          <w:color w:val="000000"/>
+        </w:rPr>
+        <w:t>"body"</w:t>
+      </w:r>
+      <w:r>
+        <w:rPr>
+          <w:rFonts w:ascii="Times New Roman" w:hAnsi="Times New Roman"/>
+          <w:color w:val="000000"/>
+        </w:rPr>
+        <w:t xml:space="preserve"> field, replacing </w:t>
+      </w:r>
+      <w:r>
+        <w:rPr>
+          <w:rStyle w:val="SourceText"/>
+          <w:rFonts w:ascii="Times New Roman" w:hAnsi="Times New Roman"/>
+          <w:color w:val="000000"/>
+        </w:rPr>
+        <w:t>\n</w:t>
+      </w:r>
+      <w:r>
+        <w:rPr>
+          <w:rFonts w:ascii="Times New Roman" w:hAnsi="Times New Roman"/>
+          <w:color w:val="000000"/>
+        </w:rPr>
+        <w:t xml:space="preserve"> for line breaks </w:t>
+      </w:r>
+    </w:p>
+    <w:p>
+      <w:pPr>
+        <w:pStyle w:val="BodyText"/>
+        <w:numPr>
+          <w:ilvl w:val="0"/>
+          <w:numId w:val="8"/>
+        </w:numPr>
+        <w:tabs>
+          <w:tab w:val="clear" w:pos="720"/>
+          <w:tab w:val="left" w:pos="0" w:leader="none"/>
+        </w:tabs>
+        <w:spacing w:lineRule="auto" w:line="240" w:before="0" w:after="0"/>
+        <w:ind w:hanging="283" w:start="709"/>
+        <w:rPr>
+          <w:rFonts w:ascii="Times New Roman" w:hAnsi="Times New Roman"/>
+          <w:color w:val="000000"/>
+        </w:rPr>
+      </w:pPr>
+      <w:r>
+        <w:rPr>
+          <w:rFonts w:ascii="Times New Roman" w:hAnsi="Times New Roman"/>
+          <w:color w:val="000000"/>
+        </w:rPr>
+        <w:t xml:space="preserve">Run </w:t>
+      </w:r>
+      <w:r>
+        <w:rPr>
+          <w:rStyle w:val="SourceText"/>
+          <w:rFonts w:ascii="Times New Roman" w:hAnsi="Times New Roman"/>
+          <w:color w:val="000000"/>
+        </w:rPr>
+        <w:t>Claude_mohangraphy.py</w:t>
+      </w:r>
+      <w:r>
+        <w:rPr>
+          <w:rFonts w:ascii="Times New Roman" w:hAnsi="Times New Roman"/>
+          <w:color w:val="000000"/>
+        </w:rPr>
+        <w:t xml:space="preserve"> to publish </w:t>
+      </w:r>
+    </w:p>
+    <w:p>
+      <w:pPr>
+        <w:pStyle w:val="BodyText"/>
+        <w:spacing w:lineRule="auto" w:line="240" w:before="0" w:after="0"/>
+        <w:rPr>
+          <w:rFonts w:ascii="Times New Roman" w:hAnsi="Times New Roman"/>
+          <w:color w:val="000000"/>
+        </w:rPr>
+      </w:pPr>
+      <w:r>
+        <w:rPr>
+          <w:rFonts w:ascii="Times New Roman" w:hAnsi="Times New Roman"/>
+          <w:color w:val="000000"/>
+        </w:rPr>
+      </w:r>
+    </w:p>
+    <w:p>
+      <w:pPr>
+        <w:pStyle w:val="BodyText"/>
+        <w:spacing w:lineRule="auto" w:line="240" w:before="0" w:after="0"/>
+        <w:rPr>
+          <w:rFonts w:ascii="Times New Roman" w:hAnsi="Times New Roman"/>
+          <w:b/>
+          <w:bCs/>
+          <w:color w:val="000000"/>
+        </w:rPr>
+      </w:pPr>
+      <w:r>
+        <w:rPr>
+          <w:rFonts w:ascii="Times New Roman" w:hAnsi="Times New Roman"/>
+          <w:b/>
+          <w:bCs/>
+          <w:color w:val="000000"/>
+        </w:rPr>
+        <w:t>To delete all posts in Blog</w:t>
+      </w:r>
+    </w:p>
+    <w:p>
+      <w:pPr>
+        <w:pStyle w:val="BodyText"/>
+        <w:spacing w:lineRule="auto" w:line="240" w:before="0" w:after="0"/>
+        <w:rPr>
+          <w:rFonts w:ascii="Times New Roman" w:hAnsi="Times New Roman"/>
+          <w:color w:val="000000"/>
+        </w:rPr>
+      </w:pPr>
+      <w:r>
+        <w:rPr>
+          <w:rFonts w:ascii="Times New Roman" w:hAnsi="Times New Roman"/>
+          <w:color w:val="000000"/>
+        </w:rPr>
+        <w:t xml:space="preserve">Open </w:t>
+      </w:r>
+      <w:r>
+        <w:rPr>
+          <w:rStyle w:val="SourceText"/>
+          <w:rFonts w:ascii="Times New Roman" w:hAnsi="Times New Roman"/>
+          <w:color w:val="000000"/>
+        </w:rPr>
+        <w:t>blog_posts.json</w:t>
+      </w:r>
+      <w:r>
+        <w:rPr>
+          <w:rFonts w:ascii="Times New Roman" w:hAnsi="Times New Roman"/>
+          <w:color w:val="000000"/>
+        </w:rPr>
+        <w:t xml:space="preserve"> and replace the entire contents with an empty array:</w:t>
+      </w:r>
+    </w:p>
+    <w:p>
+      <w:pPr>
+        <w:pStyle w:val="BodyText"/>
+        <w:spacing w:lineRule="auto" w:line="240" w:before="0" w:after="0"/>
+        <w:ind w:hanging="0" w:start="0" w:end="0"/>
+        <w:rPr>
+          <w:rFonts w:ascii="Times New Roman" w:hAnsi="Times New Roman"/>
+          <w:color w:val="000000"/>
+        </w:rPr>
+      </w:pPr>
+      <w:r>
+        <w:rPr>
+          <w:rFonts w:ascii="Times New Roman" w:hAnsi="Times New Roman"/>
+          <w:color w:val="000000"/>
+        </w:rPr>
+        <w:t>bash</w:t>
+      </w:r>
+    </w:p>
+    <w:p>
+      <w:pPr>
+        <w:pStyle w:val="PreformattedText"/>
+        <w:spacing w:before="0" w:after="0"/>
+        <w:ind w:hanging="0" w:start="0" w:end="0"/>
+        <w:rPr>
+          <w:rFonts w:ascii="Times New Roman" w:hAnsi="Times New Roman" w:eastAsia="Arial" w:cs="Arial"/>
+          <w:color w:val="000000"/>
+          <w:sz w:val="24"/>
+          <w:szCs w:val="24"/>
+        </w:rPr>
+      </w:pPr>
+      <w:r>
+        <w:rPr>
+          <w:rStyle w:val="SourceText"/>
+          <w:rFonts w:ascii="var font-mono" w:hAnsi="var font-mono"/>
+          <w:color w:val="B34A00"/>
+          <w:sz w:val="24"/>
+          <w:szCs w:val="24"/>
+          <w:shd w:fill="auto" w:val="clear"/>
+        </w:rPr>
+        <w:t>echo</w:t>
+      </w:r>
+      <w:r>
+        <w:rPr>
+          <w:rStyle w:val="SourceText"/>
+          <w:rFonts w:ascii="var font-mono" w:hAnsi="var font-mono"/>
+          <w:color w:val="14181F"/>
+          <w:sz w:val="24"/>
+          <w:szCs w:val="24"/>
+          <w:shd w:fill="auto" w:val="clear"/>
+        </w:rPr>
+        <w:t xml:space="preserve"> </w:t>
+      </w:r>
+      <w:r>
+        <w:rPr>
+          <w:rStyle w:val="SourceText"/>
+          <w:rFonts w:ascii="var font-mono" w:hAnsi="var font-mono"/>
+          <w:color w:val="008000"/>
+          <w:sz w:val="24"/>
+          <w:szCs w:val="24"/>
+          <w:shd w:fill="auto" w:val="clear"/>
+        </w:rPr>
+        <w:t>'[]'</w:t>
+      </w:r>
+      <w:r>
+        <w:rPr>
+          <w:rStyle w:val="SourceText"/>
+          <w:rFonts w:ascii="var font-mono" w:hAnsi="var font-mono"/>
+          <w:color w:val="14181F"/>
+          <w:sz w:val="24"/>
+          <w:szCs w:val="24"/>
+          <w:shd w:fill="auto" w:val="clear"/>
+        </w:rPr>
+        <w:t xml:space="preserve"> &gt; /Users/ncm/Pictures/Mohangraphy/Scripts/blog_posts.json</w:t>
+      </w:r>
+    </w:p>
+    <w:p>
+      <w:pPr>
+        <w:pStyle w:val="BodyText"/>
+        <w:spacing w:lineRule="auto" w:line="240" w:before="0" w:after="0"/>
+        <w:rPr>
+          <w:rFonts w:ascii="Times New Roman" w:hAnsi="Times New Roman"/>
+          <w:color w:val="000000"/>
+        </w:rPr>
+      </w:pPr>
+      <w:r>
+        <w:rPr>
+          <w:rFonts w:ascii="Times New Roman" w:hAnsi="Times New Roman"/>
+          <w:color w:val="000000"/>
+        </w:rPr>
+        <w:t>Then redeploy:</w:t>
+      </w:r>
+    </w:p>
+    <w:p>
+      <w:pPr>
+        <w:pStyle w:val="BodyText"/>
+        <w:spacing w:lineRule="auto" w:line="240" w:before="0" w:after="0"/>
+        <w:ind w:hanging="0" w:start="0" w:end="0"/>
+        <w:rPr>
+          <w:rFonts w:ascii="Times New Roman" w:hAnsi="Times New Roman"/>
+          <w:color w:val="000000"/>
+        </w:rPr>
+      </w:pPr>
+      <w:r>
+        <w:rPr>
+          <w:rFonts w:ascii="Times New Roman" w:hAnsi="Times New Roman"/>
+          <w:color w:val="000000"/>
+        </w:rPr>
+        <w:t>bash</w:t>
+      </w:r>
+    </w:p>
+    <w:p>
+      <w:pPr>
+        <w:pStyle w:val="PreformattedText"/>
+        <w:spacing w:before="0" w:after="0"/>
+        <w:ind w:hanging="0" w:start="0" w:end="0"/>
+        <w:rPr>
+          <w:rFonts w:ascii="Times New Roman" w:hAnsi="Times New Roman" w:eastAsia="Arial" w:cs="Arial"/>
+          <w:color w:val="000000"/>
+          <w:sz w:val="24"/>
+          <w:szCs w:val="24"/>
+        </w:rPr>
+      </w:pPr>
+      <w:r>
+        <w:rPr>
+          <w:rStyle w:val="SourceText"/>
+          <w:rFonts w:ascii="var font-mono" w:hAnsi="var font-mono"/>
+          <w:color w:val="14181F"/>
+          <w:sz w:val="24"/>
+          <w:szCs w:val="24"/>
+          <w:shd w:fill="auto" w:val="clear"/>
+        </w:rPr>
+        <w:t>python3 /Users/ncm/Pictures/Mohangraphy/Scripts/Claude_mohangraphy.py</w:t>
+      </w:r>
+    </w:p>
+    <w:p>
+      <w:pPr>
+        <w:pStyle w:val="BodyText"/>
+        <w:spacing w:lineRule="auto" w:line="240" w:before="0" w:after="0"/>
+        <w:rPr>
+          <w:rFonts w:ascii="Times New Roman" w:hAnsi="Times New Roman"/>
+          <w:color w:val="000000"/>
+        </w:rPr>
+      </w:pPr>
+      <w:r>
+        <w:rPr>
+          <w:rFonts w:ascii="Times New Roman" w:hAnsi="Times New Roman"/>
+          <w:color w:val="000000"/>
+        </w:rPr>
+        <w:t xml:space="preserve">That's it — the Travel Stories page will show "No Stories Yet" until you add a new post via </w:t>
+      </w:r>
+      <w:r>
+        <w:rPr>
+          <w:rStyle w:val="SourceText"/>
+          <w:rFonts w:ascii="Times New Roman" w:hAnsi="Times New Roman"/>
+          <w:color w:val="000000"/>
+        </w:rPr>
+        <w:t>blog_editor.py</w:t>
+      </w:r>
+      <w:r>
+        <w:rPr>
+          <w:rFonts w:ascii="Times New Roman" w:hAnsi="Times New Roman"/>
+          <w:color w:val="000000"/>
+        </w:rPr>
+        <w:t>.</w:t>
+      </w:r>
+    </w:p>
+    <w:p>
+      <w:pPr>
+        <w:pStyle w:val="Normal"/>
+        <w:spacing w:lineRule="auto" w:line="240" w:before="0" w:after="0"/>
+        <w:rPr>
+          <w:rFonts w:ascii="Times New Roman" w:hAnsi="Times New Roman"/>
+          <w:color w:val="000000"/>
+        </w:rPr>
+      </w:pPr>
+      <w:r>
+        <w:rPr>
+          <w:rFonts w:ascii="Times New Roman" w:hAnsi="Times New Roman"/>
+          <w:color w:val="000000"/>
+        </w:rPr>
+      </w:r>
+    </w:p>
     <w:sectPr>
-      <w:headerReference w:type="even" r:id="rId3"/>
-      <w:headerReference w:type="default" r:id="rId4"/>
-      <w:headerReference w:type="first" r:id="rId5"/>
-      <w:footerReference w:type="even" r:id="rId6"/>
-      <w:footerReference w:type="default" r:id="rId7"/>
-      <w:footerReference w:type="first" r:id="rId8"/>
+      <w:headerReference w:type="even" r:id="rId4"/>
+      <w:headerReference w:type="default" r:id="rId5"/>
+      <w:headerReference w:type="first" r:id="rId6"/>
+      <w:footerReference w:type="even" r:id="rId7"/>
+      <w:footerReference w:type="default" r:id="rId8"/>
+      <w:footerReference w:type="first" r:id="rId9"/>
       <w:type w:val="nextPage"/>
       <w:pgSz w:w="12240" w:h="15840"/>
       <w:pgMar w:left="1260" w:right="1260" w:gutter="0" w:header="708" w:top="1440" w:footer="708" w:bottom="1440"/>
@@ -11745,7 +13830,7 @@
         <w:sz w:val="20"/>
         <w:szCs w:val="20"/>
       </w:rPr>
-      <w:t>9</w:t>
+      <w:t>11</w:t>
     </w:r>
     <w:r>
       <w:rPr>
@@ -11873,7 +13958,7 @@
         <w:sz w:val="20"/>
         <w:szCs w:val="20"/>
       </w:rPr>
-      <w:t>9</w:t>
+      <w:t>11</w:t>
     </w:r>
     <w:r>
       <w:rPr>
@@ -12227,6 +14312,774 @@
   <w:abstractNum w:abstractNumId="3">
     <w:lvl w:ilvl="0">
       <w:start w:val="1"/>
+      <w:numFmt w:val="decimal"/>
+      <w:lvlText w:val="%1."/>
+      <w:lvlJc w:val="start"/>
+      <w:pPr>
+        <w:tabs>
+          <w:tab w:val="num" w:pos="709"/>
+        </w:tabs>
+        <w:ind w:start="709" w:hanging="283"/>
+      </w:pPr>
+      <w:rPr/>
+    </w:lvl>
+    <w:lvl w:ilvl="1">
+      <w:start w:val="1"/>
+      <w:numFmt w:val="decimal"/>
+      <w:lvlText w:val="%2."/>
+      <w:lvlJc w:val="start"/>
+      <w:pPr>
+        <w:tabs>
+          <w:tab w:val="num" w:pos="1418"/>
+        </w:tabs>
+        <w:ind w:start="1418" w:hanging="283"/>
+      </w:pPr>
+      <w:rPr/>
+    </w:lvl>
+    <w:lvl w:ilvl="2">
+      <w:start w:val="1"/>
+      <w:numFmt w:val="decimal"/>
+      <w:lvlText w:val="%3."/>
+      <w:lvlJc w:val="start"/>
+      <w:pPr>
+        <w:tabs>
+          <w:tab w:val="num" w:pos="2127"/>
+        </w:tabs>
+        <w:ind w:start="2127" w:hanging="283"/>
+      </w:pPr>
+      <w:rPr/>
+    </w:lvl>
+    <w:lvl w:ilvl="3">
+      <w:start w:val="1"/>
+      <w:numFmt w:val="decimal"/>
+      <w:lvlText w:val="%4."/>
+      <w:lvlJc w:val="start"/>
+      <w:pPr>
+        <w:tabs>
+          <w:tab w:val="num" w:pos="2836"/>
+        </w:tabs>
+        <w:ind w:start="2836" w:hanging="283"/>
+      </w:pPr>
+      <w:rPr/>
+    </w:lvl>
+    <w:lvl w:ilvl="4">
+      <w:start w:val="1"/>
+      <w:numFmt w:val="decimal"/>
+      <w:lvlText w:val="%5."/>
+      <w:lvlJc w:val="start"/>
+      <w:pPr>
+        <w:tabs>
+          <w:tab w:val="num" w:pos="3545"/>
+        </w:tabs>
+        <w:ind w:start="3545" w:hanging="283"/>
+      </w:pPr>
+      <w:rPr/>
+    </w:lvl>
+    <w:lvl w:ilvl="5">
+      <w:start w:val="1"/>
+      <w:numFmt w:val="decimal"/>
+      <w:lvlText w:val="%6."/>
+      <w:lvlJc w:val="start"/>
+      <w:pPr>
+        <w:tabs>
+          <w:tab w:val="num" w:pos="4254"/>
+        </w:tabs>
+        <w:ind w:start="4254" w:hanging="283"/>
+      </w:pPr>
+      <w:rPr/>
+    </w:lvl>
+    <w:lvl w:ilvl="6">
+      <w:start w:val="1"/>
+      <w:numFmt w:val="decimal"/>
+      <w:lvlText w:val="%7."/>
+      <w:lvlJc w:val="start"/>
+      <w:pPr>
+        <w:tabs>
+          <w:tab w:val="num" w:pos="4963"/>
+        </w:tabs>
+        <w:ind w:start="4963" w:hanging="283"/>
+      </w:pPr>
+      <w:rPr/>
+    </w:lvl>
+    <w:lvl w:ilvl="7">
+      <w:start w:val="1"/>
+      <w:numFmt w:val="decimal"/>
+      <w:lvlText w:val="%8."/>
+      <w:lvlJc w:val="start"/>
+      <w:pPr>
+        <w:tabs>
+          <w:tab w:val="num" w:pos="5672"/>
+        </w:tabs>
+        <w:ind w:start="5672" w:hanging="283"/>
+      </w:pPr>
+      <w:rPr/>
+    </w:lvl>
+    <w:lvl w:ilvl="8">
+      <w:start w:val="1"/>
+      <w:numFmt w:val="decimal"/>
+      <w:lvlText w:val="%9."/>
+      <w:lvlJc w:val="start"/>
+      <w:pPr>
+        <w:tabs>
+          <w:tab w:val="num" w:pos="6381"/>
+        </w:tabs>
+        <w:ind w:start="6381" w:hanging="283"/>
+      </w:pPr>
+      <w:rPr/>
+    </w:lvl>
+  </w:abstractNum>
+  <w:abstractNum w:abstractNumId="4">
+    <w:lvl w:ilvl="0">
+      <w:start w:val="1"/>
+      <w:numFmt w:val="decimal"/>
+      <w:lvlText w:val="%1."/>
+      <w:lvlJc w:val="start"/>
+      <w:pPr>
+        <w:tabs>
+          <w:tab w:val="num" w:pos="709"/>
+        </w:tabs>
+        <w:ind w:start="709" w:hanging="283"/>
+      </w:pPr>
+      <w:rPr/>
+    </w:lvl>
+    <w:lvl w:ilvl="1">
+      <w:start w:val="1"/>
+      <w:numFmt w:val="decimal"/>
+      <w:lvlText w:val="%2."/>
+      <w:lvlJc w:val="start"/>
+      <w:pPr>
+        <w:tabs>
+          <w:tab w:val="num" w:pos="1418"/>
+        </w:tabs>
+        <w:ind w:start="1418" w:hanging="283"/>
+      </w:pPr>
+      <w:rPr/>
+    </w:lvl>
+    <w:lvl w:ilvl="2">
+      <w:start w:val="1"/>
+      <w:numFmt w:val="decimal"/>
+      <w:lvlText w:val="%3."/>
+      <w:lvlJc w:val="start"/>
+      <w:pPr>
+        <w:tabs>
+          <w:tab w:val="num" w:pos="2127"/>
+        </w:tabs>
+        <w:ind w:start="2127" w:hanging="283"/>
+      </w:pPr>
+      <w:rPr/>
+    </w:lvl>
+    <w:lvl w:ilvl="3">
+      <w:start w:val="1"/>
+      <w:numFmt w:val="decimal"/>
+      <w:lvlText w:val="%4."/>
+      <w:lvlJc w:val="start"/>
+      <w:pPr>
+        <w:tabs>
+          <w:tab w:val="num" w:pos="2836"/>
+        </w:tabs>
+        <w:ind w:start="2836" w:hanging="283"/>
+      </w:pPr>
+      <w:rPr/>
+    </w:lvl>
+    <w:lvl w:ilvl="4">
+      <w:start w:val="1"/>
+      <w:numFmt w:val="decimal"/>
+      <w:lvlText w:val="%5."/>
+      <w:lvlJc w:val="start"/>
+      <w:pPr>
+        <w:tabs>
+          <w:tab w:val="num" w:pos="3545"/>
+        </w:tabs>
+        <w:ind w:start="3545" w:hanging="283"/>
+      </w:pPr>
+      <w:rPr/>
+    </w:lvl>
+    <w:lvl w:ilvl="5">
+      <w:start w:val="1"/>
+      <w:numFmt w:val="decimal"/>
+      <w:lvlText w:val="%6."/>
+      <w:lvlJc w:val="start"/>
+      <w:pPr>
+        <w:tabs>
+          <w:tab w:val="num" w:pos="4254"/>
+        </w:tabs>
+        <w:ind w:start="4254" w:hanging="283"/>
+      </w:pPr>
+      <w:rPr/>
+    </w:lvl>
+    <w:lvl w:ilvl="6">
+      <w:start w:val="1"/>
+      <w:numFmt w:val="decimal"/>
+      <w:lvlText w:val="%7."/>
+      <w:lvlJc w:val="start"/>
+      <w:pPr>
+        <w:tabs>
+          <w:tab w:val="num" w:pos="4963"/>
+        </w:tabs>
+        <w:ind w:start="4963" w:hanging="283"/>
+      </w:pPr>
+      <w:rPr/>
+    </w:lvl>
+    <w:lvl w:ilvl="7">
+      <w:start w:val="1"/>
+      <w:numFmt w:val="decimal"/>
+      <w:lvlText w:val="%8."/>
+      <w:lvlJc w:val="start"/>
+      <w:pPr>
+        <w:tabs>
+          <w:tab w:val="num" w:pos="5672"/>
+        </w:tabs>
+        <w:ind w:start="5672" w:hanging="283"/>
+      </w:pPr>
+      <w:rPr/>
+    </w:lvl>
+    <w:lvl w:ilvl="8">
+      <w:start w:val="1"/>
+      <w:numFmt w:val="decimal"/>
+      <w:lvlText w:val="%9."/>
+      <w:lvlJc w:val="start"/>
+      <w:pPr>
+        <w:tabs>
+          <w:tab w:val="num" w:pos="6381"/>
+        </w:tabs>
+        <w:ind w:start="6381" w:hanging="283"/>
+      </w:pPr>
+      <w:rPr/>
+    </w:lvl>
+  </w:abstractNum>
+  <w:abstractNum w:abstractNumId="5">
+    <w:lvl w:ilvl="0">
+      <w:start w:val="1"/>
+      <w:numFmt w:val="bullet"/>
+      <w:lvlText w:val=""/>
+      <w:lvlJc w:val="start"/>
+      <w:pPr>
+        <w:tabs>
+          <w:tab w:val="num" w:pos="709"/>
+        </w:tabs>
+        <w:ind w:start="709" w:hanging="283"/>
+      </w:pPr>
+      <w:rPr>
+        <w:rFonts w:ascii="Symbol" w:hAnsi="Symbol" w:cs="Symbol" w:hint="default"/>
+      </w:rPr>
+    </w:lvl>
+    <w:lvl w:ilvl="1">
+      <w:start w:val="1"/>
+      <w:numFmt w:val="bullet"/>
+      <w:lvlText w:val=""/>
+      <w:lvlJc w:val="start"/>
+      <w:pPr>
+        <w:tabs>
+          <w:tab w:val="num" w:pos="1418"/>
+        </w:tabs>
+        <w:ind w:start="1418" w:hanging="283"/>
+      </w:pPr>
+      <w:rPr>
+        <w:rFonts w:ascii="Symbol" w:hAnsi="Symbol" w:cs="Symbol" w:hint="default"/>
+      </w:rPr>
+    </w:lvl>
+    <w:lvl w:ilvl="2">
+      <w:start w:val="1"/>
+      <w:numFmt w:val="bullet"/>
+      <w:lvlText w:val=""/>
+      <w:lvlJc w:val="start"/>
+      <w:pPr>
+        <w:tabs>
+          <w:tab w:val="num" w:pos="2127"/>
+        </w:tabs>
+        <w:ind w:start="2127" w:hanging="283"/>
+      </w:pPr>
+      <w:rPr>
+        <w:rFonts w:ascii="Symbol" w:hAnsi="Symbol" w:cs="Symbol" w:hint="default"/>
+      </w:rPr>
+    </w:lvl>
+    <w:lvl w:ilvl="3">
+      <w:start w:val="1"/>
+      <w:numFmt w:val="bullet"/>
+      <w:lvlText w:val=""/>
+      <w:lvlJc w:val="start"/>
+      <w:pPr>
+        <w:tabs>
+          <w:tab w:val="num" w:pos="2836"/>
+        </w:tabs>
+        <w:ind w:start="2836" w:hanging="283"/>
+      </w:pPr>
+      <w:rPr>
+        <w:rFonts w:ascii="Symbol" w:hAnsi="Symbol" w:cs="Symbol" w:hint="default"/>
+      </w:rPr>
+    </w:lvl>
+    <w:lvl w:ilvl="4">
+      <w:start w:val="1"/>
+      <w:numFmt w:val="bullet"/>
+      <w:lvlText w:val=""/>
+      <w:lvlJc w:val="start"/>
+      <w:pPr>
+        <w:tabs>
+          <w:tab w:val="num" w:pos="3545"/>
+        </w:tabs>
+        <w:ind w:start="3545" w:hanging="283"/>
+      </w:pPr>
+      <w:rPr>
+        <w:rFonts w:ascii="Symbol" w:hAnsi="Symbol" w:cs="Symbol" w:hint="default"/>
+      </w:rPr>
+    </w:lvl>
+    <w:lvl w:ilvl="5">
+      <w:start w:val="1"/>
+      <w:numFmt w:val="bullet"/>
+      <w:lvlText w:val=""/>
+      <w:lvlJc w:val="start"/>
+      <w:pPr>
+        <w:tabs>
+          <w:tab w:val="num" w:pos="4254"/>
+        </w:tabs>
+        <w:ind w:start="4254" w:hanging="283"/>
+      </w:pPr>
+      <w:rPr>
+        <w:rFonts w:ascii="Symbol" w:hAnsi="Symbol" w:cs="Symbol" w:hint="default"/>
+      </w:rPr>
+    </w:lvl>
+    <w:lvl w:ilvl="6">
+      <w:start w:val="1"/>
+      <w:numFmt w:val="bullet"/>
+      <w:lvlText w:val=""/>
+      <w:lvlJc w:val="start"/>
+      <w:pPr>
+        <w:tabs>
+          <w:tab w:val="num" w:pos="4963"/>
+        </w:tabs>
+        <w:ind w:start="4963" w:hanging="283"/>
+      </w:pPr>
+      <w:rPr>
+        <w:rFonts w:ascii="Symbol" w:hAnsi="Symbol" w:cs="Symbol" w:hint="default"/>
+      </w:rPr>
+    </w:lvl>
+    <w:lvl w:ilvl="7">
+      <w:start w:val="1"/>
+      <w:numFmt w:val="bullet"/>
+      <w:lvlText w:val=""/>
+      <w:lvlJc w:val="start"/>
+      <w:pPr>
+        <w:tabs>
+          <w:tab w:val="num" w:pos="5672"/>
+        </w:tabs>
+        <w:ind w:start="5672" w:hanging="283"/>
+      </w:pPr>
+      <w:rPr>
+        <w:rFonts w:ascii="Symbol" w:hAnsi="Symbol" w:cs="Symbol" w:hint="default"/>
+      </w:rPr>
+    </w:lvl>
+    <w:lvl w:ilvl="8">
+      <w:start w:val="1"/>
+      <w:numFmt w:val="bullet"/>
+      <w:lvlText w:val=""/>
+      <w:lvlJc w:val="start"/>
+      <w:pPr>
+        <w:tabs>
+          <w:tab w:val="num" w:pos="6381"/>
+        </w:tabs>
+        <w:ind w:start="6381" w:hanging="283"/>
+      </w:pPr>
+      <w:rPr>
+        <w:rFonts w:ascii="Symbol" w:hAnsi="Symbol" w:cs="Symbol" w:hint="default"/>
+      </w:rPr>
+    </w:lvl>
+  </w:abstractNum>
+  <w:abstractNum w:abstractNumId="6">
+    <w:lvl w:ilvl="0">
+      <w:start w:val="1"/>
+      <w:numFmt w:val="bullet"/>
+      <w:lvlText w:val=""/>
+      <w:lvlJc w:val="start"/>
+      <w:pPr>
+        <w:tabs>
+          <w:tab w:val="num" w:pos="709"/>
+        </w:tabs>
+        <w:ind w:start="709" w:hanging="283"/>
+      </w:pPr>
+      <w:rPr>
+        <w:rFonts w:ascii="Symbol" w:hAnsi="Symbol" w:cs="Symbol" w:hint="default"/>
+      </w:rPr>
+    </w:lvl>
+    <w:lvl w:ilvl="1">
+      <w:start w:val="1"/>
+      <w:numFmt w:val="bullet"/>
+      <w:lvlText w:val=""/>
+      <w:lvlJc w:val="start"/>
+      <w:pPr>
+        <w:tabs>
+          <w:tab w:val="num" w:pos="1418"/>
+        </w:tabs>
+        <w:ind w:start="1418" w:hanging="283"/>
+      </w:pPr>
+      <w:rPr>
+        <w:rFonts w:ascii="Symbol" w:hAnsi="Symbol" w:cs="Symbol" w:hint="default"/>
+      </w:rPr>
+    </w:lvl>
+    <w:lvl w:ilvl="2">
+      <w:start w:val="1"/>
+      <w:numFmt w:val="bullet"/>
+      <w:lvlText w:val=""/>
+      <w:lvlJc w:val="start"/>
+      <w:pPr>
+        <w:tabs>
+          <w:tab w:val="num" w:pos="2127"/>
+        </w:tabs>
+        <w:ind w:start="2127" w:hanging="283"/>
+      </w:pPr>
+      <w:rPr>
+        <w:rFonts w:ascii="Symbol" w:hAnsi="Symbol" w:cs="Symbol" w:hint="default"/>
+      </w:rPr>
+    </w:lvl>
+    <w:lvl w:ilvl="3">
+      <w:start w:val="1"/>
+      <w:numFmt w:val="bullet"/>
+      <w:lvlText w:val=""/>
+      <w:lvlJc w:val="start"/>
+      <w:pPr>
+        <w:tabs>
+          <w:tab w:val="num" w:pos="2836"/>
+        </w:tabs>
+        <w:ind w:start="2836" w:hanging="283"/>
+      </w:pPr>
+      <w:rPr>
+        <w:rFonts w:ascii="Symbol" w:hAnsi="Symbol" w:cs="Symbol" w:hint="default"/>
+      </w:rPr>
+    </w:lvl>
+    <w:lvl w:ilvl="4">
+      <w:start w:val="1"/>
+      <w:numFmt w:val="bullet"/>
+      <w:lvlText w:val=""/>
+      <w:lvlJc w:val="start"/>
+      <w:pPr>
+        <w:tabs>
+          <w:tab w:val="num" w:pos="3545"/>
+        </w:tabs>
+        <w:ind w:start="3545" w:hanging="283"/>
+      </w:pPr>
+      <w:rPr>
+        <w:rFonts w:ascii="Symbol" w:hAnsi="Symbol" w:cs="Symbol" w:hint="default"/>
+      </w:rPr>
+    </w:lvl>
+    <w:lvl w:ilvl="5">
+      <w:start w:val="1"/>
+      <w:numFmt w:val="bullet"/>
+      <w:lvlText w:val=""/>
+      <w:lvlJc w:val="start"/>
+      <w:pPr>
+        <w:tabs>
+          <w:tab w:val="num" w:pos="4254"/>
+        </w:tabs>
+        <w:ind w:start="4254" w:hanging="283"/>
+      </w:pPr>
+      <w:rPr>
+        <w:rFonts w:ascii="Symbol" w:hAnsi="Symbol" w:cs="Symbol" w:hint="default"/>
+      </w:rPr>
+    </w:lvl>
+    <w:lvl w:ilvl="6">
+      <w:start w:val="1"/>
+      <w:numFmt w:val="bullet"/>
+      <w:lvlText w:val=""/>
+      <w:lvlJc w:val="start"/>
+      <w:pPr>
+        <w:tabs>
+          <w:tab w:val="num" w:pos="4963"/>
+        </w:tabs>
+        <w:ind w:start="4963" w:hanging="283"/>
+      </w:pPr>
+      <w:rPr>
+        <w:rFonts w:ascii="Symbol" w:hAnsi="Symbol" w:cs="Symbol" w:hint="default"/>
+      </w:rPr>
+    </w:lvl>
+    <w:lvl w:ilvl="7">
+      <w:start w:val="1"/>
+      <w:numFmt w:val="bullet"/>
+      <w:lvlText w:val=""/>
+      <w:lvlJc w:val="start"/>
+      <w:pPr>
+        <w:tabs>
+          <w:tab w:val="num" w:pos="5672"/>
+        </w:tabs>
+        <w:ind w:start="5672" w:hanging="283"/>
+      </w:pPr>
+      <w:rPr>
+        <w:rFonts w:ascii="Symbol" w:hAnsi="Symbol" w:cs="Symbol" w:hint="default"/>
+      </w:rPr>
+    </w:lvl>
+    <w:lvl w:ilvl="8">
+      <w:start w:val="1"/>
+      <w:numFmt w:val="bullet"/>
+      <w:lvlText w:val=""/>
+      <w:lvlJc w:val="start"/>
+      <w:pPr>
+        <w:tabs>
+          <w:tab w:val="num" w:pos="6381"/>
+        </w:tabs>
+        <w:ind w:start="6381" w:hanging="283"/>
+      </w:pPr>
+      <w:rPr>
+        <w:rFonts w:ascii="Symbol" w:hAnsi="Symbol" w:cs="Symbol" w:hint="default"/>
+      </w:rPr>
+    </w:lvl>
+  </w:abstractNum>
+  <w:abstractNum w:abstractNumId="7">
+    <w:lvl w:ilvl="0">
+      <w:start w:val="1"/>
+      <w:numFmt w:val="bullet"/>
+      <w:lvlText w:val=""/>
+      <w:lvlJc w:val="start"/>
+      <w:pPr>
+        <w:tabs>
+          <w:tab w:val="num" w:pos="709"/>
+        </w:tabs>
+        <w:ind w:start="709" w:hanging="283"/>
+      </w:pPr>
+      <w:rPr>
+        <w:rFonts w:ascii="Symbol" w:hAnsi="Symbol" w:cs="Symbol" w:hint="default"/>
+      </w:rPr>
+    </w:lvl>
+    <w:lvl w:ilvl="1">
+      <w:start w:val="1"/>
+      <w:numFmt w:val="bullet"/>
+      <w:lvlText w:val=""/>
+      <w:lvlJc w:val="start"/>
+      <w:pPr>
+        <w:tabs>
+          <w:tab w:val="num" w:pos="1418"/>
+        </w:tabs>
+        <w:ind w:start="1418" w:hanging="283"/>
+      </w:pPr>
+      <w:rPr>
+        <w:rFonts w:ascii="Symbol" w:hAnsi="Symbol" w:cs="Symbol" w:hint="default"/>
+      </w:rPr>
+    </w:lvl>
+    <w:lvl w:ilvl="2">
+      <w:start w:val="1"/>
+      <w:numFmt w:val="bullet"/>
+      <w:lvlText w:val=""/>
+      <w:lvlJc w:val="start"/>
+      <w:pPr>
+        <w:tabs>
+          <w:tab w:val="num" w:pos="2127"/>
+        </w:tabs>
+        <w:ind w:start="2127" w:hanging="283"/>
+      </w:pPr>
+      <w:rPr>
+        <w:rFonts w:ascii="Symbol" w:hAnsi="Symbol" w:cs="Symbol" w:hint="default"/>
+      </w:rPr>
+    </w:lvl>
+    <w:lvl w:ilvl="3">
+      <w:start w:val="1"/>
+      <w:numFmt w:val="bullet"/>
+      <w:lvlText w:val=""/>
+      <w:lvlJc w:val="start"/>
+      <w:pPr>
+        <w:tabs>
+          <w:tab w:val="num" w:pos="2836"/>
+        </w:tabs>
+        <w:ind w:start="2836" w:hanging="283"/>
+      </w:pPr>
+      <w:rPr>
+        <w:rFonts w:ascii="Symbol" w:hAnsi="Symbol" w:cs="Symbol" w:hint="default"/>
+      </w:rPr>
+    </w:lvl>
+    <w:lvl w:ilvl="4">
+      <w:start w:val="1"/>
+      <w:numFmt w:val="bullet"/>
+      <w:lvlText w:val=""/>
+      <w:lvlJc w:val="start"/>
+      <w:pPr>
+        <w:tabs>
+          <w:tab w:val="num" w:pos="3545"/>
+        </w:tabs>
+        <w:ind w:start="3545" w:hanging="283"/>
+      </w:pPr>
+      <w:rPr>
+        <w:rFonts w:ascii="Symbol" w:hAnsi="Symbol" w:cs="Symbol" w:hint="default"/>
+      </w:rPr>
+    </w:lvl>
+    <w:lvl w:ilvl="5">
+      <w:start w:val="1"/>
+      <w:numFmt w:val="bullet"/>
+      <w:lvlText w:val=""/>
+      <w:lvlJc w:val="start"/>
+      <w:pPr>
+        <w:tabs>
+          <w:tab w:val="num" w:pos="4254"/>
+        </w:tabs>
+        <w:ind w:start="4254" w:hanging="283"/>
+      </w:pPr>
+      <w:rPr>
+        <w:rFonts w:ascii="Symbol" w:hAnsi="Symbol" w:cs="Symbol" w:hint="default"/>
+      </w:rPr>
+    </w:lvl>
+    <w:lvl w:ilvl="6">
+      <w:start w:val="1"/>
+      <w:numFmt w:val="bullet"/>
+      <w:lvlText w:val=""/>
+      <w:lvlJc w:val="start"/>
+      <w:pPr>
+        <w:tabs>
+          <w:tab w:val="num" w:pos="4963"/>
+        </w:tabs>
+        <w:ind w:start="4963" w:hanging="283"/>
+      </w:pPr>
+      <w:rPr>
+        <w:rFonts w:ascii="Symbol" w:hAnsi="Symbol" w:cs="Symbol" w:hint="default"/>
+      </w:rPr>
+    </w:lvl>
+    <w:lvl w:ilvl="7">
+      <w:start w:val="1"/>
+      <w:numFmt w:val="bullet"/>
+      <w:lvlText w:val=""/>
+      <w:lvlJc w:val="start"/>
+      <w:pPr>
+        <w:tabs>
+          <w:tab w:val="num" w:pos="5672"/>
+        </w:tabs>
+        <w:ind w:start="5672" w:hanging="283"/>
+      </w:pPr>
+      <w:rPr>
+        <w:rFonts w:ascii="Symbol" w:hAnsi="Symbol" w:cs="Symbol" w:hint="default"/>
+      </w:rPr>
+    </w:lvl>
+    <w:lvl w:ilvl="8">
+      <w:start w:val="1"/>
+      <w:numFmt w:val="bullet"/>
+      <w:lvlText w:val=""/>
+      <w:lvlJc w:val="start"/>
+      <w:pPr>
+        <w:tabs>
+          <w:tab w:val="num" w:pos="6381"/>
+        </w:tabs>
+        <w:ind w:start="6381" w:hanging="283"/>
+      </w:pPr>
+      <w:rPr>
+        <w:rFonts w:ascii="Symbol" w:hAnsi="Symbol" w:cs="Symbol" w:hint="default"/>
+      </w:rPr>
+    </w:lvl>
+  </w:abstractNum>
+  <w:abstractNum w:abstractNumId="8">
+    <w:lvl w:ilvl="0">
+      <w:start w:val="1"/>
+      <w:numFmt w:val="decimal"/>
+      <w:lvlText w:val="%1."/>
+      <w:lvlJc w:val="start"/>
+      <w:pPr>
+        <w:tabs>
+          <w:tab w:val="num" w:pos="709"/>
+        </w:tabs>
+        <w:ind w:start="709" w:hanging="283"/>
+      </w:pPr>
+      <w:rPr/>
+    </w:lvl>
+    <w:lvl w:ilvl="1">
+      <w:start w:val="1"/>
+      <w:numFmt w:val="decimal"/>
+      <w:lvlText w:val="%2."/>
+      <w:lvlJc w:val="start"/>
+      <w:pPr>
+        <w:tabs>
+          <w:tab w:val="num" w:pos="1418"/>
+        </w:tabs>
+        <w:ind w:start="1418" w:hanging="283"/>
+      </w:pPr>
+      <w:rPr/>
+    </w:lvl>
+    <w:lvl w:ilvl="2">
+      <w:start w:val="1"/>
+      <w:numFmt w:val="decimal"/>
+      <w:lvlText w:val="%3."/>
+      <w:lvlJc w:val="start"/>
+      <w:pPr>
+        <w:tabs>
+          <w:tab w:val="num" w:pos="2127"/>
+        </w:tabs>
+        <w:ind w:start="2127" w:hanging="283"/>
+      </w:pPr>
+      <w:rPr/>
+    </w:lvl>
+    <w:lvl w:ilvl="3">
+      <w:start w:val="1"/>
+      <w:numFmt w:val="decimal"/>
+      <w:lvlText w:val="%4."/>
+      <w:lvlJc w:val="start"/>
+      <w:pPr>
+        <w:tabs>
+          <w:tab w:val="num" w:pos="2836"/>
+        </w:tabs>
+        <w:ind w:start="2836" w:hanging="283"/>
+      </w:pPr>
+      <w:rPr/>
+    </w:lvl>
+    <w:lvl w:ilvl="4">
+      <w:start w:val="1"/>
+      <w:numFmt w:val="decimal"/>
+      <w:lvlText w:val="%5."/>
+      <w:lvlJc w:val="start"/>
+      <w:pPr>
+        <w:tabs>
+          <w:tab w:val="num" w:pos="3545"/>
+        </w:tabs>
+        <w:ind w:start="3545" w:hanging="283"/>
+      </w:pPr>
+      <w:rPr/>
+    </w:lvl>
+    <w:lvl w:ilvl="5">
+      <w:start w:val="1"/>
+      <w:numFmt w:val="decimal"/>
+      <w:lvlText w:val="%6."/>
+      <w:lvlJc w:val="start"/>
+      <w:pPr>
+        <w:tabs>
+          <w:tab w:val="num" w:pos="4254"/>
+        </w:tabs>
+        <w:ind w:start="4254" w:hanging="283"/>
+      </w:pPr>
+      <w:rPr/>
+    </w:lvl>
+    <w:lvl w:ilvl="6">
+      <w:start w:val="1"/>
+      <w:numFmt w:val="decimal"/>
+      <w:lvlText w:val="%7."/>
+      <w:lvlJc w:val="start"/>
+      <w:pPr>
+        <w:tabs>
+          <w:tab w:val="num" w:pos="4963"/>
+        </w:tabs>
+        <w:ind w:start="4963" w:hanging="283"/>
+      </w:pPr>
+      <w:rPr/>
+    </w:lvl>
+    <w:lvl w:ilvl="7">
+      <w:start w:val="1"/>
+      <w:numFmt w:val="decimal"/>
+      <w:lvlText w:val="%8."/>
+      <w:lvlJc w:val="start"/>
+      <w:pPr>
+        <w:tabs>
+          <w:tab w:val="num" w:pos="5672"/>
+        </w:tabs>
+        <w:ind w:start="5672" w:hanging="283"/>
+      </w:pPr>
+      <w:rPr/>
+    </w:lvl>
+    <w:lvl w:ilvl="8">
+      <w:start w:val="1"/>
+      <w:numFmt w:val="decimal"/>
+      <w:lvlText w:val="%9."/>
+      <w:lvlJc w:val="start"/>
+      <w:pPr>
+        <w:tabs>
+          <w:tab w:val="num" w:pos="6381"/>
+        </w:tabs>
+        <w:ind w:start="6381" w:hanging="283"/>
+      </w:pPr>
+      <w:rPr/>
+    </w:lvl>
+  </w:abstractNum>
+  <w:abstractNum w:abstractNumId="9">
+    <w:lvl w:ilvl="0">
+      <w:start w:val="1"/>
       <w:numFmt w:val="none"/>
       <w:suff w:val="nothing"/>
       <w:lvlText w:val=""/>
@@ -12353,6 +15206,24 @@
     <w:abstractNumId w:val="3"/>
   </w:num>
   <w:num w:numId="4">
+    <w:abstractNumId w:val="4"/>
+  </w:num>
+  <w:num w:numId="5">
+    <w:abstractNumId w:val="5"/>
+  </w:num>
+  <w:num w:numId="6">
+    <w:abstractNumId w:val="6"/>
+  </w:num>
+  <w:num w:numId="7">
+    <w:abstractNumId w:val="7"/>
+  </w:num>
+  <w:num w:numId="8">
+    <w:abstractNumId w:val="8"/>
+  </w:num>
+  <w:num w:numId="9">
+    <w:abstractNumId w:val="9"/>
+  </w:num>
+  <w:num w:numId="10">
     <w:abstractNumId w:val="2"/>
     <w:lvlOverride w:ilvl="0">
       <w:startOverride w:val="1"/>
@@ -12514,6 +15385,33 @@
     <w:rPr>
       <w:sz w:val="20"/>
       <w:szCs w:val="20"/>
+    </w:rPr>
+  </w:style>
+  <w:style w:type="character" w:styleId="SourceText">
+    <w:name w:val="Source Text"/>
+    <w:qFormat/>
+    <w:rPr>
+      <w:rFonts w:ascii="Liberation Mono" w:hAnsi="Liberation Mono" w:eastAsia="Liberation Mono" w:cs="Liberation Mono"/>
+    </w:rPr>
+  </w:style>
+  <w:style w:type="character" w:styleId="Strong">
+    <w:name w:val="Strong"/>
+    <w:qFormat/>
+    <w:rPr>
+      <w:b/>
+      <w:bCs/>
+    </w:rPr>
+  </w:style>
+  <w:style w:type="character" w:styleId="NumberingSymbols">
+    <w:name w:val="Numbering Symbols"/>
+    <w:qFormat/>
+    <w:rPr/>
+  </w:style>
+  <w:style w:type="character" w:styleId="Bullets">
+    <w:name w:val="Bullets"/>
+    <w:qFormat/>
+    <w:rPr>
+      <w:rFonts w:ascii="OpenSymbol" w:hAnsi="OpenSymbol" w:eastAsia="OpenSymbol" w:cs="OpenSymbol"/>
     </w:rPr>
   </w:style>
   <w:style w:type="paragraph" w:styleId="Heading">
@@ -12658,6 +15556,36 @@
     <w:pPr/>
     <w:rPr/>
   </w:style>
+  <w:style w:type="paragraph" w:styleId="PreformattedText">
+    <w:name w:val="Preformatted Text"/>
+    <w:basedOn w:val="Normal"/>
+    <w:qFormat/>
+    <w:pPr>
+      <w:spacing w:before="0" w:after="0"/>
+    </w:pPr>
+    <w:rPr>
+      <w:rFonts w:ascii="Liberation Mono" w:hAnsi="Liberation Mono" w:eastAsia="Liberation Mono" w:cs="Liberation Mono"/>
+      <w:sz w:val="20"/>
+      <w:szCs w:val="20"/>
+    </w:rPr>
+  </w:style>
+  <w:style w:type="paragraph" w:styleId="HorizontalLine">
+    <w:name w:val="Horizontal Line"/>
+    <w:basedOn w:val="Normal"/>
+    <w:next w:val="BodyText"/>
+    <w:qFormat/>
+    <w:pPr>
+      <w:suppressLineNumbers/>
+      <w:pBdr>
+        <w:bottom w:val="double" w:sz="2" w:space="0" w:color="808080"/>
+      </w:pBdr>
+      <w:spacing w:before="0" w:after="283"/>
+    </w:pPr>
+    <w:rPr>
+      <w:sz w:val="12"/>
+      <w:szCs w:val="12"/>
+    </w:rPr>
+  </w:style>
 </w:styles>
 </file>
 

</xml_diff>

<commit_message>
Deploy 2026-04-04 12:39 — 6 file(s) updated
</commit_message>
<xml_diff>
--- a/Mohangraphy_Technical_Documentation.docx
+++ b/Mohangraphy_Technical_Documentation.docx
@@ -4593,7 +4593,7 @@
         <w:pStyle w:val="ListParagraph"/>
         <w:numPr>
           <w:ilvl w:val="0"/>
-          <w:numId w:val="10"/>
+          <w:numId w:val="13"/>
         </w:numPr>
         <w:spacing w:lineRule="auto" w:line="240" w:before="0" w:after="0"/>
         <w:rPr>
@@ -13682,6 +13682,2640 @@
           <w:rFonts w:ascii="Times New Roman" w:hAnsi="Times New Roman"/>
           <w:color w:val="000000"/>
         </w:rPr>
+      </w:r>
+    </w:p>
+    <w:p>
+      <w:pPr>
+        <w:pStyle w:val="Normal"/>
+        <w:spacing w:lineRule="auto" w:line="240" w:before="0" w:after="0"/>
+        <w:rPr>
+          <w:rFonts w:ascii="Times New Roman" w:hAnsi="Times New Roman"/>
+          <w:color w:val="000000"/>
+        </w:rPr>
+      </w:pPr>
+      <w:r>
+        <w:rPr>
+          <w:rFonts w:ascii="Times New Roman" w:hAnsi="Times New Roman"/>
+          <w:color w:val="000000"/>
+        </w:rPr>
+      </w:r>
+    </w:p>
+    <w:p>
+      <w:pPr>
+        <w:pStyle w:val="BodyText"/>
+        <w:spacing w:lineRule="auto" w:line="240" w:before="0" w:after="0"/>
+        <w:rPr>
+          <w:rFonts w:ascii="Times New Roman" w:hAnsi="Times New Roman"/>
+          <w:color w:val="000000"/>
+        </w:rPr>
+      </w:pPr>
+      <w:r>
+        <w:rPr>
+          <w:rFonts w:ascii="Times New Roman" w:hAnsi="Times New Roman"/>
+          <w:color w:val="000000"/>
+        </w:rPr>
+        <w:t xml:space="preserve">Yes, the write-up goes inside the square brackets </w:t>
+      </w:r>
+      <w:r>
+        <w:rPr>
+          <w:rStyle w:val="SourceText"/>
+          <w:rFonts w:ascii="Times New Roman" w:hAnsi="Times New Roman"/>
+          <w:color w:val="000000"/>
+        </w:rPr>
+        <w:t>[]</w:t>
+      </w:r>
+      <w:r>
+        <w:rPr>
+          <w:rFonts w:ascii="Times New Roman" w:hAnsi="Times New Roman"/>
+          <w:color w:val="000000"/>
+        </w:rPr>
+        <w:t xml:space="preserve">. Here's a complete sample you can copy, paste into </w:t>
+      </w:r>
+      <w:r>
+        <w:rPr>
+          <w:rStyle w:val="SourceText"/>
+          <w:rFonts w:ascii="Times New Roman" w:hAnsi="Times New Roman"/>
+          <w:color w:val="000000"/>
+        </w:rPr>
+        <w:t>blog_posts.json</w:t>
+      </w:r>
+      <w:r>
+        <w:rPr>
+          <w:rFonts w:ascii="Times New Roman" w:hAnsi="Times New Roman"/>
+          <w:color w:val="000000"/>
+        </w:rPr>
+        <w:t>, and edit with your own content:</w:t>
+      </w:r>
+    </w:p>
+    <w:p>
+      <w:pPr>
+        <w:pStyle w:val="BodyText"/>
+        <w:spacing w:lineRule="auto" w:line="240"/>
+        <w:ind w:hanging="0" w:start="0" w:end="0"/>
+        <w:rPr>
+          <w:rFonts w:ascii="Times New Roman" w:hAnsi="Times New Roman"/>
+          <w:color w:val="000000"/>
+        </w:rPr>
+      </w:pPr>
+      <w:r>
+        <w:rPr>
+          <w:rFonts w:ascii="Times New Roman" w:hAnsi="Times New Roman"/>
+          <w:color w:val="000000"/>
+        </w:rPr>
+        <w:t>json</w:t>
+      </w:r>
+    </w:p>
+    <w:p>
+      <w:pPr>
+        <w:pStyle w:val="PreformattedText"/>
+        <w:ind w:hanging="0" w:start="0" w:end="0"/>
+        <w:rPr>
+          <w:rFonts w:ascii="Times New Roman" w:hAnsi="Times New Roman" w:eastAsia="Arial" w:cs="Arial"/>
+          <w:color w:val="000000"/>
+          <w:sz w:val="24"/>
+          <w:szCs w:val="24"/>
+        </w:rPr>
+      </w:pPr>
+      <w:r>
+        <w:rPr>
+          <w:rStyle w:val="SourceText"/>
+          <w:rFonts w:ascii="var font-mono" w:hAnsi="var font-mono"/>
+          <w:color w:val="2B303B"/>
+          <w:sz w:val="24"/>
+          <w:szCs w:val="24"/>
+          <w:shd w:fill="auto" w:val="clear"/>
+        </w:rPr>
+        <w:t>[</w:t>
+      </w:r>
+    </w:p>
+    <w:p>
+      <w:pPr>
+        <w:pStyle w:val="PreformattedText"/>
+        <w:ind w:hanging="0" w:start="0" w:end="0"/>
+        <w:rPr>
+          <w:rFonts w:ascii="Times New Roman" w:hAnsi="Times New Roman" w:eastAsia="Arial" w:cs="Arial"/>
+          <w:color w:val="000000"/>
+          <w:sz w:val="24"/>
+          <w:szCs w:val="24"/>
+        </w:rPr>
+      </w:pPr>
+      <w:r>
+        <w:rPr>
+          <w:rStyle w:val="SourceText"/>
+          <w:rFonts w:ascii="Times New Roman" w:hAnsi="Times New Roman"/>
+          <w:color w:val="14181F"/>
+          <w:sz w:val="24"/>
+          <w:szCs w:val="24"/>
+          <w:shd w:fill="auto" w:val="clear"/>
+        </w:rPr>
+        <w:t xml:space="preserve">    </w:t>
+      </w:r>
+      <w:r>
+        <w:rPr>
+          <w:rStyle w:val="SourceText"/>
+          <w:rFonts w:ascii="var font-mono" w:hAnsi="var font-mono"/>
+          <w:color w:val="2B303B"/>
+          <w:sz w:val="24"/>
+          <w:szCs w:val="24"/>
+          <w:shd w:fill="auto" w:val="clear"/>
+        </w:rPr>
+        <w:t>{</w:t>
+      </w:r>
+    </w:p>
+    <w:p>
+      <w:pPr>
+        <w:pStyle w:val="PreformattedText"/>
+        <w:ind w:hanging="0" w:start="0" w:end="0"/>
+        <w:rPr>
+          <w:rFonts w:ascii="Times New Roman" w:hAnsi="Times New Roman" w:eastAsia="Arial" w:cs="Arial"/>
+          <w:color w:val="000000"/>
+          <w:sz w:val="24"/>
+          <w:szCs w:val="24"/>
+        </w:rPr>
+      </w:pPr>
+      <w:r>
+        <w:rPr>
+          <w:rStyle w:val="SourceText"/>
+          <w:rFonts w:ascii="Times New Roman" w:hAnsi="Times New Roman"/>
+          <w:color w:val="14181F"/>
+          <w:sz w:val="24"/>
+          <w:szCs w:val="24"/>
+          <w:shd w:fill="auto" w:val="clear"/>
+        </w:rPr>
+        <w:t xml:space="preserve">        </w:t>
+      </w:r>
+      <w:r>
+        <w:rPr>
+          <w:rStyle w:val="SourceText"/>
+          <w:rFonts w:ascii="var font-mono" w:hAnsi="var font-mono"/>
+          <w:color w:val="B80A18"/>
+          <w:sz w:val="24"/>
+          <w:szCs w:val="24"/>
+          <w:shd w:fill="auto" w:val="clear"/>
+        </w:rPr>
+        <w:t>"id"</w:t>
+      </w:r>
+      <w:r>
+        <w:rPr>
+          <w:rStyle w:val="SourceText"/>
+          <w:rFonts w:ascii="var font-mono" w:hAnsi="var font-mono"/>
+          <w:color w:val="14181F"/>
+          <w:sz w:val="24"/>
+          <w:szCs w:val="24"/>
+          <w:shd w:fill="auto" w:val="clear"/>
+        </w:rPr>
+        <w:t xml:space="preserve">: </w:t>
+      </w:r>
+      <w:r>
+        <w:rPr>
+          <w:rStyle w:val="SourceText"/>
+          <w:rFonts w:ascii="var font-mono" w:hAnsi="var font-mono"/>
+          <w:color w:val="008000"/>
+          <w:sz w:val="24"/>
+          <w:szCs w:val="24"/>
+          <w:shd w:fill="auto" w:val="clear"/>
+        </w:rPr>
+        <w:t>"madurai-2026"</w:t>
+      </w:r>
+      <w:r>
+        <w:rPr>
+          <w:rStyle w:val="SourceText"/>
+          <w:rFonts w:ascii="var font-mono" w:hAnsi="var font-mono"/>
+          <w:color w:val="2B303B"/>
+          <w:sz w:val="24"/>
+          <w:szCs w:val="24"/>
+          <w:shd w:fill="auto" w:val="clear"/>
+        </w:rPr>
+        <w:t>,</w:t>
+      </w:r>
+    </w:p>
+    <w:p>
+      <w:pPr>
+        <w:pStyle w:val="PreformattedText"/>
+        <w:ind w:hanging="0" w:start="0" w:end="0"/>
+        <w:rPr>
+          <w:rFonts w:ascii="Times New Roman" w:hAnsi="Times New Roman" w:eastAsia="Arial" w:cs="Arial"/>
+          <w:color w:val="000000"/>
+          <w:sz w:val="24"/>
+          <w:szCs w:val="24"/>
+        </w:rPr>
+      </w:pPr>
+      <w:r>
+        <w:rPr>
+          <w:rStyle w:val="SourceText"/>
+          <w:rFonts w:ascii="Times New Roman" w:hAnsi="Times New Roman"/>
+          <w:color w:val="14181F"/>
+          <w:sz w:val="24"/>
+          <w:szCs w:val="24"/>
+          <w:shd w:fill="auto" w:val="clear"/>
+        </w:rPr>
+        <w:t xml:space="preserve">        </w:t>
+      </w:r>
+      <w:r>
+        <w:rPr>
+          <w:rStyle w:val="SourceText"/>
+          <w:rFonts w:ascii="var font-mono" w:hAnsi="var font-mono"/>
+          <w:color w:val="B80A18"/>
+          <w:sz w:val="24"/>
+          <w:szCs w:val="24"/>
+          <w:shd w:fill="auto" w:val="clear"/>
+        </w:rPr>
+        <w:t>"title"</w:t>
+      </w:r>
+      <w:r>
+        <w:rPr>
+          <w:rStyle w:val="SourceText"/>
+          <w:rFonts w:ascii="var font-mono" w:hAnsi="var font-mono"/>
+          <w:color w:val="14181F"/>
+          <w:sz w:val="24"/>
+          <w:szCs w:val="24"/>
+          <w:shd w:fill="auto" w:val="clear"/>
+        </w:rPr>
+        <w:t xml:space="preserve">: </w:t>
+      </w:r>
+      <w:r>
+        <w:rPr>
+          <w:rStyle w:val="SourceText"/>
+          <w:rFonts w:ascii="var font-mono" w:hAnsi="var font-mono"/>
+          <w:color w:val="008000"/>
+          <w:sz w:val="24"/>
+          <w:szCs w:val="24"/>
+          <w:shd w:fill="auto" w:val="clear"/>
+        </w:rPr>
+        <w:t>"Madurai - A 2500 Year Old City"</w:t>
+      </w:r>
+      <w:r>
+        <w:rPr>
+          <w:rStyle w:val="SourceText"/>
+          <w:rFonts w:ascii="var font-mono" w:hAnsi="var font-mono"/>
+          <w:color w:val="2B303B"/>
+          <w:sz w:val="24"/>
+          <w:szCs w:val="24"/>
+          <w:shd w:fill="auto" w:val="clear"/>
+        </w:rPr>
+        <w:t>,</w:t>
+      </w:r>
+    </w:p>
+    <w:p>
+      <w:pPr>
+        <w:pStyle w:val="PreformattedText"/>
+        <w:ind w:hanging="0" w:start="0" w:end="0"/>
+        <w:rPr>
+          <w:rFonts w:ascii="Times New Roman" w:hAnsi="Times New Roman" w:eastAsia="Arial" w:cs="Arial"/>
+          <w:color w:val="000000"/>
+          <w:sz w:val="24"/>
+          <w:szCs w:val="24"/>
+        </w:rPr>
+      </w:pPr>
+      <w:r>
+        <w:rPr>
+          <w:rStyle w:val="SourceText"/>
+          <w:rFonts w:ascii="Times New Roman" w:hAnsi="Times New Roman"/>
+          <w:color w:val="14181F"/>
+          <w:sz w:val="24"/>
+          <w:szCs w:val="24"/>
+          <w:shd w:fill="auto" w:val="clear"/>
+        </w:rPr>
+        <w:t xml:space="preserve">        </w:t>
+      </w:r>
+      <w:r>
+        <w:rPr>
+          <w:rStyle w:val="SourceText"/>
+          <w:rFonts w:ascii="var font-mono" w:hAnsi="var font-mono"/>
+          <w:color w:val="B80A18"/>
+          <w:sz w:val="24"/>
+          <w:szCs w:val="24"/>
+          <w:shd w:fill="auto" w:val="clear"/>
+        </w:rPr>
+        <w:t>"place"</w:t>
+      </w:r>
+      <w:r>
+        <w:rPr>
+          <w:rStyle w:val="SourceText"/>
+          <w:rFonts w:ascii="var font-mono" w:hAnsi="var font-mono"/>
+          <w:color w:val="14181F"/>
+          <w:sz w:val="24"/>
+          <w:szCs w:val="24"/>
+          <w:shd w:fill="auto" w:val="clear"/>
+        </w:rPr>
+        <w:t xml:space="preserve">: </w:t>
+      </w:r>
+      <w:r>
+        <w:rPr>
+          <w:rStyle w:val="SourceText"/>
+          <w:rFonts w:ascii="var font-mono" w:hAnsi="var font-mono"/>
+          <w:color w:val="008000"/>
+          <w:sz w:val="24"/>
+          <w:szCs w:val="24"/>
+          <w:shd w:fill="auto" w:val="clear"/>
+        </w:rPr>
+        <w:t>"Madurai"</w:t>
+      </w:r>
+      <w:r>
+        <w:rPr>
+          <w:rStyle w:val="SourceText"/>
+          <w:rFonts w:ascii="var font-mono" w:hAnsi="var font-mono"/>
+          <w:color w:val="2B303B"/>
+          <w:sz w:val="24"/>
+          <w:szCs w:val="24"/>
+          <w:shd w:fill="auto" w:val="clear"/>
+        </w:rPr>
+        <w:t>,</w:t>
+      </w:r>
+    </w:p>
+    <w:p>
+      <w:pPr>
+        <w:pStyle w:val="PreformattedText"/>
+        <w:ind w:hanging="0" w:start="0" w:end="0"/>
+        <w:rPr>
+          <w:rFonts w:ascii="Times New Roman" w:hAnsi="Times New Roman" w:eastAsia="Arial" w:cs="Arial"/>
+          <w:color w:val="000000"/>
+          <w:sz w:val="24"/>
+          <w:szCs w:val="24"/>
+        </w:rPr>
+      </w:pPr>
+      <w:r>
+        <w:rPr>
+          <w:rStyle w:val="SourceText"/>
+          <w:rFonts w:ascii="Times New Roman" w:hAnsi="Times New Roman"/>
+          <w:color w:val="14181F"/>
+          <w:sz w:val="24"/>
+          <w:szCs w:val="24"/>
+          <w:shd w:fill="auto" w:val="clear"/>
+        </w:rPr>
+        <w:t xml:space="preserve">        </w:t>
+      </w:r>
+      <w:r>
+        <w:rPr>
+          <w:rStyle w:val="SourceText"/>
+          <w:rFonts w:ascii="var font-mono" w:hAnsi="var font-mono"/>
+          <w:color w:val="B80A18"/>
+          <w:sz w:val="24"/>
+          <w:szCs w:val="24"/>
+          <w:shd w:fill="auto" w:val="clear"/>
+        </w:rPr>
+        <w:t>"country"</w:t>
+      </w:r>
+      <w:r>
+        <w:rPr>
+          <w:rStyle w:val="SourceText"/>
+          <w:rFonts w:ascii="var font-mono" w:hAnsi="var font-mono"/>
+          <w:color w:val="14181F"/>
+          <w:sz w:val="24"/>
+          <w:szCs w:val="24"/>
+          <w:shd w:fill="auto" w:val="clear"/>
+        </w:rPr>
+        <w:t xml:space="preserve">: </w:t>
+      </w:r>
+      <w:r>
+        <w:rPr>
+          <w:rStyle w:val="SourceText"/>
+          <w:rFonts w:ascii="var font-mono" w:hAnsi="var font-mono"/>
+          <w:color w:val="008000"/>
+          <w:sz w:val="24"/>
+          <w:szCs w:val="24"/>
+          <w:shd w:fill="auto" w:val="clear"/>
+        </w:rPr>
+        <w:t>""</w:t>
+      </w:r>
+      <w:r>
+        <w:rPr>
+          <w:rStyle w:val="SourceText"/>
+          <w:rFonts w:ascii="var font-mono" w:hAnsi="var font-mono"/>
+          <w:color w:val="2B303B"/>
+          <w:sz w:val="24"/>
+          <w:szCs w:val="24"/>
+          <w:shd w:fill="auto" w:val="clear"/>
+        </w:rPr>
+        <w:t>,</w:t>
+      </w:r>
+    </w:p>
+    <w:p>
+      <w:pPr>
+        <w:pStyle w:val="PreformattedText"/>
+        <w:ind w:hanging="0" w:start="0" w:end="0"/>
+        <w:rPr>
+          <w:rFonts w:ascii="Times New Roman" w:hAnsi="Times New Roman" w:eastAsia="Arial" w:cs="Arial"/>
+          <w:color w:val="000000"/>
+          <w:sz w:val="24"/>
+          <w:szCs w:val="24"/>
+        </w:rPr>
+      </w:pPr>
+      <w:r>
+        <w:rPr>
+          <w:rStyle w:val="SourceText"/>
+          <w:rFonts w:ascii="Times New Roman" w:hAnsi="Times New Roman"/>
+          <w:color w:val="14181F"/>
+          <w:sz w:val="24"/>
+          <w:szCs w:val="24"/>
+          <w:shd w:fill="auto" w:val="clear"/>
+        </w:rPr>
+        <w:t xml:space="preserve">        </w:t>
+      </w:r>
+      <w:r>
+        <w:rPr>
+          <w:rStyle w:val="SourceText"/>
+          <w:rFonts w:ascii="var font-mono" w:hAnsi="var font-mono"/>
+          <w:color w:val="B80A18"/>
+          <w:sz w:val="24"/>
+          <w:szCs w:val="24"/>
+          <w:shd w:fill="auto" w:val="clear"/>
+        </w:rPr>
+        <w:t>"dates_visited"</w:t>
+      </w:r>
+      <w:r>
+        <w:rPr>
+          <w:rStyle w:val="SourceText"/>
+          <w:rFonts w:ascii="var font-mono" w:hAnsi="var font-mono"/>
+          <w:color w:val="14181F"/>
+          <w:sz w:val="24"/>
+          <w:szCs w:val="24"/>
+          <w:shd w:fill="auto" w:val="clear"/>
+        </w:rPr>
+        <w:t xml:space="preserve">: </w:t>
+      </w:r>
+      <w:r>
+        <w:rPr>
+          <w:rStyle w:val="SourceText"/>
+          <w:rFonts w:ascii="var font-mono" w:hAnsi="var font-mono"/>
+          <w:color w:val="008000"/>
+          <w:sz w:val="24"/>
+          <w:szCs w:val="24"/>
+          <w:shd w:fill="auto" w:val="clear"/>
+        </w:rPr>
+        <w:t>"March 2026"</w:t>
+      </w:r>
+      <w:r>
+        <w:rPr>
+          <w:rStyle w:val="SourceText"/>
+          <w:rFonts w:ascii="var font-mono" w:hAnsi="var font-mono"/>
+          <w:color w:val="2B303B"/>
+          <w:sz w:val="24"/>
+          <w:szCs w:val="24"/>
+          <w:shd w:fill="auto" w:val="clear"/>
+        </w:rPr>
+        <w:t>,</w:t>
+      </w:r>
+    </w:p>
+    <w:p>
+      <w:pPr>
+        <w:pStyle w:val="PreformattedText"/>
+        <w:ind w:hanging="0" w:start="0" w:end="0"/>
+        <w:rPr>
+          <w:rFonts w:ascii="Times New Roman" w:hAnsi="Times New Roman" w:eastAsia="Arial" w:cs="Arial"/>
+          <w:color w:val="000000"/>
+          <w:sz w:val="24"/>
+          <w:szCs w:val="24"/>
+        </w:rPr>
+      </w:pPr>
+      <w:r>
+        <w:rPr>
+          <w:rStyle w:val="SourceText"/>
+          <w:rFonts w:ascii="Times New Roman" w:hAnsi="Times New Roman"/>
+          <w:color w:val="14181F"/>
+          <w:sz w:val="24"/>
+          <w:szCs w:val="24"/>
+          <w:shd w:fill="auto" w:val="clear"/>
+        </w:rPr>
+        <w:t xml:space="preserve">        </w:t>
+      </w:r>
+      <w:r>
+        <w:rPr>
+          <w:rStyle w:val="SourceText"/>
+          <w:rFonts w:ascii="var font-mono" w:hAnsi="var font-mono"/>
+          <w:color w:val="B80A18"/>
+          <w:sz w:val="24"/>
+          <w:szCs w:val="24"/>
+          <w:shd w:fill="auto" w:val="clear"/>
+        </w:rPr>
+        <w:t>"place_tag"</w:t>
+      </w:r>
+      <w:r>
+        <w:rPr>
+          <w:rStyle w:val="SourceText"/>
+          <w:rFonts w:ascii="var font-mono" w:hAnsi="var font-mono"/>
+          <w:color w:val="14181F"/>
+          <w:sz w:val="24"/>
+          <w:szCs w:val="24"/>
+          <w:shd w:fill="auto" w:val="clear"/>
+        </w:rPr>
+        <w:t xml:space="preserve">: </w:t>
+      </w:r>
+      <w:r>
+        <w:rPr>
+          <w:rStyle w:val="SourceText"/>
+          <w:rFonts w:ascii="var font-mono" w:hAnsi="var font-mono"/>
+          <w:color w:val="008000"/>
+          <w:sz w:val="24"/>
+          <w:szCs w:val="24"/>
+          <w:shd w:fill="auto" w:val="clear"/>
+        </w:rPr>
+        <w:t>"Madurai"</w:t>
+      </w:r>
+      <w:r>
+        <w:rPr>
+          <w:rStyle w:val="SourceText"/>
+          <w:rFonts w:ascii="var font-mono" w:hAnsi="var font-mono"/>
+          <w:color w:val="2B303B"/>
+          <w:sz w:val="24"/>
+          <w:szCs w:val="24"/>
+          <w:shd w:fill="auto" w:val="clear"/>
+        </w:rPr>
+        <w:t>,</w:t>
+      </w:r>
+    </w:p>
+    <w:p>
+      <w:pPr>
+        <w:pStyle w:val="PreformattedText"/>
+        <w:ind w:hanging="0" w:start="0" w:end="0"/>
+        <w:rPr>
+          <w:rFonts w:ascii="Times New Roman" w:hAnsi="Times New Roman" w:eastAsia="Arial" w:cs="Arial"/>
+          <w:color w:val="000000"/>
+          <w:sz w:val="24"/>
+          <w:szCs w:val="24"/>
+        </w:rPr>
+      </w:pPr>
+      <w:r>
+        <w:rPr>
+          <w:rStyle w:val="SourceText"/>
+          <w:rFonts w:ascii="Times New Roman" w:hAnsi="Times New Roman"/>
+          <w:color w:val="14181F"/>
+          <w:sz w:val="24"/>
+          <w:szCs w:val="24"/>
+          <w:shd w:fill="auto" w:val="clear"/>
+        </w:rPr>
+        <w:t xml:space="preserve">        </w:t>
+      </w:r>
+      <w:r>
+        <w:rPr>
+          <w:rStyle w:val="SourceText"/>
+          <w:rFonts w:ascii="var font-mono" w:hAnsi="var font-mono"/>
+          <w:color w:val="B80A18"/>
+          <w:sz w:val="24"/>
+          <w:szCs w:val="24"/>
+          <w:shd w:fill="auto" w:val="clear"/>
+        </w:rPr>
+        <w:t>"summary"</w:t>
+      </w:r>
+      <w:r>
+        <w:rPr>
+          <w:rStyle w:val="SourceText"/>
+          <w:rFonts w:ascii="var font-mono" w:hAnsi="var font-mono"/>
+          <w:color w:val="14181F"/>
+          <w:sz w:val="24"/>
+          <w:szCs w:val="24"/>
+          <w:shd w:fill="auto" w:val="clear"/>
+        </w:rPr>
+        <w:t xml:space="preserve">: </w:t>
+      </w:r>
+      <w:r>
+        <w:rPr>
+          <w:rStyle w:val="SourceText"/>
+          <w:rFonts w:ascii="var font-mono" w:hAnsi="var font-mono"/>
+          <w:color w:val="008000"/>
+          <w:sz w:val="24"/>
+          <w:szCs w:val="24"/>
+          <w:shd w:fill="auto" w:val="clear"/>
+        </w:rPr>
+        <w:t>"Located on the banks of the Vaigai river, this city is steeped in Tamil history, literature, and tradition."</w:t>
+      </w:r>
+      <w:r>
+        <w:rPr>
+          <w:rStyle w:val="SourceText"/>
+          <w:rFonts w:ascii="var font-mono" w:hAnsi="var font-mono"/>
+          <w:color w:val="2B303B"/>
+          <w:sz w:val="24"/>
+          <w:szCs w:val="24"/>
+          <w:shd w:fill="auto" w:val="clear"/>
+        </w:rPr>
+        <w:t>,</w:t>
+      </w:r>
+    </w:p>
+    <w:p>
+      <w:pPr>
+        <w:pStyle w:val="PreformattedText"/>
+        <w:ind w:hanging="0" w:start="0" w:end="0"/>
+        <w:rPr>
+          <w:rFonts w:ascii="Times New Roman" w:hAnsi="Times New Roman" w:eastAsia="Arial" w:cs="Arial"/>
+          <w:color w:val="000000"/>
+          <w:sz w:val="24"/>
+          <w:szCs w:val="24"/>
+        </w:rPr>
+      </w:pPr>
+      <w:r>
+        <w:rPr>
+          <w:rStyle w:val="SourceText"/>
+          <w:rFonts w:ascii="Times New Roman" w:hAnsi="Times New Roman"/>
+          <w:color w:val="14181F"/>
+          <w:sz w:val="24"/>
+          <w:szCs w:val="24"/>
+          <w:shd w:fill="auto" w:val="clear"/>
+        </w:rPr>
+        <w:t xml:space="preserve">        </w:t>
+      </w:r>
+      <w:r>
+        <w:rPr>
+          <w:rStyle w:val="SourceText"/>
+          <w:rFonts w:ascii="var font-mono" w:hAnsi="var font-mono"/>
+          <w:color w:val="B80A18"/>
+          <w:sz w:val="24"/>
+          <w:szCs w:val="24"/>
+          <w:shd w:fill="auto" w:val="clear"/>
+        </w:rPr>
+        <w:t>"collections_links"</w:t>
+      </w:r>
+      <w:r>
+        <w:rPr>
+          <w:rStyle w:val="SourceText"/>
+          <w:rFonts w:ascii="var font-mono" w:hAnsi="var font-mono"/>
+          <w:color w:val="14181F"/>
+          <w:sz w:val="24"/>
+          <w:szCs w:val="24"/>
+          <w:shd w:fill="auto" w:val="clear"/>
+        </w:rPr>
+        <w:t xml:space="preserve">: </w:t>
+      </w:r>
+      <w:r>
+        <w:rPr>
+          <w:rStyle w:val="SourceText"/>
+          <w:rFonts w:ascii="var font-mono" w:hAnsi="var font-mono"/>
+          <w:color w:val="2B303B"/>
+          <w:sz w:val="24"/>
+          <w:szCs w:val="24"/>
+          <w:shd w:fill="auto" w:val="clear"/>
+        </w:rPr>
+        <w:t>[</w:t>
+      </w:r>
+      <w:r>
+        <w:rPr>
+          <w:rStyle w:val="SourceText"/>
+          <w:rFonts w:ascii="var font-mono" w:hAnsi="var font-mono"/>
+          <w:color w:val="008000"/>
+          <w:sz w:val="24"/>
+          <w:szCs w:val="24"/>
+          <w:shd w:fill="auto" w:val="clear"/>
+        </w:rPr>
+        <w:t>"Places"</w:t>
+      </w:r>
+      <w:r>
+        <w:rPr>
+          <w:rStyle w:val="SourceText"/>
+          <w:rFonts w:ascii="var font-mono" w:hAnsi="var font-mono"/>
+          <w:color w:val="2B303B"/>
+          <w:sz w:val="24"/>
+          <w:szCs w:val="24"/>
+          <w:shd w:fill="auto" w:val="clear"/>
+        </w:rPr>
+        <w:t>,</w:t>
+      </w:r>
+      <w:r>
+        <w:rPr>
+          <w:rStyle w:val="SourceText"/>
+          <w:rFonts w:ascii="var font-mono" w:hAnsi="var font-mono"/>
+          <w:color w:val="14181F"/>
+          <w:sz w:val="24"/>
+          <w:szCs w:val="24"/>
+          <w:shd w:fill="auto" w:val="clear"/>
+        </w:rPr>
+        <w:t xml:space="preserve"> </w:t>
+      </w:r>
+      <w:r>
+        <w:rPr>
+          <w:rStyle w:val="SourceText"/>
+          <w:rFonts w:ascii="var font-mono" w:hAnsi="var font-mono"/>
+          <w:color w:val="008000"/>
+          <w:sz w:val="24"/>
+          <w:szCs w:val="24"/>
+          <w:shd w:fill="auto" w:val="clear"/>
+        </w:rPr>
+        <w:t>"Architecture"</w:t>
+      </w:r>
+      <w:r>
+        <w:rPr>
+          <w:rStyle w:val="SourceText"/>
+          <w:rFonts w:ascii="var font-mono" w:hAnsi="var font-mono"/>
+          <w:color w:val="2B303B"/>
+          <w:sz w:val="24"/>
+          <w:szCs w:val="24"/>
+          <w:shd w:fill="auto" w:val="clear"/>
+        </w:rPr>
+        <w:t>],</w:t>
+      </w:r>
+    </w:p>
+    <w:p>
+      <w:pPr>
+        <w:pStyle w:val="PreformattedText"/>
+        <w:ind w:hanging="0" w:start="0" w:end="0"/>
+        <w:rPr>
+          <w:rFonts w:ascii="Times New Roman" w:hAnsi="Times New Roman" w:eastAsia="Arial" w:cs="Arial"/>
+          <w:color w:val="000000"/>
+          <w:sz w:val="24"/>
+          <w:szCs w:val="24"/>
+        </w:rPr>
+      </w:pPr>
+      <w:r>
+        <w:rPr>
+          <w:rStyle w:val="SourceText"/>
+          <w:rFonts w:ascii="Times New Roman" w:hAnsi="Times New Roman"/>
+          <w:color w:val="14181F"/>
+          <w:sz w:val="24"/>
+          <w:szCs w:val="24"/>
+          <w:shd w:fill="auto" w:val="clear"/>
+        </w:rPr>
+        <w:t xml:space="preserve">        </w:t>
+      </w:r>
+      <w:r>
+        <w:rPr>
+          <w:rStyle w:val="SourceText"/>
+          <w:rFonts w:ascii="var font-mono" w:hAnsi="var font-mono"/>
+          <w:color w:val="B80A18"/>
+          <w:sz w:val="24"/>
+          <w:szCs w:val="24"/>
+          <w:shd w:fill="auto" w:val="clear"/>
+        </w:rPr>
+        <w:t>"body"</w:t>
+      </w:r>
+      <w:r>
+        <w:rPr>
+          <w:rStyle w:val="SourceText"/>
+          <w:rFonts w:ascii="var font-mono" w:hAnsi="var font-mono"/>
+          <w:color w:val="14181F"/>
+          <w:sz w:val="24"/>
+          <w:szCs w:val="24"/>
+          <w:shd w:fill="auto" w:val="clear"/>
+        </w:rPr>
+        <w:t xml:space="preserve">: </w:t>
+      </w:r>
+      <w:r>
+        <w:rPr>
+          <w:rStyle w:val="SourceText"/>
+          <w:rFonts w:ascii="var font-mono" w:hAnsi="var font-mono"/>
+          <w:color w:val="008000"/>
+          <w:sz w:val="24"/>
+          <w:szCs w:val="24"/>
+          <w:shd w:fill="auto" w:val="clear"/>
+        </w:rPr>
+        <w:t>"Madurai is one of the oldest continuously inhabited cities in the world. Situated on the banks of the Vaigai river in Tamil Nadu, it has been a centre of Tamil culture, literature, and trade for over 2500 years.\n\nThe city revolves around the magnificent Meenakshi Sundareswarar Temple, a sprawling complex of towering gopurams covered in thousands of sculpted figures. Whether you visit at dawn or dusk, the temple never fails to overwhelm the senses.\n\nBeyond the temple, the city has a quiet, unhurried charm. The streets around the temple are lined with flower sellers, silk merchants, and small eateries serving authentic Chettinad and Madurai cuisine.\n\nIf you have time, the Thirumalai Nayakkar Mahal is worth a visit — a 17th century palace that hints at the grandeur of the Nayak dynasty. The Indo-Saracenic architecture is unlike anything else in Tamil Nadu.\n\nMadurai is best visited between October and February when the weather is cooler. Avoid the summer months from March onwards as temperatures can be punishing."</w:t>
+      </w:r>
+    </w:p>
+    <w:p>
+      <w:pPr>
+        <w:pStyle w:val="PreformattedText"/>
+        <w:ind w:hanging="0" w:start="0" w:end="0"/>
+        <w:rPr>
+          <w:rFonts w:ascii="Times New Roman" w:hAnsi="Times New Roman" w:eastAsia="Arial" w:cs="Arial"/>
+          <w:color w:val="000000"/>
+          <w:sz w:val="24"/>
+          <w:szCs w:val="24"/>
+        </w:rPr>
+      </w:pPr>
+      <w:r>
+        <w:rPr>
+          <w:rStyle w:val="SourceText"/>
+          <w:rFonts w:ascii="Times New Roman" w:hAnsi="Times New Roman"/>
+          <w:color w:val="14181F"/>
+          <w:sz w:val="24"/>
+          <w:szCs w:val="24"/>
+          <w:shd w:fill="auto" w:val="clear"/>
+        </w:rPr>
+        <w:t xml:space="preserve">    </w:t>
+      </w:r>
+      <w:r>
+        <w:rPr>
+          <w:rStyle w:val="SourceText"/>
+          <w:rFonts w:ascii="var font-mono" w:hAnsi="var font-mono"/>
+          <w:color w:val="2B303B"/>
+          <w:sz w:val="24"/>
+          <w:szCs w:val="24"/>
+          <w:shd w:fill="auto" w:val="clear"/>
+        </w:rPr>
+        <w:t>}</w:t>
+      </w:r>
+    </w:p>
+    <w:p>
+      <w:pPr>
+        <w:pStyle w:val="PreformattedText"/>
+        <w:spacing w:before="0" w:after="283"/>
+        <w:ind w:hanging="0" w:start="0" w:end="0"/>
+        <w:rPr>
+          <w:rFonts w:ascii="Times New Roman" w:hAnsi="Times New Roman" w:eastAsia="Arial" w:cs="Arial"/>
+          <w:color w:val="000000"/>
+          <w:sz w:val="24"/>
+          <w:szCs w:val="24"/>
+        </w:rPr>
+      </w:pPr>
+      <w:r>
+        <w:rPr>
+          <w:rStyle w:val="SourceText"/>
+          <w:rFonts w:ascii="var font-mono" w:hAnsi="var font-mono"/>
+          <w:color w:val="2B303B"/>
+          <w:sz w:val="24"/>
+          <w:szCs w:val="24"/>
+          <w:shd w:fill="auto" w:val="clear"/>
+        </w:rPr>
+        <w:t>]</w:t>
+      </w:r>
+    </w:p>
+    <w:p>
+      <w:pPr>
+        <w:pStyle w:val="HorizontalLine"/>
+        <w:spacing w:before="0" w:after="0"/>
+        <w:rPr>
+          <w:rFonts w:ascii="Times New Roman" w:hAnsi="Times New Roman"/>
+          <w:color w:val="000000"/>
+          <w:sz w:val="24"/>
+          <w:szCs w:val="24"/>
+        </w:rPr>
+      </w:pPr>
+      <w:r>
+        <w:rPr>
+          <w:rFonts w:ascii="Times New Roman" w:hAnsi="Times New Roman"/>
+          <w:color w:val="000000"/>
+          <w:sz w:val="24"/>
+          <w:szCs w:val="24"/>
+        </w:rPr>
+      </w:r>
+    </w:p>
+    <w:p>
+      <w:pPr>
+        <w:pStyle w:val="BodyText"/>
+        <w:spacing w:lineRule="auto" w:line="240"/>
+        <w:rPr>
+          <w:rFonts w:ascii="Times New Roman" w:hAnsi="Times New Roman"/>
+          <w:color w:val="000000"/>
+        </w:rPr>
+      </w:pPr>
+      <w:r>
+        <w:rPr>
+          <w:rStyle w:val="Strong"/>
+          <w:rFonts w:ascii="Times New Roman" w:hAnsi="Times New Roman"/>
+          <w:color w:val="000000"/>
+        </w:rPr>
+        <w:t>Key things to note:</w:t>
+      </w:r>
+    </w:p>
+    <w:p>
+      <w:pPr>
+        <w:pStyle w:val="BodyText"/>
+        <w:numPr>
+          <w:ilvl w:val="0"/>
+          <w:numId w:val="11"/>
+        </w:numPr>
+        <w:tabs>
+          <w:tab w:val="clear" w:pos="720"/>
+          <w:tab w:val="left" w:pos="0" w:leader="none"/>
+        </w:tabs>
+        <w:spacing w:lineRule="auto" w:line="240" w:before="0" w:after="0"/>
+        <w:ind w:hanging="283" w:start="709"/>
+        <w:rPr>
+          <w:rFonts w:ascii="Times New Roman" w:hAnsi="Times New Roman"/>
+          <w:color w:val="000000"/>
+        </w:rPr>
+      </w:pPr>
+      <w:r>
+        <w:rPr>
+          <w:rFonts w:ascii="Times New Roman" w:hAnsi="Times New Roman"/>
+          <w:color w:val="000000"/>
+        </w:rPr>
+        <w:t xml:space="preserve">The entire article goes in the </w:t>
+      </w:r>
+      <w:r>
+        <w:rPr>
+          <w:rStyle w:val="SourceText"/>
+          <w:rFonts w:ascii="Times New Roman" w:hAnsi="Times New Roman"/>
+          <w:color w:val="000000"/>
+        </w:rPr>
+        <w:t>"body"</w:t>
+      </w:r>
+      <w:r>
+        <w:rPr>
+          <w:rFonts w:ascii="Times New Roman" w:hAnsi="Times New Roman"/>
+          <w:color w:val="000000"/>
+        </w:rPr>
+        <w:t xml:space="preserve"> field as </w:t>
+      </w:r>
+      <w:r>
+        <w:rPr>
+          <w:rStyle w:val="Strong"/>
+          <w:rFonts w:ascii="Times New Roman" w:hAnsi="Times New Roman"/>
+          <w:color w:val="000000"/>
+        </w:rPr>
+        <w:t>one continuous string</w:t>
+      </w:r>
+      <w:r>
+        <w:rPr>
+          <w:rFonts w:ascii="Times New Roman" w:hAnsi="Times New Roman"/>
+          <w:color w:val="000000"/>
+        </w:rPr>
+        <w:t xml:space="preserve"> with </w:t>
+      </w:r>
+      <w:r>
+        <w:rPr>
+          <w:rStyle w:val="SourceText"/>
+          <w:rFonts w:ascii="Times New Roman" w:hAnsi="Times New Roman"/>
+          <w:color w:val="000000"/>
+        </w:rPr>
+        <w:t>\n\n</w:t>
+      </w:r>
+      <w:r>
+        <w:rPr>
+          <w:rFonts w:ascii="Times New Roman" w:hAnsi="Times New Roman"/>
+          <w:color w:val="000000"/>
+        </w:rPr>
+        <w:t xml:space="preserve"> between paragraphs — no actual line breaks inside the quotes </w:t>
+      </w:r>
+    </w:p>
+    <w:p>
+      <w:pPr>
+        <w:pStyle w:val="BodyText"/>
+        <w:numPr>
+          <w:ilvl w:val="0"/>
+          <w:numId w:val="11"/>
+        </w:numPr>
+        <w:tabs>
+          <w:tab w:val="clear" w:pos="720"/>
+          <w:tab w:val="left" w:pos="0" w:leader="none"/>
+        </w:tabs>
+        <w:spacing w:lineRule="auto" w:line="240" w:before="0" w:after="0"/>
+        <w:ind w:hanging="283" w:start="709"/>
+        <w:rPr>
+          <w:rFonts w:ascii="Times New Roman" w:hAnsi="Times New Roman"/>
+          <w:color w:val="000000"/>
+        </w:rPr>
+      </w:pPr>
+      <w:r>
+        <w:rPr>
+          <w:rStyle w:val="SourceText"/>
+          <w:rFonts w:ascii="Times New Roman" w:hAnsi="Times New Roman"/>
+          <w:color w:val="000000"/>
+        </w:rPr>
+        <w:t>"country": ""</w:t>
+      </w:r>
+      <w:r>
+        <w:rPr>
+          <w:rFonts w:ascii="Times New Roman" w:hAnsi="Times New Roman"/>
+          <w:color w:val="000000"/>
+        </w:rPr>
+        <w:t xml:space="preserve"> — leave blank for India </w:t>
+      </w:r>
+    </w:p>
+    <w:p>
+      <w:pPr>
+        <w:pStyle w:val="BodyText"/>
+        <w:numPr>
+          <w:ilvl w:val="0"/>
+          <w:numId w:val="11"/>
+        </w:numPr>
+        <w:tabs>
+          <w:tab w:val="clear" w:pos="720"/>
+          <w:tab w:val="left" w:pos="0" w:leader="none"/>
+        </w:tabs>
+        <w:spacing w:lineRule="auto" w:line="240" w:before="0" w:after="0"/>
+        <w:ind w:hanging="283" w:start="709"/>
+        <w:rPr>
+          <w:rFonts w:ascii="Times New Roman" w:hAnsi="Times New Roman"/>
+          <w:color w:val="000000"/>
+        </w:rPr>
+      </w:pPr>
+      <w:r>
+        <w:rPr>
+          <w:rStyle w:val="SourceText"/>
+          <w:rFonts w:ascii="Times New Roman" w:hAnsi="Times New Roman"/>
+          <w:color w:val="000000"/>
+        </w:rPr>
+        <w:t>"place_tag"</w:t>
+      </w:r>
+      <w:r>
+        <w:rPr>
+          <w:rFonts w:ascii="Times New Roman" w:hAnsi="Times New Roman"/>
+          <w:color w:val="000000"/>
+        </w:rPr>
+        <w:t xml:space="preserve"> must match exactly how the city is tagged in your photos </w:t>
+      </w:r>
+    </w:p>
+    <w:p>
+      <w:pPr>
+        <w:pStyle w:val="BodyText"/>
+        <w:numPr>
+          <w:ilvl w:val="0"/>
+          <w:numId w:val="11"/>
+        </w:numPr>
+        <w:tabs>
+          <w:tab w:val="clear" w:pos="720"/>
+          <w:tab w:val="left" w:pos="0" w:leader="none"/>
+        </w:tabs>
+        <w:spacing w:lineRule="auto" w:line="240"/>
+        <w:ind w:hanging="283" w:start="709"/>
+        <w:rPr>
+          <w:rFonts w:ascii="Times New Roman" w:hAnsi="Times New Roman"/>
+          <w:color w:val="000000"/>
+        </w:rPr>
+      </w:pPr>
+      <w:r>
+        <w:rPr>
+          <w:rStyle w:val="SourceText"/>
+          <w:rFonts w:ascii="Times New Roman" w:hAnsi="Times New Roman"/>
+          <w:color w:val="000000"/>
+        </w:rPr>
+        <w:t>"collections_links"</w:t>
+      </w:r>
+      <w:r>
+        <w:rPr>
+          <w:rFonts w:ascii="Times New Roman" w:hAnsi="Times New Roman"/>
+          <w:color w:val="000000"/>
+        </w:rPr>
+        <w:t xml:space="preserve"> — these become the buttons at the bottom of the article linking to your photo collections </w:t>
+      </w:r>
+    </w:p>
+    <w:p>
+      <w:pPr>
+        <w:pStyle w:val="BodyText"/>
+        <w:spacing w:lineRule="auto" w:line="240"/>
+        <w:rPr>
+          <w:rFonts w:ascii="Times New Roman" w:hAnsi="Times New Roman"/>
+          <w:color w:val="000000"/>
+        </w:rPr>
+      </w:pPr>
+      <w:r>
+        <w:rPr>
+          <w:rFonts w:ascii="Times New Roman" w:hAnsi="Times New Roman"/>
+          <w:color w:val="000000"/>
+        </w:rPr>
+        <w:t>Once you've pasted and saved the file, run:</w:t>
+      </w:r>
+    </w:p>
+    <w:p>
+      <w:pPr>
+        <w:pStyle w:val="BodyText"/>
+        <w:spacing w:lineRule="auto" w:line="240"/>
+        <w:ind w:hanging="0" w:start="0" w:end="0"/>
+        <w:rPr>
+          <w:rFonts w:ascii="Times New Roman" w:hAnsi="Times New Roman"/>
+          <w:color w:val="000000"/>
+        </w:rPr>
+      </w:pPr>
+      <w:r>
+        <w:rPr>
+          <w:rFonts w:ascii="Times New Roman" w:hAnsi="Times New Roman"/>
+          <w:color w:val="000000"/>
+        </w:rPr>
+        <w:t>bash</w:t>
+      </w:r>
+    </w:p>
+    <w:p>
+      <w:pPr>
+        <w:pStyle w:val="PreformattedText"/>
+        <w:spacing w:before="0" w:after="283"/>
+        <w:ind w:hanging="0" w:start="0" w:end="0"/>
+        <w:rPr>
+          <w:rFonts w:ascii="Times New Roman" w:hAnsi="Times New Roman" w:eastAsia="Arial" w:cs="Arial"/>
+          <w:color w:val="000000"/>
+          <w:sz w:val="24"/>
+          <w:szCs w:val="24"/>
+        </w:rPr>
+      </w:pPr>
+      <w:r>
+        <w:rPr>
+          <w:rStyle w:val="SourceText"/>
+          <w:rFonts w:ascii="var font-mono" w:hAnsi="var font-mono"/>
+          <w:color w:val="14181F"/>
+          <w:sz w:val="24"/>
+          <w:szCs w:val="24"/>
+          <w:shd w:fill="auto" w:val="clear"/>
+        </w:rPr>
+        <w:t>python3 /Users/ncm/Pictures/Mohangraphy/Scripts/Claude_mohangraphy.py</w:t>
+      </w:r>
+    </w:p>
+    <w:p>
+      <w:pPr>
+        <w:pStyle w:val="Normal"/>
+        <w:spacing w:lineRule="auto" w:line="240" w:before="0" w:after="0"/>
+        <w:rPr>
+          <w:rFonts w:ascii="Times New Roman" w:hAnsi="Times New Roman"/>
+          <w:color w:val="000000"/>
+        </w:rPr>
+      </w:pPr>
+      <w:r>
+        <w:rPr>
+          <w:rFonts w:ascii="Times New Roman" w:hAnsi="Times New Roman"/>
+          <w:color w:val="000000"/>
+        </w:rPr>
+      </w:r>
+    </w:p>
+    <w:p>
+      <w:pPr>
+        <w:pStyle w:val="Normal"/>
+        <w:spacing w:lineRule="auto" w:line="240" w:before="0" w:after="0"/>
+        <w:rPr>
+          <w:rFonts w:ascii="Times New Roman" w:hAnsi="Times New Roman"/>
+          <w:color w:val="000000"/>
+        </w:rPr>
+      </w:pPr>
+      <w:r>
+        <w:rPr>
+          <w:rFonts w:ascii="Times New Roman" w:hAnsi="Times New Roman"/>
+          <w:color w:val="000000"/>
+        </w:rPr>
+      </w:r>
+    </w:p>
+    <w:p>
+      <w:pPr>
+        <w:pStyle w:val="Normal"/>
+        <w:spacing w:lineRule="auto" w:line="240" w:before="0" w:after="0"/>
+        <w:rPr>
+          <w:rFonts w:ascii="Times New Roman" w:hAnsi="Times New Roman"/>
+          <w:color w:val="000000"/>
+        </w:rPr>
+      </w:pPr>
+      <w:r>
+        <w:rPr>
+          <w:rFonts w:ascii="Times New Roman" w:hAnsi="Times New Roman"/>
+          <w:color w:val="000000"/>
+        </w:rPr>
+      </w:r>
+    </w:p>
+    <w:p>
+      <w:pPr>
+        <w:pStyle w:val="BodyText"/>
+        <w:spacing w:lineRule="auto" w:line="240" w:before="0" w:after="0"/>
+        <w:rPr>
+          <w:rFonts w:ascii="Times New Roman" w:hAnsi="Times New Roman"/>
+          <w:color w:val="000000"/>
+        </w:rPr>
+      </w:pPr>
+      <w:r>
+        <w:rPr>
+          <w:rFonts w:ascii="Times New Roman" w:hAnsi="Times New Roman"/>
+          <w:color w:val="000000"/>
+        </w:rPr>
+        <w:t xml:space="preserve">All blogs go in </w:t>
+      </w:r>
+      <w:r>
+        <w:rPr>
+          <w:rStyle w:val="Strong"/>
+          <w:rFonts w:ascii="Times New Roman" w:hAnsi="Times New Roman"/>
+          <w:color w:val="000000"/>
+        </w:rPr>
+        <w:t>one single file</w:t>
+      </w:r>
+      <w:r>
+        <w:rPr>
+          <w:rFonts w:ascii="Times New Roman" w:hAnsi="Times New Roman"/>
+          <w:color w:val="000000"/>
+        </w:rPr>
+        <w:t xml:space="preserve"> — </w:t>
+      </w:r>
+      <w:r>
+        <w:rPr>
+          <w:rStyle w:val="SourceText"/>
+          <w:rFonts w:ascii="Times New Roman" w:hAnsi="Times New Roman"/>
+          <w:color w:val="000000"/>
+        </w:rPr>
+        <w:t>blog_posts.json</w:t>
+      </w:r>
+      <w:r>
+        <w:rPr>
+          <w:rFonts w:ascii="Times New Roman" w:hAnsi="Times New Roman"/>
+          <w:color w:val="000000"/>
+        </w:rPr>
+        <w:t>.</w:t>
+      </w:r>
+    </w:p>
+    <w:p>
+      <w:pPr>
+        <w:pStyle w:val="BodyText"/>
+        <w:spacing w:lineRule="auto" w:line="240"/>
+        <w:rPr>
+          <w:rFonts w:ascii="Times New Roman" w:hAnsi="Times New Roman"/>
+          <w:color w:val="000000"/>
+        </w:rPr>
+      </w:pPr>
+      <w:r>
+        <w:rPr>
+          <w:rFonts w:ascii="Times New Roman" w:hAnsi="Times New Roman"/>
+          <w:color w:val="000000"/>
+        </w:rPr>
+        <w:t xml:space="preserve">Think of it like a notebook with multiple pages. The </w:t>
+      </w:r>
+      <w:r>
+        <w:rPr>
+          <w:rStyle w:val="SourceText"/>
+          <w:rFonts w:ascii="Times New Roman" w:hAnsi="Times New Roman"/>
+          <w:color w:val="000000"/>
+        </w:rPr>
+        <w:t>[]</w:t>
+      </w:r>
+      <w:r>
+        <w:rPr>
+          <w:rFonts w:ascii="Times New Roman" w:hAnsi="Times New Roman"/>
+          <w:color w:val="000000"/>
+        </w:rPr>
+        <w:t xml:space="preserve"> square brackets hold all your articles, separated by commas:</w:t>
+      </w:r>
+    </w:p>
+    <w:p>
+      <w:pPr>
+        <w:pStyle w:val="BodyText"/>
+        <w:spacing w:lineRule="auto" w:line="240"/>
+        <w:ind w:hanging="0" w:start="0" w:end="0"/>
+        <w:rPr>
+          <w:rFonts w:ascii="Times New Roman" w:hAnsi="Times New Roman"/>
+          <w:color w:val="000000"/>
+        </w:rPr>
+      </w:pPr>
+      <w:r>
+        <w:rPr>
+          <w:rFonts w:ascii="Times New Roman" w:hAnsi="Times New Roman"/>
+          <w:color w:val="000000"/>
+        </w:rPr>
+        <w:t>json</w:t>
+      </w:r>
+    </w:p>
+    <w:p>
+      <w:pPr>
+        <w:pStyle w:val="PreformattedText"/>
+        <w:ind w:hanging="0" w:start="0" w:end="0"/>
+        <w:rPr>
+          <w:rFonts w:ascii="Times New Roman" w:hAnsi="Times New Roman" w:eastAsia="Arial" w:cs="Arial"/>
+          <w:color w:val="000000"/>
+          <w:sz w:val="24"/>
+          <w:szCs w:val="24"/>
+        </w:rPr>
+      </w:pPr>
+      <w:r>
+        <w:rPr>
+          <w:rStyle w:val="SourceText"/>
+          <w:rFonts w:ascii="var font-mono" w:hAnsi="var font-mono"/>
+          <w:color w:val="2B303B"/>
+          <w:sz w:val="24"/>
+          <w:szCs w:val="24"/>
+          <w:shd w:fill="auto" w:val="clear"/>
+        </w:rPr>
+        <w:t>[</w:t>
+      </w:r>
+    </w:p>
+    <w:p>
+      <w:pPr>
+        <w:pStyle w:val="PreformattedText"/>
+        <w:ind w:hanging="0" w:start="0" w:end="0"/>
+        <w:rPr>
+          <w:rFonts w:ascii="Times New Roman" w:hAnsi="Times New Roman" w:eastAsia="Arial" w:cs="Arial"/>
+          <w:color w:val="000000"/>
+          <w:sz w:val="24"/>
+          <w:szCs w:val="24"/>
+        </w:rPr>
+      </w:pPr>
+      <w:r>
+        <w:rPr>
+          <w:rStyle w:val="SourceText"/>
+          <w:rFonts w:ascii="Times New Roman" w:hAnsi="Times New Roman"/>
+          <w:color w:val="14181F"/>
+          <w:sz w:val="24"/>
+          <w:szCs w:val="24"/>
+          <w:shd w:fill="auto" w:val="clear"/>
+        </w:rPr>
+        <w:t xml:space="preserve">    </w:t>
+      </w:r>
+      <w:r>
+        <w:rPr>
+          <w:rStyle w:val="SourceText"/>
+          <w:rFonts w:ascii="var font-mono" w:hAnsi="var font-mono"/>
+          <w:color w:val="2B303B"/>
+          <w:sz w:val="24"/>
+          <w:szCs w:val="24"/>
+          <w:shd w:fill="auto" w:val="clear"/>
+        </w:rPr>
+        <w:t>{</w:t>
+      </w:r>
+    </w:p>
+    <w:p>
+      <w:pPr>
+        <w:pStyle w:val="PreformattedText"/>
+        <w:ind w:hanging="0" w:start="0" w:end="0"/>
+        <w:rPr>
+          <w:rFonts w:ascii="Times New Roman" w:hAnsi="Times New Roman" w:eastAsia="Arial" w:cs="Arial"/>
+          <w:color w:val="000000"/>
+          <w:sz w:val="24"/>
+          <w:szCs w:val="24"/>
+        </w:rPr>
+      </w:pPr>
+      <w:r>
+        <w:rPr>
+          <w:rStyle w:val="SourceText"/>
+          <w:rFonts w:ascii="Times New Roman" w:hAnsi="Times New Roman"/>
+          <w:color w:val="14181F"/>
+          <w:sz w:val="24"/>
+          <w:szCs w:val="24"/>
+          <w:shd w:fill="auto" w:val="clear"/>
+        </w:rPr>
+        <w:t xml:space="preserve">        </w:t>
+      </w:r>
+      <w:r>
+        <w:rPr>
+          <w:rStyle w:val="SourceText"/>
+          <w:rFonts w:ascii="var font-mono" w:hAnsi="var font-mono"/>
+          <w:color w:val="B80A18"/>
+          <w:sz w:val="24"/>
+          <w:szCs w:val="24"/>
+          <w:shd w:fill="auto" w:val="clear"/>
+        </w:rPr>
+        <w:t>"id"</w:t>
+      </w:r>
+      <w:r>
+        <w:rPr>
+          <w:rStyle w:val="SourceText"/>
+          <w:rFonts w:ascii="var font-mono" w:hAnsi="var font-mono"/>
+          <w:color w:val="14181F"/>
+          <w:sz w:val="24"/>
+          <w:szCs w:val="24"/>
+          <w:shd w:fill="auto" w:val="clear"/>
+        </w:rPr>
+        <w:t xml:space="preserve">: </w:t>
+      </w:r>
+      <w:r>
+        <w:rPr>
+          <w:rStyle w:val="SourceText"/>
+          <w:rFonts w:ascii="var font-mono" w:hAnsi="var font-mono"/>
+          <w:color w:val="008000"/>
+          <w:sz w:val="24"/>
+          <w:szCs w:val="24"/>
+          <w:shd w:fill="auto" w:val="clear"/>
+        </w:rPr>
+        <w:t>"madurai-2026"</w:t>
+      </w:r>
+      <w:r>
+        <w:rPr>
+          <w:rStyle w:val="SourceText"/>
+          <w:rFonts w:ascii="var font-mono" w:hAnsi="var font-mono"/>
+          <w:color w:val="2B303B"/>
+          <w:sz w:val="24"/>
+          <w:szCs w:val="24"/>
+          <w:shd w:fill="auto" w:val="clear"/>
+        </w:rPr>
+        <w:t>,</w:t>
+      </w:r>
+    </w:p>
+    <w:p>
+      <w:pPr>
+        <w:pStyle w:val="PreformattedText"/>
+        <w:ind w:hanging="0" w:start="0" w:end="0"/>
+        <w:rPr>
+          <w:rFonts w:ascii="Times New Roman" w:hAnsi="Times New Roman" w:eastAsia="Arial" w:cs="Arial"/>
+          <w:color w:val="000000"/>
+          <w:sz w:val="24"/>
+          <w:szCs w:val="24"/>
+        </w:rPr>
+      </w:pPr>
+      <w:r>
+        <w:rPr>
+          <w:rStyle w:val="SourceText"/>
+          <w:rFonts w:ascii="Times New Roman" w:hAnsi="Times New Roman"/>
+          <w:color w:val="14181F"/>
+          <w:sz w:val="24"/>
+          <w:szCs w:val="24"/>
+          <w:shd w:fill="auto" w:val="clear"/>
+        </w:rPr>
+        <w:t xml:space="preserve">        </w:t>
+      </w:r>
+      <w:r>
+        <w:rPr>
+          <w:rStyle w:val="SourceText"/>
+          <w:rFonts w:ascii="var font-mono" w:hAnsi="var font-mono"/>
+          <w:color w:val="B80A18"/>
+          <w:sz w:val="24"/>
+          <w:szCs w:val="24"/>
+          <w:shd w:fill="auto" w:val="clear"/>
+        </w:rPr>
+        <w:t>"title"</w:t>
+      </w:r>
+      <w:r>
+        <w:rPr>
+          <w:rStyle w:val="SourceText"/>
+          <w:rFonts w:ascii="var font-mono" w:hAnsi="var font-mono"/>
+          <w:color w:val="14181F"/>
+          <w:sz w:val="24"/>
+          <w:szCs w:val="24"/>
+          <w:shd w:fill="auto" w:val="clear"/>
+        </w:rPr>
+        <w:t xml:space="preserve">: </w:t>
+      </w:r>
+      <w:r>
+        <w:rPr>
+          <w:rStyle w:val="SourceText"/>
+          <w:rFonts w:ascii="var font-mono" w:hAnsi="var font-mono"/>
+          <w:color w:val="008000"/>
+          <w:sz w:val="24"/>
+          <w:szCs w:val="24"/>
+          <w:shd w:fill="auto" w:val="clear"/>
+        </w:rPr>
+        <w:t>"Madurai - A 2500 Year Old City"</w:t>
+      </w:r>
+      <w:r>
+        <w:rPr>
+          <w:rStyle w:val="SourceText"/>
+          <w:rFonts w:ascii="var font-mono" w:hAnsi="var font-mono"/>
+          <w:color w:val="2B303B"/>
+          <w:sz w:val="24"/>
+          <w:szCs w:val="24"/>
+          <w:shd w:fill="auto" w:val="clear"/>
+        </w:rPr>
+        <w:t>,</w:t>
+      </w:r>
+    </w:p>
+    <w:p>
+      <w:pPr>
+        <w:pStyle w:val="PreformattedText"/>
+        <w:ind w:hanging="0" w:start="0" w:end="0"/>
+        <w:rPr>
+          <w:rFonts w:ascii="Times New Roman" w:hAnsi="Times New Roman" w:eastAsia="Arial" w:cs="Arial"/>
+          <w:color w:val="000000"/>
+          <w:sz w:val="24"/>
+          <w:szCs w:val="24"/>
+        </w:rPr>
+      </w:pPr>
+      <w:r>
+        <w:rPr>
+          <w:rStyle w:val="SourceText"/>
+          <w:rFonts w:ascii="Times New Roman" w:hAnsi="Times New Roman"/>
+          <w:color w:val="14181F"/>
+          <w:sz w:val="24"/>
+          <w:szCs w:val="24"/>
+          <w:shd w:fill="auto" w:val="clear"/>
+        </w:rPr>
+        <w:t xml:space="preserve">        </w:t>
+      </w:r>
+      <w:r>
+        <w:rPr>
+          <w:rStyle w:val="SourceText"/>
+          <w:rFonts w:ascii="var font-mono" w:hAnsi="var font-mono"/>
+          <w:color w:val="B80A18"/>
+          <w:sz w:val="24"/>
+          <w:szCs w:val="24"/>
+          <w:shd w:fill="auto" w:val="clear"/>
+        </w:rPr>
+        <w:t>"body"</w:t>
+      </w:r>
+      <w:r>
+        <w:rPr>
+          <w:rStyle w:val="SourceText"/>
+          <w:rFonts w:ascii="var font-mono" w:hAnsi="var font-mono"/>
+          <w:color w:val="14181F"/>
+          <w:sz w:val="24"/>
+          <w:szCs w:val="24"/>
+          <w:shd w:fill="auto" w:val="clear"/>
+        </w:rPr>
+        <w:t xml:space="preserve">: </w:t>
+      </w:r>
+      <w:r>
+        <w:rPr>
+          <w:rStyle w:val="SourceText"/>
+          <w:rFonts w:ascii="var font-mono" w:hAnsi="var font-mono"/>
+          <w:color w:val="008000"/>
+          <w:sz w:val="24"/>
+          <w:szCs w:val="24"/>
+          <w:shd w:fill="auto" w:val="clear"/>
+        </w:rPr>
+        <w:t>"Your Madurai article here..."</w:t>
+      </w:r>
+    </w:p>
+    <w:p>
+      <w:pPr>
+        <w:pStyle w:val="PreformattedText"/>
+        <w:ind w:hanging="0" w:start="0" w:end="0"/>
+        <w:rPr>
+          <w:rFonts w:ascii="Times New Roman" w:hAnsi="Times New Roman" w:eastAsia="Arial" w:cs="Arial"/>
+          <w:color w:val="000000"/>
+          <w:sz w:val="24"/>
+          <w:szCs w:val="24"/>
+        </w:rPr>
+      </w:pPr>
+      <w:r>
+        <w:rPr>
+          <w:rStyle w:val="SourceText"/>
+          <w:rFonts w:ascii="Times New Roman" w:hAnsi="Times New Roman"/>
+          <w:color w:val="14181F"/>
+          <w:sz w:val="24"/>
+          <w:szCs w:val="24"/>
+          <w:shd w:fill="auto" w:val="clear"/>
+        </w:rPr>
+        <w:t xml:space="preserve">    </w:t>
+      </w:r>
+      <w:r>
+        <w:rPr>
+          <w:rStyle w:val="SourceText"/>
+          <w:rFonts w:ascii="var font-mono" w:hAnsi="var font-mono"/>
+          <w:color w:val="2B303B"/>
+          <w:sz w:val="24"/>
+          <w:szCs w:val="24"/>
+          <w:shd w:fill="auto" w:val="clear"/>
+        </w:rPr>
+        <w:t>},</w:t>
+      </w:r>
+    </w:p>
+    <w:p>
+      <w:pPr>
+        <w:pStyle w:val="PreformattedText"/>
+        <w:ind w:hanging="0" w:start="0" w:end="0"/>
+        <w:rPr>
+          <w:rFonts w:ascii="Times New Roman" w:hAnsi="Times New Roman" w:eastAsia="Arial" w:cs="Arial"/>
+          <w:color w:val="000000"/>
+          <w:sz w:val="24"/>
+          <w:szCs w:val="24"/>
+        </w:rPr>
+      </w:pPr>
+      <w:r>
+        <w:rPr>
+          <w:rStyle w:val="SourceText"/>
+          <w:rFonts w:ascii="Times New Roman" w:hAnsi="Times New Roman"/>
+          <w:color w:val="14181F"/>
+          <w:sz w:val="24"/>
+          <w:szCs w:val="24"/>
+          <w:shd w:fill="auto" w:val="clear"/>
+        </w:rPr>
+        <w:t xml:space="preserve">    </w:t>
+      </w:r>
+      <w:r>
+        <w:rPr>
+          <w:rStyle w:val="SourceText"/>
+          <w:rFonts w:ascii="var font-mono" w:hAnsi="var font-mono"/>
+          <w:color w:val="2B303B"/>
+          <w:sz w:val="24"/>
+          <w:szCs w:val="24"/>
+          <w:shd w:fill="auto" w:val="clear"/>
+        </w:rPr>
+        <w:t>{</w:t>
+      </w:r>
+    </w:p>
+    <w:p>
+      <w:pPr>
+        <w:pStyle w:val="PreformattedText"/>
+        <w:ind w:hanging="0" w:start="0" w:end="0"/>
+        <w:rPr>
+          <w:rFonts w:ascii="Times New Roman" w:hAnsi="Times New Roman" w:eastAsia="Arial" w:cs="Arial"/>
+          <w:color w:val="000000"/>
+          <w:sz w:val="24"/>
+          <w:szCs w:val="24"/>
+        </w:rPr>
+      </w:pPr>
+      <w:r>
+        <w:rPr>
+          <w:rStyle w:val="SourceText"/>
+          <w:rFonts w:ascii="Times New Roman" w:hAnsi="Times New Roman"/>
+          <w:color w:val="14181F"/>
+          <w:sz w:val="24"/>
+          <w:szCs w:val="24"/>
+          <w:shd w:fill="auto" w:val="clear"/>
+        </w:rPr>
+        <w:t xml:space="preserve">        </w:t>
+      </w:r>
+      <w:r>
+        <w:rPr>
+          <w:rStyle w:val="SourceText"/>
+          <w:rFonts w:ascii="var font-mono" w:hAnsi="var font-mono"/>
+          <w:color w:val="B80A18"/>
+          <w:sz w:val="24"/>
+          <w:szCs w:val="24"/>
+          <w:shd w:fill="auto" w:val="clear"/>
+        </w:rPr>
+        <w:t>"id"</w:t>
+      </w:r>
+      <w:r>
+        <w:rPr>
+          <w:rStyle w:val="SourceText"/>
+          <w:rFonts w:ascii="var font-mono" w:hAnsi="var font-mono"/>
+          <w:color w:val="14181F"/>
+          <w:sz w:val="24"/>
+          <w:szCs w:val="24"/>
+          <w:shd w:fill="auto" w:val="clear"/>
+        </w:rPr>
+        <w:t xml:space="preserve">: </w:t>
+      </w:r>
+      <w:r>
+        <w:rPr>
+          <w:rStyle w:val="SourceText"/>
+          <w:rFonts w:ascii="var font-mono" w:hAnsi="var font-mono"/>
+          <w:color w:val="008000"/>
+          <w:sz w:val="24"/>
+          <w:szCs w:val="24"/>
+          <w:shd w:fill="auto" w:val="clear"/>
+        </w:rPr>
+        <w:t>"megamalai-2023"</w:t>
+      </w:r>
+      <w:r>
+        <w:rPr>
+          <w:rStyle w:val="SourceText"/>
+          <w:rFonts w:ascii="var font-mono" w:hAnsi="var font-mono"/>
+          <w:color w:val="2B303B"/>
+          <w:sz w:val="24"/>
+          <w:szCs w:val="24"/>
+          <w:shd w:fill="auto" w:val="clear"/>
+        </w:rPr>
+        <w:t>,</w:t>
+      </w:r>
+    </w:p>
+    <w:p>
+      <w:pPr>
+        <w:pStyle w:val="PreformattedText"/>
+        <w:ind w:hanging="0" w:start="0" w:end="0"/>
+        <w:rPr>
+          <w:rFonts w:ascii="Times New Roman" w:hAnsi="Times New Roman" w:eastAsia="Arial" w:cs="Arial"/>
+          <w:color w:val="000000"/>
+          <w:sz w:val="24"/>
+          <w:szCs w:val="24"/>
+        </w:rPr>
+      </w:pPr>
+      <w:r>
+        <w:rPr>
+          <w:rStyle w:val="SourceText"/>
+          <w:rFonts w:ascii="Times New Roman" w:hAnsi="Times New Roman"/>
+          <w:color w:val="14181F"/>
+          <w:sz w:val="24"/>
+          <w:szCs w:val="24"/>
+          <w:shd w:fill="auto" w:val="clear"/>
+        </w:rPr>
+        <w:t xml:space="preserve">        </w:t>
+      </w:r>
+      <w:r>
+        <w:rPr>
+          <w:rStyle w:val="SourceText"/>
+          <w:rFonts w:ascii="var font-mono" w:hAnsi="var font-mono"/>
+          <w:color w:val="B80A18"/>
+          <w:sz w:val="24"/>
+          <w:szCs w:val="24"/>
+          <w:shd w:fill="auto" w:val="clear"/>
+        </w:rPr>
+        <w:t>"title"</w:t>
+      </w:r>
+      <w:r>
+        <w:rPr>
+          <w:rStyle w:val="SourceText"/>
+          <w:rFonts w:ascii="var font-mono" w:hAnsi="var font-mono"/>
+          <w:color w:val="14181F"/>
+          <w:sz w:val="24"/>
+          <w:szCs w:val="24"/>
+          <w:shd w:fill="auto" w:val="clear"/>
+        </w:rPr>
+        <w:t xml:space="preserve">: </w:t>
+      </w:r>
+      <w:r>
+        <w:rPr>
+          <w:rStyle w:val="SourceText"/>
+          <w:rFonts w:ascii="var font-mono" w:hAnsi="var font-mono"/>
+          <w:color w:val="008000"/>
+          <w:sz w:val="24"/>
+          <w:szCs w:val="24"/>
+          <w:shd w:fill="auto" w:val="clear"/>
+        </w:rPr>
+        <w:t>"Megamalai - Into the Wild"</w:t>
+      </w:r>
+      <w:r>
+        <w:rPr>
+          <w:rStyle w:val="SourceText"/>
+          <w:rFonts w:ascii="var font-mono" w:hAnsi="var font-mono"/>
+          <w:color w:val="2B303B"/>
+          <w:sz w:val="24"/>
+          <w:szCs w:val="24"/>
+          <w:shd w:fill="auto" w:val="clear"/>
+        </w:rPr>
+        <w:t>,</w:t>
+      </w:r>
+    </w:p>
+    <w:p>
+      <w:pPr>
+        <w:pStyle w:val="PreformattedText"/>
+        <w:ind w:hanging="0" w:start="0" w:end="0"/>
+        <w:rPr>
+          <w:rFonts w:ascii="Times New Roman" w:hAnsi="Times New Roman" w:eastAsia="Arial" w:cs="Arial"/>
+          <w:color w:val="000000"/>
+          <w:sz w:val="24"/>
+          <w:szCs w:val="24"/>
+        </w:rPr>
+      </w:pPr>
+      <w:r>
+        <w:rPr>
+          <w:rStyle w:val="SourceText"/>
+          <w:rFonts w:ascii="Times New Roman" w:hAnsi="Times New Roman"/>
+          <w:color w:val="14181F"/>
+          <w:sz w:val="24"/>
+          <w:szCs w:val="24"/>
+          <w:shd w:fill="auto" w:val="clear"/>
+        </w:rPr>
+        <w:t xml:space="preserve">        </w:t>
+      </w:r>
+      <w:r>
+        <w:rPr>
+          <w:rStyle w:val="SourceText"/>
+          <w:rFonts w:ascii="var font-mono" w:hAnsi="var font-mono"/>
+          <w:color w:val="B80A18"/>
+          <w:sz w:val="24"/>
+          <w:szCs w:val="24"/>
+          <w:shd w:fill="auto" w:val="clear"/>
+        </w:rPr>
+        <w:t>"body"</w:t>
+      </w:r>
+      <w:r>
+        <w:rPr>
+          <w:rStyle w:val="SourceText"/>
+          <w:rFonts w:ascii="var font-mono" w:hAnsi="var font-mono"/>
+          <w:color w:val="14181F"/>
+          <w:sz w:val="24"/>
+          <w:szCs w:val="24"/>
+          <w:shd w:fill="auto" w:val="clear"/>
+        </w:rPr>
+        <w:t xml:space="preserve">: </w:t>
+      </w:r>
+      <w:r>
+        <w:rPr>
+          <w:rStyle w:val="SourceText"/>
+          <w:rFonts w:ascii="var font-mono" w:hAnsi="var font-mono"/>
+          <w:color w:val="008000"/>
+          <w:sz w:val="24"/>
+          <w:szCs w:val="24"/>
+          <w:shd w:fill="auto" w:val="clear"/>
+        </w:rPr>
+        <w:t>"Your Megamalai article here..."</w:t>
+      </w:r>
+    </w:p>
+    <w:p>
+      <w:pPr>
+        <w:pStyle w:val="PreformattedText"/>
+        <w:ind w:hanging="0" w:start="0" w:end="0"/>
+        <w:rPr>
+          <w:rFonts w:ascii="Times New Roman" w:hAnsi="Times New Roman" w:eastAsia="Arial" w:cs="Arial"/>
+          <w:color w:val="000000"/>
+          <w:sz w:val="24"/>
+          <w:szCs w:val="24"/>
+        </w:rPr>
+      </w:pPr>
+      <w:r>
+        <w:rPr>
+          <w:rStyle w:val="SourceText"/>
+          <w:rFonts w:ascii="Times New Roman" w:hAnsi="Times New Roman"/>
+          <w:color w:val="14181F"/>
+          <w:sz w:val="24"/>
+          <w:szCs w:val="24"/>
+          <w:shd w:fill="auto" w:val="clear"/>
+        </w:rPr>
+        <w:t xml:space="preserve">    </w:t>
+      </w:r>
+      <w:r>
+        <w:rPr>
+          <w:rStyle w:val="SourceText"/>
+          <w:rFonts w:ascii="var font-mono" w:hAnsi="var font-mono"/>
+          <w:color w:val="2B303B"/>
+          <w:sz w:val="24"/>
+          <w:szCs w:val="24"/>
+          <w:shd w:fill="auto" w:val="clear"/>
+        </w:rPr>
+        <w:t>},</w:t>
+      </w:r>
+    </w:p>
+    <w:p>
+      <w:pPr>
+        <w:pStyle w:val="PreformattedText"/>
+        <w:ind w:hanging="0" w:start="0" w:end="0"/>
+        <w:rPr>
+          <w:rFonts w:ascii="Times New Roman" w:hAnsi="Times New Roman" w:eastAsia="Arial" w:cs="Arial"/>
+          <w:color w:val="000000"/>
+          <w:sz w:val="24"/>
+          <w:szCs w:val="24"/>
+        </w:rPr>
+      </w:pPr>
+      <w:r>
+        <w:rPr>
+          <w:rStyle w:val="SourceText"/>
+          <w:rFonts w:ascii="Times New Roman" w:hAnsi="Times New Roman"/>
+          <w:color w:val="14181F"/>
+          <w:sz w:val="24"/>
+          <w:szCs w:val="24"/>
+          <w:shd w:fill="auto" w:val="clear"/>
+        </w:rPr>
+        <w:t xml:space="preserve">    </w:t>
+      </w:r>
+      <w:r>
+        <w:rPr>
+          <w:rStyle w:val="SourceText"/>
+          <w:rFonts w:ascii="var font-mono" w:hAnsi="var font-mono"/>
+          <w:color w:val="2B303B"/>
+          <w:sz w:val="24"/>
+          <w:szCs w:val="24"/>
+          <w:shd w:fill="auto" w:val="clear"/>
+        </w:rPr>
+        <w:t>{</w:t>
+      </w:r>
+    </w:p>
+    <w:p>
+      <w:pPr>
+        <w:pStyle w:val="PreformattedText"/>
+        <w:ind w:hanging="0" w:start="0" w:end="0"/>
+        <w:rPr>
+          <w:rFonts w:ascii="Times New Roman" w:hAnsi="Times New Roman" w:eastAsia="Arial" w:cs="Arial"/>
+          <w:color w:val="000000"/>
+          <w:sz w:val="24"/>
+          <w:szCs w:val="24"/>
+        </w:rPr>
+      </w:pPr>
+      <w:r>
+        <w:rPr>
+          <w:rStyle w:val="SourceText"/>
+          <w:rFonts w:ascii="Times New Roman" w:hAnsi="Times New Roman"/>
+          <w:color w:val="14181F"/>
+          <w:sz w:val="24"/>
+          <w:szCs w:val="24"/>
+          <w:shd w:fill="auto" w:val="clear"/>
+        </w:rPr>
+        <w:t xml:space="preserve">        </w:t>
+      </w:r>
+      <w:r>
+        <w:rPr>
+          <w:rStyle w:val="SourceText"/>
+          <w:rFonts w:ascii="var font-mono" w:hAnsi="var font-mono"/>
+          <w:color w:val="B80A18"/>
+          <w:sz w:val="24"/>
+          <w:szCs w:val="24"/>
+          <w:shd w:fill="auto" w:val="clear"/>
+        </w:rPr>
+        <w:t>"id"</w:t>
+      </w:r>
+      <w:r>
+        <w:rPr>
+          <w:rStyle w:val="SourceText"/>
+          <w:rFonts w:ascii="var font-mono" w:hAnsi="var font-mono"/>
+          <w:color w:val="14181F"/>
+          <w:sz w:val="24"/>
+          <w:szCs w:val="24"/>
+          <w:shd w:fill="auto" w:val="clear"/>
+        </w:rPr>
+        <w:t xml:space="preserve">: </w:t>
+      </w:r>
+      <w:r>
+        <w:rPr>
+          <w:rStyle w:val="SourceText"/>
+          <w:rFonts w:ascii="var font-mono" w:hAnsi="var font-mono"/>
+          <w:color w:val="008000"/>
+          <w:sz w:val="24"/>
+          <w:szCs w:val="24"/>
+          <w:shd w:fill="auto" w:val="clear"/>
+        </w:rPr>
+        <w:t>"banff-2024"</w:t>
+      </w:r>
+      <w:r>
+        <w:rPr>
+          <w:rStyle w:val="SourceText"/>
+          <w:rFonts w:ascii="var font-mono" w:hAnsi="var font-mono"/>
+          <w:color w:val="2B303B"/>
+          <w:sz w:val="24"/>
+          <w:szCs w:val="24"/>
+          <w:shd w:fill="auto" w:val="clear"/>
+        </w:rPr>
+        <w:t>,</w:t>
+      </w:r>
+    </w:p>
+    <w:p>
+      <w:pPr>
+        <w:pStyle w:val="PreformattedText"/>
+        <w:ind w:hanging="0" w:start="0" w:end="0"/>
+        <w:rPr>
+          <w:rFonts w:ascii="Times New Roman" w:hAnsi="Times New Roman" w:eastAsia="Arial" w:cs="Arial"/>
+          <w:color w:val="000000"/>
+          <w:sz w:val="24"/>
+          <w:szCs w:val="24"/>
+        </w:rPr>
+      </w:pPr>
+      <w:r>
+        <w:rPr>
+          <w:rStyle w:val="SourceText"/>
+          <w:rFonts w:ascii="Times New Roman" w:hAnsi="Times New Roman"/>
+          <w:color w:val="14181F"/>
+          <w:sz w:val="24"/>
+          <w:szCs w:val="24"/>
+          <w:shd w:fill="auto" w:val="clear"/>
+        </w:rPr>
+        <w:t xml:space="preserve">        </w:t>
+      </w:r>
+      <w:r>
+        <w:rPr>
+          <w:rStyle w:val="SourceText"/>
+          <w:rFonts w:ascii="var font-mono" w:hAnsi="var font-mono"/>
+          <w:color w:val="B80A18"/>
+          <w:sz w:val="24"/>
+          <w:szCs w:val="24"/>
+          <w:shd w:fill="auto" w:val="clear"/>
+        </w:rPr>
+        <w:t>"title"</w:t>
+      </w:r>
+      <w:r>
+        <w:rPr>
+          <w:rStyle w:val="SourceText"/>
+          <w:rFonts w:ascii="var font-mono" w:hAnsi="var font-mono"/>
+          <w:color w:val="14181F"/>
+          <w:sz w:val="24"/>
+          <w:szCs w:val="24"/>
+          <w:shd w:fill="auto" w:val="clear"/>
+        </w:rPr>
+        <w:t xml:space="preserve">: </w:t>
+      </w:r>
+      <w:r>
+        <w:rPr>
+          <w:rStyle w:val="SourceText"/>
+          <w:rFonts w:ascii="var font-mono" w:hAnsi="var font-mono"/>
+          <w:color w:val="008000"/>
+          <w:sz w:val="24"/>
+          <w:szCs w:val="24"/>
+          <w:shd w:fill="auto" w:val="clear"/>
+        </w:rPr>
+        <w:t>"Banff - The Canadian Rockies"</w:t>
+      </w:r>
+      <w:r>
+        <w:rPr>
+          <w:rStyle w:val="SourceText"/>
+          <w:rFonts w:ascii="var font-mono" w:hAnsi="var font-mono"/>
+          <w:color w:val="2B303B"/>
+          <w:sz w:val="24"/>
+          <w:szCs w:val="24"/>
+          <w:shd w:fill="auto" w:val="clear"/>
+        </w:rPr>
+        <w:t>,</w:t>
+      </w:r>
+    </w:p>
+    <w:p>
+      <w:pPr>
+        <w:pStyle w:val="PreformattedText"/>
+        <w:ind w:hanging="0" w:start="0" w:end="0"/>
+        <w:rPr>
+          <w:rFonts w:ascii="Times New Roman" w:hAnsi="Times New Roman" w:eastAsia="Arial" w:cs="Arial"/>
+          <w:color w:val="000000"/>
+          <w:sz w:val="24"/>
+          <w:szCs w:val="24"/>
+        </w:rPr>
+      </w:pPr>
+      <w:r>
+        <w:rPr>
+          <w:rStyle w:val="SourceText"/>
+          <w:rFonts w:ascii="Times New Roman" w:hAnsi="Times New Roman"/>
+          <w:color w:val="14181F"/>
+          <w:sz w:val="24"/>
+          <w:szCs w:val="24"/>
+          <w:shd w:fill="auto" w:val="clear"/>
+        </w:rPr>
+        <w:t xml:space="preserve">        </w:t>
+      </w:r>
+      <w:r>
+        <w:rPr>
+          <w:rStyle w:val="SourceText"/>
+          <w:rFonts w:ascii="var font-mono" w:hAnsi="var font-mono"/>
+          <w:color w:val="B80A18"/>
+          <w:sz w:val="24"/>
+          <w:szCs w:val="24"/>
+          <w:shd w:fill="auto" w:val="clear"/>
+        </w:rPr>
+        <w:t>"body"</w:t>
+      </w:r>
+      <w:r>
+        <w:rPr>
+          <w:rStyle w:val="SourceText"/>
+          <w:rFonts w:ascii="var font-mono" w:hAnsi="var font-mono"/>
+          <w:color w:val="14181F"/>
+          <w:sz w:val="24"/>
+          <w:szCs w:val="24"/>
+          <w:shd w:fill="auto" w:val="clear"/>
+        </w:rPr>
+        <w:t xml:space="preserve">: </w:t>
+      </w:r>
+      <w:r>
+        <w:rPr>
+          <w:rStyle w:val="SourceText"/>
+          <w:rFonts w:ascii="var font-mono" w:hAnsi="var font-mono"/>
+          <w:color w:val="008000"/>
+          <w:sz w:val="24"/>
+          <w:szCs w:val="24"/>
+          <w:shd w:fill="auto" w:val="clear"/>
+        </w:rPr>
+        <w:t>"Your Banff article here..."</w:t>
+      </w:r>
+    </w:p>
+    <w:p>
+      <w:pPr>
+        <w:pStyle w:val="PreformattedText"/>
+        <w:ind w:hanging="0" w:start="0" w:end="0"/>
+        <w:rPr>
+          <w:rFonts w:ascii="Times New Roman" w:hAnsi="Times New Roman" w:eastAsia="Arial" w:cs="Arial"/>
+          <w:color w:val="000000"/>
+          <w:sz w:val="24"/>
+          <w:szCs w:val="24"/>
+        </w:rPr>
+      </w:pPr>
+      <w:r>
+        <w:rPr>
+          <w:rStyle w:val="SourceText"/>
+          <w:rFonts w:ascii="Times New Roman" w:hAnsi="Times New Roman"/>
+          <w:color w:val="14181F"/>
+          <w:sz w:val="24"/>
+          <w:szCs w:val="24"/>
+          <w:shd w:fill="auto" w:val="clear"/>
+        </w:rPr>
+        <w:t xml:space="preserve">    </w:t>
+      </w:r>
+      <w:r>
+        <w:rPr>
+          <w:rStyle w:val="SourceText"/>
+          <w:rFonts w:ascii="var font-mono" w:hAnsi="var font-mono"/>
+          <w:color w:val="2B303B"/>
+          <w:sz w:val="24"/>
+          <w:szCs w:val="24"/>
+          <w:shd w:fill="auto" w:val="clear"/>
+        </w:rPr>
+        <w:t>}</w:t>
+      </w:r>
+    </w:p>
+    <w:p>
+      <w:pPr>
+        <w:pStyle w:val="PreformattedText"/>
+        <w:spacing w:before="0" w:after="283"/>
+        <w:ind w:hanging="0" w:start="0" w:end="0"/>
+        <w:rPr>
+          <w:rFonts w:ascii="Times New Roman" w:hAnsi="Times New Roman" w:eastAsia="Arial" w:cs="Arial"/>
+          <w:color w:val="000000"/>
+          <w:sz w:val="24"/>
+          <w:szCs w:val="24"/>
+        </w:rPr>
+      </w:pPr>
+      <w:r>
+        <w:rPr>
+          <w:rStyle w:val="SourceText"/>
+          <w:rFonts w:ascii="var font-mono" w:hAnsi="var font-mono"/>
+          <w:color w:val="2B303B"/>
+          <w:sz w:val="24"/>
+          <w:szCs w:val="24"/>
+          <w:shd w:fill="auto" w:val="clear"/>
+        </w:rPr>
+        <w:t>]</w:t>
+      </w:r>
+    </w:p>
+    <w:p>
+      <w:pPr>
+        <w:pStyle w:val="HorizontalLine"/>
+        <w:spacing w:before="0" w:after="0"/>
+        <w:rPr>
+          <w:rFonts w:ascii="Times New Roman" w:hAnsi="Times New Roman"/>
+          <w:color w:val="000000"/>
+          <w:sz w:val="24"/>
+          <w:szCs w:val="24"/>
+        </w:rPr>
+      </w:pPr>
+      <w:r>
+        <w:rPr>
+          <w:rFonts w:ascii="Times New Roman" w:hAnsi="Times New Roman"/>
+          <w:color w:val="000000"/>
+          <w:sz w:val="24"/>
+          <w:szCs w:val="24"/>
+        </w:rPr>
+      </w:r>
+    </w:p>
+    <w:p>
+      <w:pPr>
+        <w:pStyle w:val="BodyText"/>
+        <w:spacing w:lineRule="auto" w:line="240"/>
+        <w:rPr>
+          <w:rFonts w:ascii="Times New Roman" w:hAnsi="Times New Roman"/>
+          <w:color w:val="000000"/>
+        </w:rPr>
+      </w:pPr>
+      <w:r>
+        <w:rPr>
+          <w:rStyle w:val="Strong"/>
+          <w:rFonts w:ascii="Times New Roman" w:hAnsi="Times New Roman"/>
+          <w:color w:val="000000"/>
+        </w:rPr>
+        <w:t>The simple rule:</w:t>
+      </w:r>
+    </w:p>
+    <w:p>
+      <w:pPr>
+        <w:pStyle w:val="BodyText"/>
+        <w:numPr>
+          <w:ilvl w:val="0"/>
+          <w:numId w:val="9"/>
+        </w:numPr>
+        <w:tabs>
+          <w:tab w:val="clear" w:pos="720"/>
+          <w:tab w:val="left" w:pos="0" w:leader="none"/>
+        </w:tabs>
+        <w:spacing w:lineRule="auto" w:line="240" w:before="0" w:after="0"/>
+        <w:ind w:hanging="283" w:start="709"/>
+        <w:rPr>
+          <w:rFonts w:ascii="Times New Roman" w:hAnsi="Times New Roman"/>
+          <w:color w:val="000000"/>
+        </w:rPr>
+      </w:pPr>
+      <w:r>
+        <w:rPr>
+          <w:rFonts w:ascii="Times New Roman" w:hAnsi="Times New Roman"/>
+          <w:color w:val="000000"/>
+        </w:rPr>
+        <w:t xml:space="preserve">One </w:t>
+      </w:r>
+      <w:r>
+        <w:rPr>
+          <w:rStyle w:val="SourceText"/>
+          <w:rFonts w:ascii="Times New Roman" w:hAnsi="Times New Roman"/>
+          <w:color w:val="000000"/>
+        </w:rPr>
+        <w:t>blog_posts.json</w:t>
+      </w:r>
+      <w:r>
+        <w:rPr>
+          <w:rFonts w:ascii="Times New Roman" w:hAnsi="Times New Roman"/>
+          <w:color w:val="000000"/>
+        </w:rPr>
+        <w:t xml:space="preserve"> file — always </w:t>
+      </w:r>
+    </w:p>
+    <w:p>
+      <w:pPr>
+        <w:pStyle w:val="BodyText"/>
+        <w:numPr>
+          <w:ilvl w:val="0"/>
+          <w:numId w:val="9"/>
+        </w:numPr>
+        <w:tabs>
+          <w:tab w:val="clear" w:pos="720"/>
+          <w:tab w:val="left" w:pos="0" w:leader="none"/>
+        </w:tabs>
+        <w:spacing w:lineRule="auto" w:line="240" w:before="0" w:after="0"/>
+        <w:ind w:hanging="283" w:start="709"/>
+        <w:rPr>
+          <w:rFonts w:ascii="Times New Roman" w:hAnsi="Times New Roman"/>
+          <w:color w:val="000000"/>
+        </w:rPr>
+      </w:pPr>
+      <w:r>
+        <w:rPr>
+          <w:rFonts w:ascii="Times New Roman" w:hAnsi="Times New Roman"/>
+          <w:color w:val="000000"/>
+        </w:rPr>
+        <w:t xml:space="preserve">Each article is a </w:t>
+      </w:r>
+      <w:r>
+        <w:rPr>
+          <w:rStyle w:val="SourceText"/>
+          <w:rFonts w:ascii="Times New Roman" w:hAnsi="Times New Roman"/>
+          <w:color w:val="000000"/>
+        </w:rPr>
+        <w:t>{ }</w:t>
+      </w:r>
+      <w:r>
+        <w:rPr>
+          <w:rFonts w:ascii="Times New Roman" w:hAnsi="Times New Roman"/>
+          <w:color w:val="000000"/>
+        </w:rPr>
+        <w:t xml:space="preserve"> block inside the </w:t>
+      </w:r>
+      <w:r>
+        <w:rPr>
+          <w:rStyle w:val="SourceText"/>
+          <w:rFonts w:ascii="Times New Roman" w:hAnsi="Times New Roman"/>
+          <w:color w:val="000000"/>
+        </w:rPr>
+        <w:t>[ ]</w:t>
+      </w:r>
+      <w:r>
+        <w:rPr>
+          <w:rFonts w:ascii="Times New Roman" w:hAnsi="Times New Roman"/>
+          <w:color w:val="000000"/>
+        </w:rPr>
+        <w:t xml:space="preserve"> </w:t>
+      </w:r>
+    </w:p>
+    <w:p>
+      <w:pPr>
+        <w:pStyle w:val="BodyText"/>
+        <w:numPr>
+          <w:ilvl w:val="0"/>
+          <w:numId w:val="9"/>
+        </w:numPr>
+        <w:tabs>
+          <w:tab w:val="clear" w:pos="720"/>
+          <w:tab w:val="left" w:pos="0" w:leader="none"/>
+        </w:tabs>
+        <w:spacing w:lineRule="auto" w:line="240" w:before="0" w:after="0"/>
+        <w:ind w:hanging="283" w:start="709"/>
+        <w:rPr>
+          <w:rFonts w:ascii="Times New Roman" w:hAnsi="Times New Roman"/>
+          <w:color w:val="000000"/>
+        </w:rPr>
+      </w:pPr>
+      <w:r>
+        <w:rPr>
+          <w:rFonts w:ascii="Times New Roman" w:hAnsi="Times New Roman"/>
+          <w:color w:val="000000"/>
+        </w:rPr>
+        <w:t xml:space="preserve">Separate each article block with a comma </w:t>
+      </w:r>
+    </w:p>
+    <w:p>
+      <w:pPr>
+        <w:pStyle w:val="BodyText"/>
+        <w:numPr>
+          <w:ilvl w:val="0"/>
+          <w:numId w:val="9"/>
+        </w:numPr>
+        <w:tabs>
+          <w:tab w:val="clear" w:pos="720"/>
+          <w:tab w:val="left" w:pos="0" w:leader="none"/>
+        </w:tabs>
+        <w:spacing w:lineRule="auto" w:line="240"/>
+        <w:ind w:hanging="283" w:start="709"/>
+        <w:rPr>
+          <w:rFonts w:ascii="Times New Roman" w:hAnsi="Times New Roman"/>
+          <w:color w:val="000000"/>
+        </w:rPr>
+      </w:pPr>
+      <w:r>
+        <w:rPr>
+          <w:rFonts w:ascii="Times New Roman" w:hAnsi="Times New Roman"/>
+          <w:color w:val="000000"/>
+        </w:rPr>
+        <w:t xml:space="preserve">The last article has </w:t>
+      </w:r>
+      <w:r>
+        <w:rPr>
+          <w:rStyle w:val="Strong"/>
+          <w:rFonts w:ascii="Times New Roman" w:hAnsi="Times New Roman"/>
+          <w:color w:val="000000"/>
+        </w:rPr>
+        <w:t>no comma</w:t>
+      </w:r>
+      <w:r>
+        <w:rPr>
+          <w:rFonts w:ascii="Times New Roman" w:hAnsi="Times New Roman"/>
+          <w:color w:val="000000"/>
+        </w:rPr>
+        <w:t xml:space="preserve"> after its </w:t>
+      </w:r>
+      <w:r>
+        <w:rPr>
+          <w:rStyle w:val="SourceText"/>
+          <w:rFonts w:ascii="Times New Roman" w:hAnsi="Times New Roman"/>
+          <w:color w:val="000000"/>
+        </w:rPr>
+        <w:t>}</w:t>
+      </w:r>
+      <w:r>
+        <w:rPr>
+          <w:rFonts w:ascii="Times New Roman" w:hAnsi="Times New Roman"/>
+          <w:color w:val="000000"/>
+        </w:rPr>
+        <w:t xml:space="preserve"> </w:t>
+      </w:r>
+    </w:p>
+    <w:p>
+      <w:pPr>
+        <w:pStyle w:val="HorizontalLine"/>
+        <w:spacing w:before="0" w:after="0"/>
+        <w:rPr>
+          <w:rFonts w:ascii="Times New Roman" w:hAnsi="Times New Roman"/>
+          <w:color w:val="000000"/>
+          <w:sz w:val="24"/>
+          <w:szCs w:val="24"/>
+        </w:rPr>
+      </w:pPr>
+      <w:r>
+        <w:rPr>
+          <w:rFonts w:ascii="Times New Roman" w:hAnsi="Times New Roman"/>
+          <w:color w:val="000000"/>
+          <w:sz w:val="24"/>
+          <w:szCs w:val="24"/>
+        </w:rPr>
+      </w:r>
+    </w:p>
+    <w:p>
+      <w:pPr>
+        <w:pStyle w:val="BodyText"/>
+        <w:spacing w:lineRule="auto" w:line="240"/>
+        <w:rPr>
+          <w:rFonts w:ascii="Times New Roman" w:hAnsi="Times New Roman"/>
+          <w:color w:val="000000"/>
+        </w:rPr>
+      </w:pPr>
+      <w:r>
+        <w:rPr>
+          <w:rStyle w:val="Strong"/>
+          <w:rFonts w:ascii="Times New Roman" w:hAnsi="Times New Roman"/>
+          <w:color w:val="000000"/>
+        </w:rPr>
+        <w:t>Your workflow each time you write a new article:</w:t>
+      </w:r>
+    </w:p>
+    <w:p>
+      <w:pPr>
+        <w:pStyle w:val="BodyText"/>
+        <w:numPr>
+          <w:ilvl w:val="0"/>
+          <w:numId w:val="10"/>
+        </w:numPr>
+        <w:tabs>
+          <w:tab w:val="clear" w:pos="720"/>
+          <w:tab w:val="left" w:pos="0" w:leader="none"/>
+        </w:tabs>
+        <w:spacing w:lineRule="auto" w:line="240" w:before="0" w:after="0"/>
+        <w:ind w:hanging="283" w:start="709"/>
+        <w:rPr>
+          <w:rFonts w:ascii="Times New Roman" w:hAnsi="Times New Roman"/>
+          <w:color w:val="000000"/>
+        </w:rPr>
+      </w:pPr>
+      <w:r>
+        <w:rPr>
+          <w:rFonts w:ascii="Times New Roman" w:hAnsi="Times New Roman"/>
+          <w:color w:val="000000"/>
+        </w:rPr>
+        <w:t xml:space="preserve">Open </w:t>
+      </w:r>
+      <w:r>
+        <w:rPr>
+          <w:rStyle w:val="SourceText"/>
+          <w:rFonts w:ascii="Times New Roman" w:hAnsi="Times New Roman"/>
+          <w:color w:val="000000"/>
+        </w:rPr>
+        <w:t>blog_posts.json</w:t>
+      </w:r>
+      <w:r>
+        <w:rPr>
+          <w:rFonts w:ascii="Times New Roman" w:hAnsi="Times New Roman"/>
+          <w:color w:val="000000"/>
+        </w:rPr>
+        <w:t xml:space="preserve"> </w:t>
+      </w:r>
+    </w:p>
+    <w:p>
+      <w:pPr>
+        <w:pStyle w:val="BodyText"/>
+        <w:numPr>
+          <w:ilvl w:val="0"/>
+          <w:numId w:val="10"/>
+        </w:numPr>
+        <w:tabs>
+          <w:tab w:val="clear" w:pos="720"/>
+          <w:tab w:val="left" w:pos="0" w:leader="none"/>
+        </w:tabs>
+        <w:spacing w:lineRule="auto" w:line="240" w:before="0" w:after="0"/>
+        <w:ind w:hanging="283" w:start="709"/>
+        <w:rPr>
+          <w:rFonts w:ascii="Times New Roman" w:hAnsi="Times New Roman"/>
+          <w:color w:val="000000"/>
+        </w:rPr>
+      </w:pPr>
+      <w:r>
+        <w:rPr>
+          <w:rFonts w:ascii="Times New Roman" w:hAnsi="Times New Roman"/>
+          <w:color w:val="000000"/>
+        </w:rPr>
+        <w:t xml:space="preserve">Add a new </w:t>
+      </w:r>
+      <w:r>
+        <w:rPr>
+          <w:rStyle w:val="SourceText"/>
+          <w:rFonts w:ascii="Times New Roman" w:hAnsi="Times New Roman"/>
+          <w:color w:val="000000"/>
+        </w:rPr>
+        <w:t>{ }</w:t>
+      </w:r>
+      <w:r>
+        <w:rPr>
+          <w:rFonts w:ascii="Times New Roman" w:hAnsi="Times New Roman"/>
+          <w:color w:val="000000"/>
+        </w:rPr>
+        <w:t xml:space="preserve"> block before the final </w:t>
+      </w:r>
+      <w:r>
+        <w:rPr>
+          <w:rStyle w:val="SourceText"/>
+          <w:rFonts w:ascii="Times New Roman" w:hAnsi="Times New Roman"/>
+          <w:color w:val="000000"/>
+        </w:rPr>
+        <w:t>]</w:t>
+      </w:r>
+      <w:r>
+        <w:rPr>
+          <w:rFonts w:ascii="Times New Roman" w:hAnsi="Times New Roman"/>
+          <w:color w:val="000000"/>
+        </w:rPr>
+        <w:t xml:space="preserve"> </w:t>
+      </w:r>
+    </w:p>
+    <w:p>
+      <w:pPr>
+        <w:pStyle w:val="BodyText"/>
+        <w:numPr>
+          <w:ilvl w:val="0"/>
+          <w:numId w:val="10"/>
+        </w:numPr>
+        <w:tabs>
+          <w:tab w:val="clear" w:pos="720"/>
+          <w:tab w:val="left" w:pos="0" w:leader="none"/>
+        </w:tabs>
+        <w:spacing w:lineRule="auto" w:line="240" w:before="0" w:after="0"/>
+        <w:ind w:hanging="283" w:start="709"/>
+        <w:rPr>
+          <w:rFonts w:ascii="Times New Roman" w:hAnsi="Times New Roman"/>
+          <w:color w:val="000000"/>
+        </w:rPr>
+      </w:pPr>
+      <w:r>
+        <w:rPr>
+          <w:rFonts w:ascii="Times New Roman" w:hAnsi="Times New Roman"/>
+          <w:color w:val="000000"/>
+        </w:rPr>
+        <w:t xml:space="preserve">Remember the comma after the previous article's </w:t>
+      </w:r>
+      <w:r>
+        <w:rPr>
+          <w:rStyle w:val="SourceText"/>
+          <w:rFonts w:ascii="Times New Roman" w:hAnsi="Times New Roman"/>
+          <w:color w:val="000000"/>
+        </w:rPr>
+        <w:t>}</w:t>
+      </w:r>
+      <w:r>
+        <w:rPr>
+          <w:rFonts w:ascii="Times New Roman" w:hAnsi="Times New Roman"/>
+          <w:color w:val="000000"/>
+        </w:rPr>
+        <w:t xml:space="preserve"> </w:t>
+      </w:r>
+    </w:p>
+    <w:p>
+      <w:pPr>
+        <w:pStyle w:val="BodyText"/>
+        <w:numPr>
+          <w:ilvl w:val="0"/>
+          <w:numId w:val="10"/>
+        </w:numPr>
+        <w:tabs>
+          <w:tab w:val="clear" w:pos="720"/>
+          <w:tab w:val="left" w:pos="0" w:leader="none"/>
+        </w:tabs>
+        <w:spacing w:lineRule="auto" w:line="240"/>
+        <w:ind w:hanging="283" w:start="709"/>
+        <w:rPr>
+          <w:rFonts w:ascii="Times New Roman" w:hAnsi="Times New Roman"/>
+          <w:color w:val="000000"/>
+        </w:rPr>
+      </w:pPr>
+      <w:r>
+        <w:rPr>
+          <w:rFonts w:ascii="Times New Roman" w:hAnsi="Times New Roman"/>
+          <w:color w:val="000000"/>
+        </w:rPr>
+        <w:t xml:space="preserve">Run </w:t>
+      </w:r>
+      <w:r>
+        <w:rPr>
+          <w:rStyle w:val="SourceText"/>
+          <w:rFonts w:ascii="Times New Roman" w:hAnsi="Times New Roman"/>
+          <w:color w:val="000000"/>
+        </w:rPr>
+        <w:t>Claude_mohangraphy.py</w:t>
+      </w:r>
+      <w:r>
+        <w:rPr>
+          <w:rFonts w:ascii="Times New Roman" w:hAnsi="Times New Roman"/>
+          <w:color w:val="000000"/>
+        </w:rPr>
+        <w:t xml:space="preserve"> to publish </w:t>
+      </w:r>
+    </w:p>
+    <w:p>
+      <w:pPr>
+        <w:pStyle w:val="BodyText"/>
+        <w:spacing w:lineRule="auto" w:line="240"/>
+        <w:rPr>
+          <w:rFonts w:ascii="Times New Roman" w:hAnsi="Times New Roman"/>
+          <w:color w:val="000000"/>
+        </w:rPr>
+      </w:pPr>
+      <w:r>
+        <w:rPr>
+          <w:rFonts w:ascii="Times New Roman" w:hAnsi="Times New Roman"/>
+          <w:color w:val="000000"/>
+        </w:rPr>
+        <w:t>That's it — one file, all articles, forever.</w:t>
+      </w:r>
+    </w:p>
+    <w:p>
+      <w:pPr>
+        <w:pStyle w:val="Normal"/>
+        <w:spacing w:lineRule="auto" w:line="240" w:before="0" w:after="0"/>
+        <w:rPr>
+          <w:rFonts w:ascii="Times New Roman" w:hAnsi="Times New Roman"/>
+          <w:color w:val="000000"/>
+        </w:rPr>
+      </w:pPr>
+      <w:r>
+        <w:rPr>
+          <w:rFonts w:ascii="Times New Roman" w:hAnsi="Times New Roman"/>
+          <w:color w:val="000000"/>
+        </w:rPr>
+      </w:r>
+    </w:p>
+    <w:p>
+      <w:pPr>
+        <w:pStyle w:val="BodyText"/>
+        <w:spacing w:lineRule="auto" w:line="240" w:before="0" w:after="0"/>
+        <w:rPr>
+          <w:rFonts w:ascii="Times New Roman" w:hAnsi="Times New Roman"/>
+          <w:color w:val="000000"/>
+        </w:rPr>
+      </w:pPr>
+      <w:r>
+        <w:rPr>
+          <w:rFonts w:ascii="Times New Roman" w:hAnsi="Times New Roman"/>
+          <w:color w:val="000000"/>
+        </w:rPr>
+        <w:t xml:space="preserve">Or simply run </w:t>
+      </w:r>
+      <w:r>
+        <w:rPr>
+          <w:rStyle w:val="SourceText"/>
+          <w:rFonts w:ascii="Times New Roman" w:hAnsi="Times New Roman"/>
+          <w:color w:val="000000"/>
+        </w:rPr>
+        <w:t>blog_editor.py</w:t>
+      </w:r>
+      <w:r>
+        <w:rPr>
+          <w:rFonts w:ascii="Times New Roman" w:hAnsi="Times New Roman"/>
+          <w:color w:val="000000"/>
+        </w:rPr>
+        <w:t xml:space="preserve"> and paste your article into the dialog — it handles the encoding automatically.</w:t>
+      </w:r>
+    </w:p>
+    <w:p>
+      <w:pPr>
+        <w:pStyle w:val="Normal"/>
+        <w:spacing w:lineRule="auto" w:line="240" w:before="0" w:after="0"/>
+        <w:rPr>
+          <w:rFonts w:ascii="Times New Roman" w:hAnsi="Times New Roman"/>
+          <w:color w:val="000000"/>
+        </w:rPr>
+      </w:pPr>
+      <w:r>
+        <w:rPr>
+          <w:rFonts w:ascii="Times New Roman" w:hAnsi="Times New Roman"/>
+          <w:color w:val="000000"/>
+        </w:rPr>
+      </w:r>
+    </w:p>
+    <w:p>
+      <w:pPr>
+        <w:pStyle w:val="Normal"/>
+        <w:spacing w:lineRule="auto" w:line="240" w:before="0" w:after="0"/>
+        <w:rPr>
+          <w:rFonts w:ascii="Times New Roman" w:hAnsi="Times New Roman"/>
+          <w:color w:val="000000"/>
+        </w:rPr>
+      </w:pPr>
+      <w:r>
+        <w:rPr>
+          <w:rFonts w:ascii="Times New Roman" w:hAnsi="Times New Roman"/>
+          <w:color w:val="000000"/>
+        </w:rPr>
+        <w:t>cp ~/Downloads/Claude_mohangraphy.py /Users/ncm/Pictures/Mohangraphy/Scripts/</w:t>
+      </w:r>
+    </w:p>
+    <w:p>
+      <w:pPr>
+        <w:pStyle w:val="Normal"/>
+        <w:spacing w:lineRule="auto" w:line="240" w:before="0" w:after="0"/>
+        <w:rPr>
+          <w:rFonts w:ascii="Times New Roman" w:hAnsi="Times New Roman"/>
+          <w:color w:val="000000"/>
+        </w:rPr>
+      </w:pPr>
+      <w:r>
+        <w:rPr>
+          <w:rFonts w:ascii="Times New Roman" w:hAnsi="Times New Roman"/>
+          <w:color w:val="000000"/>
+        </w:rPr>
+        <w:t>cp ~/Downloads/blog_posts.json /Users/ncm/Pictures/Mohangraphy/Scripts/</w:t>
+      </w:r>
+    </w:p>
+    <w:p>
+      <w:pPr>
+        <w:pStyle w:val="Normal"/>
+        <w:spacing w:lineRule="auto" w:line="240" w:before="0" w:after="0"/>
+        <w:rPr>
+          <w:rFonts w:ascii="Times New Roman" w:hAnsi="Times New Roman"/>
+          <w:color w:val="000000"/>
+        </w:rPr>
+      </w:pPr>
+      <w:r>
+        <w:rPr>
+          <w:rFonts w:ascii="Times New Roman" w:hAnsi="Times New Roman"/>
+          <w:color w:val="000000"/>
+        </w:rPr>
+        <w:t>python3 /Users/ncm/Pictures/Mohangraphy/Scripts/Claude_mohangraphy.py</w:t>
       </w:r>
     </w:p>
     <w:sectPr>
@@ -13830,7 +16464,7 @@
         <w:sz w:val="20"/>
         <w:szCs w:val="20"/>
       </w:rPr>
-      <w:t>11</w:t>
+      <w:t>13</w:t>
     </w:r>
     <w:r>
       <w:rPr>
@@ -13958,7 +16592,7 @@
         <w:sz w:val="20"/>
         <w:szCs w:val="20"/>
       </w:rPr>
-      <w:t>11</w:t>
+      <w:t>13</w:t>
     </w:r>
     <w:r>
       <w:rPr>
@@ -15080,6 +17714,399 @@
   <w:abstractNum w:abstractNumId="9">
     <w:lvl w:ilvl="0">
       <w:start w:val="1"/>
+      <w:numFmt w:val="bullet"/>
+      <w:lvlText w:val=""/>
+      <w:lvlJc w:val="start"/>
+      <w:pPr>
+        <w:tabs>
+          <w:tab w:val="num" w:pos="709"/>
+        </w:tabs>
+        <w:ind w:start="709" w:hanging="283"/>
+      </w:pPr>
+      <w:rPr>
+        <w:rFonts w:ascii="Symbol" w:hAnsi="Symbol" w:cs="Symbol" w:hint="default"/>
+      </w:rPr>
+    </w:lvl>
+    <w:lvl w:ilvl="1">
+      <w:start w:val="1"/>
+      <w:numFmt w:val="bullet"/>
+      <w:lvlText w:val=""/>
+      <w:lvlJc w:val="start"/>
+      <w:pPr>
+        <w:tabs>
+          <w:tab w:val="num" w:pos="1418"/>
+        </w:tabs>
+        <w:ind w:start="1418" w:hanging="283"/>
+      </w:pPr>
+      <w:rPr>
+        <w:rFonts w:ascii="Symbol" w:hAnsi="Symbol" w:cs="Symbol" w:hint="default"/>
+      </w:rPr>
+    </w:lvl>
+    <w:lvl w:ilvl="2">
+      <w:start w:val="1"/>
+      <w:numFmt w:val="bullet"/>
+      <w:lvlText w:val=""/>
+      <w:lvlJc w:val="start"/>
+      <w:pPr>
+        <w:tabs>
+          <w:tab w:val="num" w:pos="2127"/>
+        </w:tabs>
+        <w:ind w:start="2127" w:hanging="283"/>
+      </w:pPr>
+      <w:rPr>
+        <w:rFonts w:ascii="Symbol" w:hAnsi="Symbol" w:cs="Symbol" w:hint="default"/>
+      </w:rPr>
+    </w:lvl>
+    <w:lvl w:ilvl="3">
+      <w:start w:val="1"/>
+      <w:numFmt w:val="bullet"/>
+      <w:lvlText w:val=""/>
+      <w:lvlJc w:val="start"/>
+      <w:pPr>
+        <w:tabs>
+          <w:tab w:val="num" w:pos="2836"/>
+        </w:tabs>
+        <w:ind w:start="2836" w:hanging="283"/>
+      </w:pPr>
+      <w:rPr>
+        <w:rFonts w:ascii="Symbol" w:hAnsi="Symbol" w:cs="Symbol" w:hint="default"/>
+      </w:rPr>
+    </w:lvl>
+    <w:lvl w:ilvl="4">
+      <w:start w:val="1"/>
+      <w:numFmt w:val="bullet"/>
+      <w:lvlText w:val=""/>
+      <w:lvlJc w:val="start"/>
+      <w:pPr>
+        <w:tabs>
+          <w:tab w:val="num" w:pos="3545"/>
+        </w:tabs>
+        <w:ind w:start="3545" w:hanging="283"/>
+      </w:pPr>
+      <w:rPr>
+        <w:rFonts w:ascii="Symbol" w:hAnsi="Symbol" w:cs="Symbol" w:hint="default"/>
+      </w:rPr>
+    </w:lvl>
+    <w:lvl w:ilvl="5">
+      <w:start w:val="1"/>
+      <w:numFmt w:val="bullet"/>
+      <w:lvlText w:val=""/>
+      <w:lvlJc w:val="start"/>
+      <w:pPr>
+        <w:tabs>
+          <w:tab w:val="num" w:pos="4254"/>
+        </w:tabs>
+        <w:ind w:start="4254" w:hanging="283"/>
+      </w:pPr>
+      <w:rPr>
+        <w:rFonts w:ascii="Symbol" w:hAnsi="Symbol" w:cs="Symbol" w:hint="default"/>
+      </w:rPr>
+    </w:lvl>
+    <w:lvl w:ilvl="6">
+      <w:start w:val="1"/>
+      <w:numFmt w:val="bullet"/>
+      <w:lvlText w:val=""/>
+      <w:lvlJc w:val="start"/>
+      <w:pPr>
+        <w:tabs>
+          <w:tab w:val="num" w:pos="4963"/>
+        </w:tabs>
+        <w:ind w:start="4963" w:hanging="283"/>
+      </w:pPr>
+      <w:rPr>
+        <w:rFonts w:ascii="Symbol" w:hAnsi="Symbol" w:cs="Symbol" w:hint="default"/>
+      </w:rPr>
+    </w:lvl>
+    <w:lvl w:ilvl="7">
+      <w:start w:val="1"/>
+      <w:numFmt w:val="bullet"/>
+      <w:lvlText w:val=""/>
+      <w:lvlJc w:val="start"/>
+      <w:pPr>
+        <w:tabs>
+          <w:tab w:val="num" w:pos="5672"/>
+        </w:tabs>
+        <w:ind w:start="5672" w:hanging="283"/>
+      </w:pPr>
+      <w:rPr>
+        <w:rFonts w:ascii="Symbol" w:hAnsi="Symbol" w:cs="Symbol" w:hint="default"/>
+      </w:rPr>
+    </w:lvl>
+    <w:lvl w:ilvl="8">
+      <w:start w:val="1"/>
+      <w:numFmt w:val="bullet"/>
+      <w:lvlText w:val=""/>
+      <w:lvlJc w:val="start"/>
+      <w:pPr>
+        <w:tabs>
+          <w:tab w:val="num" w:pos="6381"/>
+        </w:tabs>
+        <w:ind w:start="6381" w:hanging="283"/>
+      </w:pPr>
+      <w:rPr>
+        <w:rFonts w:ascii="Symbol" w:hAnsi="Symbol" w:cs="Symbol" w:hint="default"/>
+      </w:rPr>
+    </w:lvl>
+  </w:abstractNum>
+  <w:abstractNum w:abstractNumId="10">
+    <w:lvl w:ilvl="0">
+      <w:start w:val="1"/>
+      <w:numFmt w:val="decimal"/>
+      <w:lvlText w:val="%1."/>
+      <w:lvlJc w:val="start"/>
+      <w:pPr>
+        <w:tabs>
+          <w:tab w:val="num" w:pos="709"/>
+        </w:tabs>
+        <w:ind w:start="709" w:hanging="283"/>
+      </w:pPr>
+      <w:rPr/>
+    </w:lvl>
+    <w:lvl w:ilvl="1">
+      <w:start w:val="1"/>
+      <w:numFmt w:val="decimal"/>
+      <w:lvlText w:val="%2."/>
+      <w:lvlJc w:val="start"/>
+      <w:pPr>
+        <w:tabs>
+          <w:tab w:val="num" w:pos="1418"/>
+        </w:tabs>
+        <w:ind w:start="1418" w:hanging="283"/>
+      </w:pPr>
+      <w:rPr/>
+    </w:lvl>
+    <w:lvl w:ilvl="2">
+      <w:start w:val="1"/>
+      <w:numFmt w:val="decimal"/>
+      <w:lvlText w:val="%3."/>
+      <w:lvlJc w:val="start"/>
+      <w:pPr>
+        <w:tabs>
+          <w:tab w:val="num" w:pos="2127"/>
+        </w:tabs>
+        <w:ind w:start="2127" w:hanging="283"/>
+      </w:pPr>
+      <w:rPr/>
+    </w:lvl>
+    <w:lvl w:ilvl="3">
+      <w:start w:val="1"/>
+      <w:numFmt w:val="decimal"/>
+      <w:lvlText w:val="%4."/>
+      <w:lvlJc w:val="start"/>
+      <w:pPr>
+        <w:tabs>
+          <w:tab w:val="num" w:pos="2836"/>
+        </w:tabs>
+        <w:ind w:start="2836" w:hanging="283"/>
+      </w:pPr>
+      <w:rPr/>
+    </w:lvl>
+    <w:lvl w:ilvl="4">
+      <w:start w:val="1"/>
+      <w:numFmt w:val="decimal"/>
+      <w:lvlText w:val="%5."/>
+      <w:lvlJc w:val="start"/>
+      <w:pPr>
+        <w:tabs>
+          <w:tab w:val="num" w:pos="3545"/>
+        </w:tabs>
+        <w:ind w:start="3545" w:hanging="283"/>
+      </w:pPr>
+      <w:rPr/>
+    </w:lvl>
+    <w:lvl w:ilvl="5">
+      <w:start w:val="1"/>
+      <w:numFmt w:val="decimal"/>
+      <w:lvlText w:val="%6."/>
+      <w:lvlJc w:val="start"/>
+      <w:pPr>
+        <w:tabs>
+          <w:tab w:val="num" w:pos="4254"/>
+        </w:tabs>
+        <w:ind w:start="4254" w:hanging="283"/>
+      </w:pPr>
+      <w:rPr/>
+    </w:lvl>
+    <w:lvl w:ilvl="6">
+      <w:start w:val="1"/>
+      <w:numFmt w:val="decimal"/>
+      <w:lvlText w:val="%7."/>
+      <w:lvlJc w:val="start"/>
+      <w:pPr>
+        <w:tabs>
+          <w:tab w:val="num" w:pos="4963"/>
+        </w:tabs>
+        <w:ind w:start="4963" w:hanging="283"/>
+      </w:pPr>
+      <w:rPr/>
+    </w:lvl>
+    <w:lvl w:ilvl="7">
+      <w:start w:val="1"/>
+      <w:numFmt w:val="decimal"/>
+      <w:lvlText w:val="%8."/>
+      <w:lvlJc w:val="start"/>
+      <w:pPr>
+        <w:tabs>
+          <w:tab w:val="num" w:pos="5672"/>
+        </w:tabs>
+        <w:ind w:start="5672" w:hanging="283"/>
+      </w:pPr>
+      <w:rPr/>
+    </w:lvl>
+    <w:lvl w:ilvl="8">
+      <w:start w:val="1"/>
+      <w:numFmt w:val="decimal"/>
+      <w:lvlText w:val="%9."/>
+      <w:lvlJc w:val="start"/>
+      <w:pPr>
+        <w:tabs>
+          <w:tab w:val="num" w:pos="6381"/>
+        </w:tabs>
+        <w:ind w:start="6381" w:hanging="283"/>
+      </w:pPr>
+      <w:rPr/>
+    </w:lvl>
+  </w:abstractNum>
+  <w:abstractNum w:abstractNumId="11">
+    <w:lvl w:ilvl="0">
+      <w:start w:val="1"/>
+      <w:numFmt w:val="bullet"/>
+      <w:lvlText w:val=""/>
+      <w:lvlJc w:val="start"/>
+      <w:pPr>
+        <w:tabs>
+          <w:tab w:val="num" w:pos="709"/>
+        </w:tabs>
+        <w:ind w:start="709" w:hanging="283"/>
+      </w:pPr>
+      <w:rPr>
+        <w:rFonts w:ascii="Symbol" w:hAnsi="Symbol" w:cs="Symbol" w:hint="default"/>
+      </w:rPr>
+    </w:lvl>
+    <w:lvl w:ilvl="1">
+      <w:start w:val="1"/>
+      <w:numFmt w:val="bullet"/>
+      <w:lvlText w:val=""/>
+      <w:lvlJc w:val="start"/>
+      <w:pPr>
+        <w:tabs>
+          <w:tab w:val="num" w:pos="1418"/>
+        </w:tabs>
+        <w:ind w:start="1418" w:hanging="283"/>
+      </w:pPr>
+      <w:rPr>
+        <w:rFonts w:ascii="Symbol" w:hAnsi="Symbol" w:cs="Symbol" w:hint="default"/>
+      </w:rPr>
+    </w:lvl>
+    <w:lvl w:ilvl="2">
+      <w:start w:val="1"/>
+      <w:numFmt w:val="bullet"/>
+      <w:lvlText w:val=""/>
+      <w:lvlJc w:val="start"/>
+      <w:pPr>
+        <w:tabs>
+          <w:tab w:val="num" w:pos="2127"/>
+        </w:tabs>
+        <w:ind w:start="2127" w:hanging="283"/>
+      </w:pPr>
+      <w:rPr>
+        <w:rFonts w:ascii="Symbol" w:hAnsi="Symbol" w:cs="Symbol" w:hint="default"/>
+      </w:rPr>
+    </w:lvl>
+    <w:lvl w:ilvl="3">
+      <w:start w:val="1"/>
+      <w:numFmt w:val="bullet"/>
+      <w:lvlText w:val=""/>
+      <w:lvlJc w:val="start"/>
+      <w:pPr>
+        <w:tabs>
+          <w:tab w:val="num" w:pos="2836"/>
+        </w:tabs>
+        <w:ind w:start="2836" w:hanging="283"/>
+      </w:pPr>
+      <w:rPr>
+        <w:rFonts w:ascii="Symbol" w:hAnsi="Symbol" w:cs="Symbol" w:hint="default"/>
+      </w:rPr>
+    </w:lvl>
+    <w:lvl w:ilvl="4">
+      <w:start w:val="1"/>
+      <w:numFmt w:val="bullet"/>
+      <w:lvlText w:val=""/>
+      <w:lvlJc w:val="start"/>
+      <w:pPr>
+        <w:tabs>
+          <w:tab w:val="num" w:pos="3545"/>
+        </w:tabs>
+        <w:ind w:start="3545" w:hanging="283"/>
+      </w:pPr>
+      <w:rPr>
+        <w:rFonts w:ascii="Symbol" w:hAnsi="Symbol" w:cs="Symbol" w:hint="default"/>
+      </w:rPr>
+    </w:lvl>
+    <w:lvl w:ilvl="5">
+      <w:start w:val="1"/>
+      <w:numFmt w:val="bullet"/>
+      <w:lvlText w:val=""/>
+      <w:lvlJc w:val="start"/>
+      <w:pPr>
+        <w:tabs>
+          <w:tab w:val="num" w:pos="4254"/>
+        </w:tabs>
+        <w:ind w:start="4254" w:hanging="283"/>
+      </w:pPr>
+      <w:rPr>
+        <w:rFonts w:ascii="Symbol" w:hAnsi="Symbol" w:cs="Symbol" w:hint="default"/>
+      </w:rPr>
+    </w:lvl>
+    <w:lvl w:ilvl="6">
+      <w:start w:val="1"/>
+      <w:numFmt w:val="bullet"/>
+      <w:lvlText w:val=""/>
+      <w:lvlJc w:val="start"/>
+      <w:pPr>
+        <w:tabs>
+          <w:tab w:val="num" w:pos="4963"/>
+        </w:tabs>
+        <w:ind w:start="4963" w:hanging="283"/>
+      </w:pPr>
+      <w:rPr>
+        <w:rFonts w:ascii="Symbol" w:hAnsi="Symbol" w:cs="Symbol" w:hint="default"/>
+      </w:rPr>
+    </w:lvl>
+    <w:lvl w:ilvl="7">
+      <w:start w:val="1"/>
+      <w:numFmt w:val="bullet"/>
+      <w:lvlText w:val=""/>
+      <w:lvlJc w:val="start"/>
+      <w:pPr>
+        <w:tabs>
+          <w:tab w:val="num" w:pos="5672"/>
+        </w:tabs>
+        <w:ind w:start="5672" w:hanging="283"/>
+      </w:pPr>
+      <w:rPr>
+        <w:rFonts w:ascii="Symbol" w:hAnsi="Symbol" w:cs="Symbol" w:hint="default"/>
+      </w:rPr>
+    </w:lvl>
+    <w:lvl w:ilvl="8">
+      <w:start w:val="1"/>
+      <w:numFmt w:val="bullet"/>
+      <w:lvlText w:val=""/>
+      <w:lvlJc w:val="start"/>
+      <w:pPr>
+        <w:tabs>
+          <w:tab w:val="num" w:pos="6381"/>
+        </w:tabs>
+        <w:ind w:start="6381" w:hanging="283"/>
+      </w:pPr>
+      <w:rPr>
+        <w:rFonts w:ascii="Symbol" w:hAnsi="Symbol" w:cs="Symbol" w:hint="default"/>
+      </w:rPr>
+    </w:lvl>
+  </w:abstractNum>
+  <w:abstractNum w:abstractNumId="12">
+    <w:lvl w:ilvl="0">
+      <w:start w:val="1"/>
       <w:numFmt w:val="none"/>
       <w:suff w:val="nothing"/>
       <w:lvlText w:val=""/>
@@ -15224,6 +18251,15 @@
     <w:abstractNumId w:val="9"/>
   </w:num>
   <w:num w:numId="10">
+    <w:abstractNumId w:val="10"/>
+  </w:num>
+  <w:num w:numId="11">
+    <w:abstractNumId w:val="11"/>
+  </w:num>
+  <w:num w:numId="12">
+    <w:abstractNumId w:val="12"/>
+  </w:num>
+  <w:num w:numId="13">
     <w:abstractNumId w:val="2"/>
     <w:lvlOverride w:ilvl="0">
       <w:startOverride w:val="1"/>

</xml_diff>

<commit_message>
Deploy 2026-04-04 17:01 — 240 file(s) updated
</commit_message>
<xml_diff>
--- a/Mohangraphy_Technical_Documentation.docx
+++ b/Mohangraphy_Technical_Documentation.docx
@@ -4593,7 +4593,7 @@
         <w:pStyle w:val="ListParagraph"/>
         <w:numPr>
           <w:ilvl w:val="0"/>
-          <w:numId w:val="13"/>
+          <w:numId w:val="14"/>
         </w:numPr>
         <w:spacing w:lineRule="auto" w:line="240" w:before="0" w:after="0"/>
         <w:rPr>
@@ -16316,6 +16316,1532 @@
           <w:color w:val="000000"/>
         </w:rPr>
         <w:t>python3 /Users/ncm/Pictures/Mohangraphy/Scripts/Claude_mohangraphy.py</w:t>
+      </w:r>
+    </w:p>
+    <w:p>
+      <w:pPr>
+        <w:pStyle w:val="Normal"/>
+        <w:spacing w:lineRule="auto" w:line="240" w:before="0" w:after="0"/>
+        <w:rPr>
+          <w:rFonts w:ascii="Times New Roman" w:hAnsi="Times New Roman"/>
+          <w:color w:val="000000"/>
+        </w:rPr>
+      </w:pPr>
+      <w:r>
+        <w:rPr>
+          <w:rFonts w:ascii="Times New Roman" w:hAnsi="Times New Roman"/>
+          <w:color w:val="000000"/>
+        </w:rPr>
+      </w:r>
+    </w:p>
+    <w:p>
+      <w:pPr>
+        <w:pStyle w:val="Normal"/>
+        <w:spacing w:lineRule="auto" w:line="240" w:before="0" w:after="0"/>
+        <w:rPr>
+          <w:rFonts w:ascii="Times New Roman" w:hAnsi="Times New Roman"/>
+          <w:color w:val="000000"/>
+        </w:rPr>
+      </w:pPr>
+      <w:r>
+        <w:rPr>
+          <w:rFonts w:ascii="Times New Roman" w:hAnsi="Times New Roman"/>
+          <w:color w:val="000000"/>
+        </w:rPr>
+        <w:t>Dear friends,</w:t>
+      </w:r>
+    </w:p>
+    <w:p>
+      <w:pPr>
+        <w:pStyle w:val="Normal"/>
+        <w:spacing w:lineRule="auto" w:line="240" w:before="0" w:after="0"/>
+        <w:rPr>
+          <w:rFonts w:ascii="Times New Roman" w:hAnsi="Times New Roman"/>
+          <w:color w:val="000000"/>
+        </w:rPr>
+      </w:pPr>
+      <w:r>
+        <w:rPr>
+          <w:rFonts w:ascii="Times New Roman" w:hAnsi="Times New Roman"/>
+          <w:color w:val="000000"/>
+        </w:rPr>
+      </w:r>
+    </w:p>
+    <w:p>
+      <w:pPr>
+        <w:pStyle w:val="Normal"/>
+        <w:spacing w:lineRule="auto" w:line="240" w:before="0" w:after="0"/>
+        <w:rPr>
+          <w:rFonts w:ascii="Times New Roman" w:hAnsi="Times New Roman"/>
+          <w:color w:val="000000"/>
+        </w:rPr>
+      </w:pPr>
+      <w:r>
+        <w:rPr>
+          <w:rFonts w:ascii="Times New Roman" w:hAnsi="Times New Roman"/>
+          <w:color w:val="000000"/>
+        </w:rPr>
+        <w:t>I have been actively travelling since 1985 (yes, 40 years!) across our beautiful country and also to a few countries overseas. I started travelling when there was no mobile phones to click photos at your will. In the early days of my travel using a film camera was not only expensive but also ensurd that I am mindful of the photos that I take, not only for its quality but also for the cost per photo developed. I migrated from a compact shoot at sight film camera to a SLR film camera in 1995 and then on to a Digital SLR camera in 2000. Over these 35 years, I have been capturing moments that appealed to me based on three elements : Light, Moment and Story. The time has come now to share them across the globe. And, therefore this website of mine “mohangraphy.com” is now up and running. It is a work in progress. I greatly appreciate your input, support, referral, and also signing up for future uploads.</w:t>
+      </w:r>
+    </w:p>
+    <w:p>
+      <w:pPr>
+        <w:pStyle w:val="Normal"/>
+        <w:spacing w:lineRule="auto" w:line="240" w:before="0" w:after="0"/>
+        <w:rPr>
+          <w:rFonts w:ascii="Times New Roman" w:hAnsi="Times New Roman"/>
+          <w:color w:val="000000"/>
+        </w:rPr>
+      </w:pPr>
+      <w:r>
+        <w:rPr>
+          <w:rFonts w:ascii="Times New Roman" w:hAnsi="Times New Roman"/>
+          <w:color w:val="000000"/>
+        </w:rPr>
+      </w:r>
+    </w:p>
+    <w:p>
+      <w:pPr>
+        <w:pStyle w:val="Normal"/>
+        <w:spacing w:lineRule="auto" w:line="240" w:before="0" w:after="0"/>
+        <w:rPr>
+          <w:rFonts w:ascii="Times New Roman" w:hAnsi="Times New Roman"/>
+          <w:color w:val="000000"/>
+        </w:rPr>
+      </w:pPr>
+      <w:r>
+        <w:rPr>
+          <w:rFonts w:ascii="Times New Roman" w:hAnsi="Times New Roman"/>
+          <w:color w:val="000000"/>
+        </w:rPr>
+        <w:t>While I believe in simplicity in terms of navigating around the website, I have also included “Travel Stories” where I plan to recall my trips and upload them in the days to come. Take y our time to travel with my memories and through my lens.</w:t>
+      </w:r>
+    </w:p>
+    <w:p>
+      <w:pPr>
+        <w:pStyle w:val="Normal"/>
+        <w:spacing w:lineRule="auto" w:line="240" w:before="0" w:after="0"/>
+        <w:rPr>
+          <w:rFonts w:ascii="Times New Roman" w:hAnsi="Times New Roman"/>
+          <w:color w:val="000000"/>
+        </w:rPr>
+      </w:pPr>
+      <w:r>
+        <w:rPr>
+          <w:rFonts w:ascii="Times New Roman" w:hAnsi="Times New Roman"/>
+          <w:color w:val="000000"/>
+        </w:rPr>
+      </w:r>
+    </w:p>
+    <w:p>
+      <w:pPr>
+        <w:pStyle w:val="Normal"/>
+        <w:spacing w:lineRule="auto" w:line="240" w:before="0" w:after="0"/>
+        <w:rPr>
+          <w:rFonts w:ascii="Times New Roman" w:hAnsi="Times New Roman"/>
+          <w:color w:val="000000"/>
+        </w:rPr>
+      </w:pPr>
+      <w:r>
+        <w:rPr>
+          <w:rFonts w:ascii="Times New Roman" w:hAnsi="Times New Roman"/>
+          <w:color w:val="000000"/>
+        </w:rPr>
+        <w:t>Warm Regards.</w:t>
+      </w:r>
+    </w:p>
+    <w:p>
+      <w:pPr>
+        <w:pStyle w:val="Normal"/>
+        <w:spacing w:lineRule="auto" w:line="240" w:before="0" w:after="0"/>
+        <w:rPr>
+          <w:rFonts w:ascii="Times New Roman" w:hAnsi="Times New Roman"/>
+          <w:color w:val="000000"/>
+        </w:rPr>
+      </w:pPr>
+      <w:r>
+        <w:rPr>
+          <w:rFonts w:ascii="Times New Roman" w:hAnsi="Times New Roman"/>
+          <w:color w:val="000000"/>
+        </w:rPr>
+      </w:r>
+      <w:r>
+        <w:br w:type="page"/>
+      </w:r>
+    </w:p>
+    <w:p>
+      <w:pPr>
+        <w:pStyle w:val="Heading2"/>
+        <w:spacing w:lineRule="auto" w:line="240" w:before="0" w:after="0"/>
+        <w:rPr>
+          <w:rFonts w:ascii="Times New Roman" w:hAnsi="Times New Roman"/>
+          <w:color w:val="000000"/>
+          <w:sz w:val="24"/>
+          <w:szCs w:val="24"/>
+        </w:rPr>
+      </w:pPr>
+      <w:r>
+        <w:rPr>
+          <w:rFonts w:ascii="Times New Roman" w:hAnsi="Times New Roman"/>
+          <w:color w:val="000000"/>
+          <w:sz w:val="24"/>
+          <w:szCs w:val="24"/>
+        </w:rPr>
+        <w:t>When your hard drive fills up — the right solution</w:t>
+      </w:r>
+    </w:p>
+    <w:p>
+      <w:pPr>
+        <w:pStyle w:val="BodyText"/>
+        <w:spacing w:lineRule="auto" w:line="240"/>
+        <w:rPr>
+          <w:rFonts w:ascii="Times New Roman" w:hAnsi="Times New Roman"/>
+          <w:color w:val="000000"/>
+        </w:rPr>
+      </w:pPr>
+      <w:r>
+        <w:rPr>
+          <w:rStyle w:val="Strong"/>
+          <w:rFonts w:ascii="Times New Roman" w:hAnsi="Times New Roman"/>
+          <w:color w:val="000000"/>
+        </w:rPr>
+        <w:t>Buy an external hard drive.</w:t>
+      </w:r>
+      <w:r>
+        <w:rPr>
+          <w:rFonts w:ascii="Times New Roman" w:hAnsi="Times New Roman"/>
+          <w:color w:val="000000"/>
+        </w:rPr>
+        <w:t xml:space="preserve"> A 4TB external drive costs around ₹7,000–8,000 ($80–90) and will last you a decade of photography.</w:t>
+      </w:r>
+    </w:p>
+    <w:p>
+      <w:pPr>
+        <w:pStyle w:val="PreformattedText"/>
+        <w:ind w:hanging="0" w:start="0" w:end="0"/>
+        <w:rPr>
+          <w:rFonts w:ascii="Times New Roman" w:hAnsi="Times New Roman" w:eastAsia="Arial" w:cs="Arial"/>
+          <w:color w:val="000000"/>
+          <w:sz w:val="24"/>
+          <w:szCs w:val="24"/>
+        </w:rPr>
+      </w:pPr>
+      <w:r>
+        <w:rPr>
+          <w:rStyle w:val="SourceText"/>
+          <w:rFonts w:ascii="var font-mono" w:hAnsi="var font-mono"/>
+          <w:color w:val="14181F"/>
+          <w:sz w:val="24"/>
+          <w:szCs w:val="24"/>
+          <w:shd w:fill="auto" w:val="clear"/>
+        </w:rPr>
+        <w:t>External Drive/</w:t>
+      </w:r>
+    </w:p>
+    <w:p>
+      <w:pPr>
+        <w:pStyle w:val="PreformattedText"/>
+        <w:rPr>
+          <w:rFonts w:ascii="Times New Roman" w:hAnsi="Times New Roman" w:eastAsia="Arial" w:cs="Arial"/>
+          <w:color w:val="000000"/>
+          <w:sz w:val="24"/>
+          <w:szCs w:val="24"/>
+        </w:rPr>
+      </w:pPr>
+      <w:r>
+        <w:rPr>
+          <w:rStyle w:val="SourceText"/>
+          <w:rFonts w:ascii="Times New Roman" w:hAnsi="Times New Roman"/>
+          <w:color w:val="14181F"/>
+          <w:sz w:val="24"/>
+          <w:szCs w:val="24"/>
+          <w:shd w:fill="auto" w:val="clear"/>
+        </w:rPr>
+        <w:t xml:space="preserve">  </w:t>
+      </w:r>
+      <w:r>
+        <w:rPr>
+          <w:rStyle w:val="SourceText"/>
+          <w:rFonts w:ascii="var font-mono" w:hAnsi="var font-mono"/>
+          <w:color w:val="14181F"/>
+          <w:sz w:val="24"/>
+          <w:szCs w:val="24"/>
+          <w:shd w:fill="auto" w:val="clear"/>
+        </w:rPr>
+        <w:t>Mohangraphy/</w:t>
+      </w:r>
+    </w:p>
+    <w:p>
+      <w:pPr>
+        <w:pStyle w:val="PreformattedText"/>
+        <w:rPr>
+          <w:rFonts w:ascii="Times New Roman" w:hAnsi="Times New Roman" w:eastAsia="Arial" w:cs="Arial"/>
+          <w:color w:val="000000"/>
+          <w:sz w:val="24"/>
+          <w:szCs w:val="24"/>
+        </w:rPr>
+      </w:pPr>
+      <w:r>
+        <w:rPr>
+          <w:rStyle w:val="SourceText"/>
+          <w:rFonts w:ascii="Times New Roman" w:hAnsi="Times New Roman"/>
+          <w:color w:val="14181F"/>
+          <w:sz w:val="24"/>
+          <w:szCs w:val="24"/>
+          <w:shd w:fill="auto" w:val="clear"/>
+        </w:rPr>
+        <w:t xml:space="preserve">    </w:t>
+      </w:r>
+      <w:r>
+        <w:rPr>
+          <w:rStyle w:val="SourceText"/>
+          <w:rFonts w:ascii="var font-mono" w:hAnsi="var font-mono"/>
+          <w:color w:val="14181F"/>
+          <w:sz w:val="24"/>
+          <w:szCs w:val="24"/>
+          <w:shd w:fill="auto" w:val="clear"/>
+        </w:rPr>
+        <w:t>Photos/          ← move originals here</w:t>
+      </w:r>
+    </w:p>
+    <w:p>
+      <w:pPr>
+        <w:pStyle w:val="PreformattedText"/>
+        <w:rPr>
+          <w:rFonts w:ascii="Times New Roman" w:hAnsi="Times New Roman" w:eastAsia="Arial" w:cs="Arial"/>
+          <w:color w:val="000000"/>
+          <w:sz w:val="24"/>
+          <w:szCs w:val="24"/>
+        </w:rPr>
+      </w:pPr>
+      <w:r>
+        <w:rPr>
+          <w:rStyle w:val="SourceText"/>
+          <w:rFonts w:ascii="Times New Roman" w:hAnsi="Times New Roman"/>
+          <w:color w:val="14181F"/>
+          <w:sz w:val="24"/>
+          <w:szCs w:val="24"/>
+          <w:shd w:fill="auto" w:val="clear"/>
+        </w:rPr>
+        <w:t xml:space="preserve">    </w:t>
+      </w:r>
+      <w:r>
+        <w:rPr>
+          <w:rStyle w:val="SourceText"/>
+          <w:rFonts w:ascii="var font-mono" w:hAnsi="var font-mono"/>
+          <w:color w:val="14181F"/>
+          <w:sz w:val="24"/>
+          <w:szCs w:val="24"/>
+          <w:shd w:fill="auto" w:val="clear"/>
+        </w:rPr>
+        <w:t>Scripts/         ← keep scripts here too</w:t>
+      </w:r>
+    </w:p>
+    <w:p>
+      <w:pPr>
+        <w:pStyle w:val="PreformattedText"/>
+        <w:rPr>
+          <w:rFonts w:ascii="Times New Roman" w:hAnsi="Times New Roman" w:eastAsia="Arial" w:cs="Arial"/>
+          <w:color w:val="000000"/>
+          <w:sz w:val="24"/>
+          <w:szCs w:val="24"/>
+        </w:rPr>
+      </w:pPr>
+      <w:r>
+        <w:rPr>
+          <w:rStyle w:val="SourceText"/>
+          <w:rFonts w:ascii="Times New Roman" w:hAnsi="Times New Roman"/>
+          <w:color w:val="14181F"/>
+          <w:sz w:val="24"/>
+          <w:szCs w:val="24"/>
+          <w:shd w:fill="auto" w:val="clear"/>
+        </w:rPr>
+        <w:t xml:space="preserve">    </w:t>
+      </w:r>
+      <w:r>
+        <w:rPr>
+          <w:rStyle w:val="SourceText"/>
+          <w:rFonts w:ascii="var font-mono" w:hAnsi="var font-mono"/>
+          <w:color w:val="14181F"/>
+          <w:sz w:val="24"/>
+          <w:szCs w:val="24"/>
+          <w:shd w:fill="auto" w:val="clear"/>
+        </w:rPr>
+        <w:t>Thumbs/          ← regenerated automatically</w:t>
+      </w:r>
+    </w:p>
+    <w:p>
+      <w:pPr>
+        <w:pStyle w:val="PreformattedText"/>
+        <w:spacing w:before="0" w:after="283"/>
+        <w:rPr>
+          <w:rFonts w:ascii="Times New Roman" w:hAnsi="Times New Roman" w:eastAsia="Arial" w:cs="Arial"/>
+          <w:color w:val="000000"/>
+          <w:sz w:val="24"/>
+          <w:szCs w:val="24"/>
+        </w:rPr>
+      </w:pPr>
+      <w:r>
+        <w:rPr>
+          <w:rStyle w:val="SourceText"/>
+          <w:rFonts w:ascii="Times New Roman" w:hAnsi="Times New Roman"/>
+          <w:color w:val="14181F"/>
+          <w:sz w:val="24"/>
+          <w:szCs w:val="24"/>
+          <w:shd w:fill="auto" w:val="clear"/>
+        </w:rPr>
+        <w:t xml:space="preserve">    </w:t>
+      </w:r>
+      <w:r>
+        <w:rPr>
+          <w:rStyle w:val="SourceText"/>
+          <w:rFonts w:ascii="var font-mono" w:hAnsi="var font-mono"/>
+          <w:color w:val="14181F"/>
+          <w:sz w:val="24"/>
+          <w:szCs w:val="24"/>
+          <w:shd w:fill="auto" w:val="clear"/>
+        </w:rPr>
+        <w:t>Web/             ← regenerated automatically</w:t>
+      </w:r>
+    </w:p>
+    <w:p>
+      <w:pPr>
+        <w:pStyle w:val="BodyText"/>
+        <w:spacing w:lineRule="auto" w:line="240"/>
+        <w:rPr>
+          <w:rFonts w:ascii="Times New Roman" w:hAnsi="Times New Roman"/>
+          <w:color w:val="000000"/>
+        </w:rPr>
+      </w:pPr>
+      <w:r>
+        <w:rPr>
+          <w:rFonts w:ascii="Times New Roman" w:hAnsi="Times New Roman"/>
+          <w:color w:val="000000"/>
+        </w:rPr>
+        <w:t xml:space="preserve">Then just update one line in </w:t>
+      </w:r>
+      <w:r>
+        <w:rPr>
+          <w:rStyle w:val="SourceText"/>
+          <w:rFonts w:ascii="Times New Roman" w:hAnsi="Times New Roman"/>
+          <w:color w:val="000000"/>
+        </w:rPr>
+        <w:t>Claude_mohangraphy.py</w:t>
+      </w:r>
+      <w:r>
+        <w:rPr>
+          <w:rFonts w:ascii="Times New Roman" w:hAnsi="Times New Roman"/>
+          <w:color w:val="000000"/>
+        </w:rPr>
+        <w:t>:</w:t>
+      </w:r>
+    </w:p>
+    <w:p>
+      <w:pPr>
+        <w:pStyle w:val="BodyText"/>
+        <w:spacing w:lineRule="auto" w:line="240"/>
+        <w:ind w:hanging="0" w:start="0" w:end="0"/>
+        <w:rPr>
+          <w:rFonts w:ascii="Times New Roman" w:hAnsi="Times New Roman"/>
+          <w:color w:val="000000"/>
+        </w:rPr>
+      </w:pPr>
+      <w:r>
+        <w:rPr>
+          <w:rFonts w:ascii="Times New Roman" w:hAnsi="Times New Roman"/>
+          <w:color w:val="000000"/>
+        </w:rPr>
+        <w:t>python</w:t>
+      </w:r>
+    </w:p>
+    <w:p>
+      <w:pPr>
+        <w:pStyle w:val="PreformattedText"/>
+        <w:ind w:hanging="0" w:start="0" w:end="0"/>
+        <w:rPr>
+          <w:rFonts w:ascii="Times New Roman" w:hAnsi="Times New Roman" w:eastAsia="Arial" w:cs="Arial"/>
+          <w:color w:val="000000"/>
+          <w:sz w:val="24"/>
+          <w:szCs w:val="24"/>
+        </w:rPr>
+      </w:pPr>
+      <w:r>
+        <w:rPr>
+          <w:rStyle w:val="SourceText"/>
+          <w:rFonts w:ascii="var font-mono" w:hAnsi="var font-mono"/>
+          <w:color w:val="6E7687"/>
+          <w:sz w:val="24"/>
+          <w:szCs w:val="24"/>
+          <w:shd w:fill="auto" w:val="clear"/>
+        </w:rPr>
+        <w:t># Change this:</w:t>
+      </w:r>
+    </w:p>
+    <w:p>
+      <w:pPr>
+        <w:pStyle w:val="PreformattedText"/>
+        <w:ind w:hanging="0" w:start="0" w:end="0"/>
+        <w:rPr>
+          <w:rFonts w:ascii="Times New Roman" w:hAnsi="Times New Roman" w:eastAsia="Arial" w:cs="Arial"/>
+          <w:color w:val="000000"/>
+          <w:sz w:val="24"/>
+          <w:szCs w:val="24"/>
+        </w:rPr>
+      </w:pPr>
+      <w:r>
+        <w:rPr>
+          <w:rStyle w:val="SourceText"/>
+          <w:rFonts w:ascii="var font-mono" w:hAnsi="var font-mono"/>
+          <w:color w:val="14181F"/>
+          <w:sz w:val="24"/>
+          <w:szCs w:val="24"/>
+          <w:shd w:fill="auto" w:val="clear"/>
+        </w:rPr>
+        <w:t xml:space="preserve">ROOT_DIR = </w:t>
+      </w:r>
+      <w:r>
+        <w:rPr>
+          <w:rStyle w:val="SourceText"/>
+          <w:rFonts w:ascii="var font-mono" w:hAnsi="var font-mono"/>
+          <w:color w:val="008000"/>
+          <w:sz w:val="24"/>
+          <w:szCs w:val="24"/>
+          <w:shd w:fill="auto" w:val="clear"/>
+        </w:rPr>
+        <w:t>"/Users/ncm/Pictures/Mohangraphy"</w:t>
+      </w:r>
+    </w:p>
+    <w:p>
+      <w:pPr>
+        <w:pStyle w:val="PreformattedText"/>
+        <w:rPr>
+          <w:rFonts w:ascii="Times New Roman" w:hAnsi="Times New Roman" w:eastAsia="Arial" w:cs="Arial"/>
+          <w:color w:val="000000"/>
+          <w:sz w:val="24"/>
+          <w:szCs w:val="24"/>
+        </w:rPr>
+      </w:pPr>
+      <w:r>
+        <w:rPr>
+          <w:rFonts w:eastAsia="Arial" w:cs="Arial" w:ascii="Times New Roman" w:hAnsi="Times New Roman"/>
+          <w:color w:val="000000"/>
+          <w:sz w:val="24"/>
+          <w:szCs w:val="24"/>
+        </w:rPr>
+      </w:r>
+    </w:p>
+    <w:p>
+      <w:pPr>
+        <w:pStyle w:val="PreformattedText"/>
+        <w:ind w:hanging="0" w:start="0" w:end="0"/>
+        <w:rPr>
+          <w:rFonts w:ascii="Times New Roman" w:hAnsi="Times New Roman" w:eastAsia="Arial" w:cs="Arial"/>
+          <w:color w:val="000000"/>
+          <w:sz w:val="24"/>
+          <w:szCs w:val="24"/>
+        </w:rPr>
+      </w:pPr>
+      <w:r>
+        <w:rPr>
+          <w:rStyle w:val="SourceText"/>
+          <w:rFonts w:ascii="var font-mono" w:hAnsi="var font-mono"/>
+          <w:color w:val="6E7687"/>
+          <w:sz w:val="24"/>
+          <w:szCs w:val="24"/>
+          <w:shd w:fill="auto" w:val="clear"/>
+        </w:rPr>
+        <w:t># To wherever your external drive mounts, e.g.:</w:t>
+      </w:r>
+    </w:p>
+    <w:p>
+      <w:pPr>
+        <w:pStyle w:val="PreformattedText"/>
+        <w:spacing w:before="0" w:after="283"/>
+        <w:ind w:hanging="0" w:start="0" w:end="0"/>
+        <w:rPr>
+          <w:rFonts w:ascii="Times New Roman" w:hAnsi="Times New Roman" w:eastAsia="Arial" w:cs="Arial"/>
+          <w:color w:val="000000"/>
+          <w:sz w:val="24"/>
+          <w:szCs w:val="24"/>
+        </w:rPr>
+      </w:pPr>
+      <w:r>
+        <w:rPr>
+          <w:rStyle w:val="SourceText"/>
+          <w:rFonts w:ascii="var font-mono" w:hAnsi="var font-mono"/>
+          <w:color w:val="14181F"/>
+          <w:sz w:val="24"/>
+          <w:szCs w:val="24"/>
+          <w:shd w:fill="auto" w:val="clear"/>
+        </w:rPr>
+        <w:t xml:space="preserve">ROOT_DIR = </w:t>
+      </w:r>
+      <w:r>
+        <w:rPr>
+          <w:rStyle w:val="SourceText"/>
+          <w:rFonts w:ascii="var font-mono" w:hAnsi="var font-mono"/>
+          <w:color w:val="008000"/>
+          <w:sz w:val="24"/>
+          <w:szCs w:val="24"/>
+          <w:shd w:fill="auto" w:val="clear"/>
+        </w:rPr>
+        <w:t>"/Volumes/MyDrive/Mohangraphy"</w:t>
+      </w:r>
+    </w:p>
+    <w:p>
+      <w:pPr>
+        <w:pStyle w:val="BodyText"/>
+        <w:spacing w:lineRule="auto" w:line="240"/>
+        <w:rPr>
+          <w:rFonts w:ascii="Times New Roman" w:hAnsi="Times New Roman"/>
+          <w:color w:val="000000"/>
+        </w:rPr>
+      </w:pPr>
+      <w:r>
+        <w:rPr>
+          <w:rFonts w:ascii="Times New Roman" w:hAnsi="Times New Roman"/>
+          <w:color w:val="000000"/>
+        </w:rPr>
+        <w:t>Redeploy once and everything works exactly as before.</w:t>
+      </w:r>
+    </w:p>
+    <w:p>
+      <w:pPr>
+        <w:pStyle w:val="HorizontalLine"/>
+        <w:spacing w:before="0" w:after="0"/>
+        <w:rPr>
+          <w:rFonts w:ascii="Times New Roman" w:hAnsi="Times New Roman"/>
+          <w:color w:val="000000"/>
+          <w:sz w:val="24"/>
+          <w:szCs w:val="24"/>
+        </w:rPr>
+      </w:pPr>
+      <w:r>
+        <w:rPr>
+          <w:rFonts w:ascii="Times New Roman" w:hAnsi="Times New Roman"/>
+          <w:color w:val="000000"/>
+          <w:sz w:val="24"/>
+          <w:szCs w:val="24"/>
+        </w:rPr>
+      </w:r>
+    </w:p>
+    <w:p>
+      <w:pPr>
+        <w:pStyle w:val="Heading2"/>
+        <w:spacing w:before="0" w:after="283"/>
+        <w:rPr>
+          <w:rFonts w:ascii="Times New Roman" w:hAnsi="Times New Roman"/>
+          <w:color w:val="000000"/>
+          <w:sz w:val="24"/>
+          <w:szCs w:val="24"/>
+        </w:rPr>
+      </w:pPr>
+      <w:r>
+        <w:rPr>
+          <w:rFonts w:ascii="Times New Roman" w:hAnsi="Times New Roman"/>
+          <w:color w:val="000000"/>
+          <w:sz w:val="24"/>
+          <w:szCs w:val="24"/>
+        </w:rPr>
+        <w:t>What goes to GitHub (the website)</w:t>
+      </w:r>
+    </w:p>
+    <w:p>
+      <w:pPr>
+        <w:pStyle w:val="BodyText"/>
+        <w:spacing w:lineRule="auto" w:line="240"/>
+        <w:rPr>
+          <w:rFonts w:ascii="Times New Roman" w:hAnsi="Times New Roman"/>
+          <w:color w:val="000000"/>
+        </w:rPr>
+      </w:pPr>
+      <w:r>
+        <w:rPr>
+          <w:rFonts w:ascii="Times New Roman" w:hAnsi="Times New Roman"/>
+          <w:color w:val="000000"/>
+        </w:rPr>
+        <w:t>GitHub only receives:</w:t>
+      </w:r>
+    </w:p>
+    <w:p>
+      <w:pPr>
+        <w:pStyle w:val="PreformattedText"/>
+        <w:ind w:hanging="0" w:start="0" w:end="0"/>
+        <w:rPr>
+          <w:rFonts w:ascii="Times New Roman" w:hAnsi="Times New Roman" w:eastAsia="Arial" w:cs="Arial"/>
+          <w:color w:val="000000"/>
+          <w:sz w:val="24"/>
+          <w:szCs w:val="24"/>
+        </w:rPr>
+      </w:pPr>
+      <w:r>
+        <w:rPr>
+          <w:rStyle w:val="SourceText"/>
+          <w:rFonts w:ascii="var font-mono" w:hAnsi="var font-mono"/>
+          <w:color w:val="14181F"/>
+          <w:sz w:val="24"/>
+          <w:szCs w:val="24"/>
+          <w:shd w:fill="auto" w:val="clear"/>
+        </w:rPr>
+        <w:t>index.html        ← the entire website (one file)</w:t>
+      </w:r>
+    </w:p>
+    <w:p>
+      <w:pPr>
+        <w:pStyle w:val="PreformattedText"/>
+        <w:rPr>
+          <w:rFonts w:ascii="Times New Roman" w:hAnsi="Times New Roman" w:eastAsia="Arial" w:cs="Arial"/>
+          <w:color w:val="000000"/>
+          <w:sz w:val="24"/>
+          <w:szCs w:val="24"/>
+        </w:rPr>
+      </w:pPr>
+      <w:r>
+        <w:rPr>
+          <w:rStyle w:val="SourceText"/>
+          <w:rFonts w:ascii="var font-mono" w:hAnsi="var font-mono"/>
+          <w:color w:val="14181F"/>
+          <w:sz w:val="24"/>
+          <w:szCs w:val="24"/>
+          <w:shd w:fill="auto" w:val="clear"/>
+        </w:rPr>
+        <w:t>Thumbs/           ← 800px thumbnails</w:t>
+      </w:r>
+    </w:p>
+    <w:p>
+      <w:pPr>
+        <w:pStyle w:val="PreformattedText"/>
+        <w:rPr>
+          <w:rFonts w:ascii="Times New Roman" w:hAnsi="Times New Roman" w:eastAsia="Arial" w:cs="Arial"/>
+          <w:color w:val="000000"/>
+          <w:sz w:val="24"/>
+          <w:szCs w:val="24"/>
+        </w:rPr>
+      </w:pPr>
+      <w:r>
+        <w:rPr>
+          <w:rStyle w:val="SourceText"/>
+          <w:rFonts w:ascii="var font-mono" w:hAnsi="var font-mono"/>
+          <w:color w:val="14181F"/>
+          <w:sz w:val="24"/>
+          <w:szCs w:val="24"/>
+          <w:shd w:fill="auto" w:val="clear"/>
+        </w:rPr>
+        <w:t>Web/              ← 2048px web copies</w:t>
+      </w:r>
+    </w:p>
+    <w:p>
+      <w:pPr>
+        <w:pStyle w:val="PreformattedText"/>
+        <w:spacing w:before="0" w:after="283"/>
+        <w:rPr>
+          <w:rFonts w:ascii="Times New Roman" w:hAnsi="Times New Roman" w:eastAsia="Arial" w:cs="Arial"/>
+          <w:color w:val="000000"/>
+          <w:sz w:val="24"/>
+          <w:szCs w:val="24"/>
+        </w:rPr>
+      </w:pPr>
+      <w:r>
+        <w:rPr>
+          <w:rStyle w:val="SourceText"/>
+          <w:rFonts w:ascii="var font-mono" w:hAnsi="var font-mono"/>
+          <w:color w:val="14181F"/>
+          <w:sz w:val="24"/>
+          <w:szCs w:val="24"/>
+          <w:shd w:fill="auto" w:val="clear"/>
+        </w:rPr>
+        <w:t>CNAME             ← your domain name</w:t>
+      </w:r>
+    </w:p>
+    <w:p>
+      <w:pPr>
+        <w:pStyle w:val="BodyText"/>
+        <w:spacing w:lineRule="auto" w:line="240"/>
+        <w:rPr>
+          <w:rFonts w:ascii="Times New Roman" w:hAnsi="Times New Roman"/>
+          <w:color w:val="000000"/>
+        </w:rPr>
+      </w:pPr>
+      <w:r>
+        <w:rPr>
+          <w:rFonts w:ascii="Times New Roman" w:hAnsi="Times New Roman"/>
+          <w:color w:val="000000"/>
+        </w:rPr>
+        <w:t xml:space="preserve">Your </w:t>
+      </w:r>
+      <w:r>
+        <w:rPr>
+          <w:rStyle w:val="Strong"/>
+          <w:rFonts w:ascii="Times New Roman" w:hAnsi="Times New Roman"/>
+          <w:color w:val="000000"/>
+        </w:rPr>
+        <w:t>original full-resolution photos never leave your Mac</w:t>
+      </w:r>
+      <w:r>
+        <w:rPr>
+          <w:rFonts w:ascii="Times New Roman" w:hAnsi="Times New Roman"/>
+          <w:color w:val="000000"/>
+        </w:rPr>
+        <w:t>. GitHub only gets the smaller web copies. This means:</w:t>
+      </w:r>
+    </w:p>
+    <w:p>
+      <w:pPr>
+        <w:pStyle w:val="BodyText"/>
+        <w:numPr>
+          <w:ilvl w:val="0"/>
+          <w:numId w:val="12"/>
+        </w:numPr>
+        <w:tabs>
+          <w:tab w:val="clear" w:pos="720"/>
+          <w:tab w:val="left" w:pos="0" w:leader="none"/>
+        </w:tabs>
+        <w:spacing w:lineRule="auto" w:line="240" w:before="0" w:after="0"/>
+        <w:ind w:hanging="283" w:start="709"/>
+        <w:rPr>
+          <w:rFonts w:ascii="Times New Roman" w:hAnsi="Times New Roman"/>
+          <w:color w:val="000000"/>
+        </w:rPr>
+      </w:pPr>
+      <w:r>
+        <w:rPr>
+          <w:rFonts w:ascii="Times New Roman" w:hAnsi="Times New Roman"/>
+          <w:color w:val="000000"/>
+        </w:rPr>
+        <w:t xml:space="preserve">Your originals are always safe on your drive </w:t>
+      </w:r>
+    </w:p>
+    <w:p>
+      <w:pPr>
+        <w:pStyle w:val="BodyText"/>
+        <w:numPr>
+          <w:ilvl w:val="0"/>
+          <w:numId w:val="12"/>
+        </w:numPr>
+        <w:tabs>
+          <w:tab w:val="clear" w:pos="720"/>
+          <w:tab w:val="left" w:pos="0" w:leader="none"/>
+        </w:tabs>
+        <w:spacing w:lineRule="auto" w:line="240" w:before="0" w:after="0"/>
+        <w:ind w:hanging="283" w:start="709"/>
+        <w:rPr>
+          <w:rFonts w:ascii="Times New Roman" w:hAnsi="Times New Roman"/>
+          <w:color w:val="000000"/>
+        </w:rPr>
+      </w:pPr>
+      <w:r>
+        <w:rPr>
+          <w:rFonts w:ascii="Times New Roman" w:hAnsi="Times New Roman"/>
+          <w:color w:val="000000"/>
+        </w:rPr>
+        <w:t xml:space="preserve">GitHub storage stays manageable </w:t>
+      </w:r>
+    </w:p>
+    <w:p>
+      <w:pPr>
+        <w:pStyle w:val="BodyText"/>
+        <w:numPr>
+          <w:ilvl w:val="0"/>
+          <w:numId w:val="12"/>
+        </w:numPr>
+        <w:tabs>
+          <w:tab w:val="clear" w:pos="720"/>
+          <w:tab w:val="left" w:pos="0" w:leader="none"/>
+        </w:tabs>
+        <w:spacing w:lineRule="auto" w:line="240"/>
+        <w:ind w:hanging="283" w:start="709"/>
+        <w:rPr>
+          <w:rFonts w:ascii="Times New Roman" w:hAnsi="Times New Roman"/>
+          <w:color w:val="000000"/>
+        </w:rPr>
+      </w:pPr>
+      <w:r>
+        <w:rPr>
+          <w:rFonts w:ascii="Times New Roman" w:hAnsi="Times New Roman"/>
+          <w:color w:val="000000"/>
+        </w:rPr>
+        <w:t xml:space="preserve">Visitors only ever download the 2048px versions anyway </w:t>
+      </w:r>
+    </w:p>
+    <w:p>
+      <w:pPr>
+        <w:pStyle w:val="HorizontalLine"/>
+        <w:spacing w:before="0" w:after="0"/>
+        <w:rPr>
+          <w:rFonts w:ascii="Times New Roman" w:hAnsi="Times New Roman"/>
+          <w:color w:val="000000"/>
+          <w:sz w:val="24"/>
+          <w:szCs w:val="24"/>
+        </w:rPr>
+      </w:pPr>
+      <w:r>
+        <w:rPr>
+          <w:rFonts w:ascii="Times New Roman" w:hAnsi="Times New Roman"/>
+          <w:color w:val="000000"/>
+          <w:sz w:val="24"/>
+          <w:szCs w:val="24"/>
+        </w:rPr>
+      </w:r>
+    </w:p>
+    <w:p>
+      <w:pPr>
+        <w:pStyle w:val="Heading2"/>
+        <w:spacing w:before="0" w:after="283"/>
+        <w:rPr>
+          <w:rFonts w:ascii="Times New Roman" w:hAnsi="Times New Roman"/>
+          <w:color w:val="000000"/>
+          <w:sz w:val="24"/>
+          <w:szCs w:val="24"/>
+        </w:rPr>
+      </w:pPr>
+      <w:r>
+        <w:rPr>
+          <w:rFonts w:ascii="Times New Roman" w:hAnsi="Times New Roman"/>
+          <w:color w:val="000000"/>
+          <w:sz w:val="24"/>
+          <w:szCs w:val="24"/>
+        </w:rPr>
+        <w:t>Practical storage estimate</w:t>
+      </w:r>
+    </w:p>
+    <w:tbl>
+      <w:tblPr>
+        <w:tblW w:w="6369" w:type="dxa"/>
+        <w:jc w:val="start"/>
+        <w:tblInd w:w="0" w:type="dxa"/>
+        <w:tblLayout w:type="fixed"/>
+        <w:tblCellMar>
+          <w:top w:w="28" w:type="dxa"/>
+          <w:start w:w="28" w:type="dxa"/>
+          <w:bottom w:w="28" w:type="dxa"/>
+          <w:end w:w="28" w:type="dxa"/>
+        </w:tblCellMar>
+      </w:tblPr>
+      <w:tblGrid>
+        <w:gridCol w:w="2198"/>
+        <w:gridCol w:w="2622"/>
+        <w:gridCol w:w="1549"/>
+      </w:tblGrid>
+      <w:tr>
+        <w:trPr>
+          <w:tblHeader w:val="true"/>
+        </w:trPr>
+        <w:tc>
+          <w:tcPr>
+            <w:tcW w:w="2198" w:type="dxa"/>
+            <w:tcBorders/>
+            <w:vAlign w:val="center"/>
+          </w:tcPr>
+          <w:p>
+            <w:pPr>
+              <w:pStyle w:val="TableHeading"/>
+              <w:rPr/>
+            </w:pPr>
+            <w:r>
+              <w:rPr/>
+              <w:t>Item</w:t>
+            </w:r>
+          </w:p>
+        </w:tc>
+        <w:tc>
+          <w:tcPr>
+            <w:tcW w:w="2622" w:type="dxa"/>
+            <w:tcBorders/>
+            <w:vAlign w:val="center"/>
+          </w:tcPr>
+          <w:p>
+            <w:pPr>
+              <w:pStyle w:val="TableHeading"/>
+              <w:rPr/>
+            </w:pPr>
+            <w:r>
+              <w:rPr/>
+              <w:t>Typical size per photo</w:t>
+            </w:r>
+          </w:p>
+        </w:tc>
+        <w:tc>
+          <w:tcPr>
+            <w:tcW w:w="1549" w:type="dxa"/>
+            <w:tcBorders/>
+            <w:vAlign w:val="center"/>
+          </w:tcPr>
+          <w:p>
+            <w:pPr>
+              <w:pStyle w:val="TableHeading"/>
+              <w:rPr/>
+            </w:pPr>
+            <w:r>
+              <w:rPr/>
+              <w:t>1000 photos</w:t>
+            </w:r>
+          </w:p>
+        </w:tc>
+      </w:tr>
+      <w:tr>
+        <w:trPr/>
+        <w:tc>
+          <w:tcPr>
+            <w:tcW w:w="2198" w:type="dxa"/>
+            <w:tcBorders/>
+            <w:vAlign w:val="center"/>
+          </w:tcPr>
+          <w:p>
+            <w:pPr>
+              <w:pStyle w:val="TableContents"/>
+              <w:rPr/>
+            </w:pPr>
+            <w:r>
+              <w:rPr/>
+              <w:t>Original (RAW)</w:t>
+            </w:r>
+          </w:p>
+        </w:tc>
+        <w:tc>
+          <w:tcPr>
+            <w:tcW w:w="2622" w:type="dxa"/>
+            <w:tcBorders/>
+            <w:vAlign w:val="center"/>
+          </w:tcPr>
+          <w:p>
+            <w:pPr>
+              <w:pStyle w:val="TableContents"/>
+              <w:rPr/>
+            </w:pPr>
+            <w:r>
+              <w:rPr/>
+              <w:t>25–40 MB</w:t>
+            </w:r>
+          </w:p>
+        </w:tc>
+        <w:tc>
+          <w:tcPr>
+            <w:tcW w:w="1549" w:type="dxa"/>
+            <w:tcBorders/>
+            <w:vAlign w:val="center"/>
+          </w:tcPr>
+          <w:p>
+            <w:pPr>
+              <w:pStyle w:val="TableContents"/>
+              <w:rPr/>
+            </w:pPr>
+            <w:r>
+              <w:rPr/>
+              <w:t>25–40 GB</w:t>
+            </w:r>
+          </w:p>
+        </w:tc>
+      </w:tr>
+      <w:tr>
+        <w:trPr/>
+        <w:tc>
+          <w:tcPr>
+            <w:tcW w:w="2198" w:type="dxa"/>
+            <w:tcBorders/>
+            <w:vAlign w:val="center"/>
+          </w:tcPr>
+          <w:p>
+            <w:pPr>
+              <w:pStyle w:val="TableContents"/>
+              <w:rPr/>
+            </w:pPr>
+            <w:r>
+              <w:rPr/>
+              <w:t>Original (JPG)</w:t>
+            </w:r>
+          </w:p>
+        </w:tc>
+        <w:tc>
+          <w:tcPr>
+            <w:tcW w:w="2622" w:type="dxa"/>
+            <w:tcBorders/>
+            <w:vAlign w:val="center"/>
+          </w:tcPr>
+          <w:p>
+            <w:pPr>
+              <w:pStyle w:val="TableContents"/>
+              <w:rPr/>
+            </w:pPr>
+            <w:r>
+              <w:rPr/>
+              <w:t>8–15 MB</w:t>
+            </w:r>
+          </w:p>
+        </w:tc>
+        <w:tc>
+          <w:tcPr>
+            <w:tcW w:w="1549" w:type="dxa"/>
+            <w:tcBorders/>
+            <w:vAlign w:val="center"/>
+          </w:tcPr>
+          <w:p>
+            <w:pPr>
+              <w:pStyle w:val="TableContents"/>
+              <w:rPr/>
+            </w:pPr>
+            <w:r>
+              <w:rPr/>
+              <w:t>8–15 GB</w:t>
+            </w:r>
+          </w:p>
+        </w:tc>
+      </w:tr>
+      <w:tr>
+        <w:trPr/>
+        <w:tc>
+          <w:tcPr>
+            <w:tcW w:w="2198" w:type="dxa"/>
+            <w:tcBorders/>
+            <w:vAlign w:val="center"/>
+          </w:tcPr>
+          <w:p>
+            <w:pPr>
+              <w:pStyle w:val="TableContents"/>
+              <w:rPr/>
+            </w:pPr>
+            <w:r>
+              <w:rPr/>
+              <w:t>Web copy (2048px)</w:t>
+            </w:r>
+          </w:p>
+        </w:tc>
+        <w:tc>
+          <w:tcPr>
+            <w:tcW w:w="2622" w:type="dxa"/>
+            <w:tcBorders/>
+            <w:vAlign w:val="center"/>
+          </w:tcPr>
+          <w:p>
+            <w:pPr>
+              <w:pStyle w:val="TableContents"/>
+              <w:rPr/>
+            </w:pPr>
+            <w:r>
+              <w:rPr/>
+              <w:t>1–3 MB</w:t>
+            </w:r>
+          </w:p>
+        </w:tc>
+        <w:tc>
+          <w:tcPr>
+            <w:tcW w:w="1549" w:type="dxa"/>
+            <w:tcBorders/>
+            <w:vAlign w:val="center"/>
+          </w:tcPr>
+          <w:p>
+            <w:pPr>
+              <w:pStyle w:val="TableContents"/>
+              <w:rPr/>
+            </w:pPr>
+            <w:r>
+              <w:rPr/>
+              <w:t>1–3 GB</w:t>
+            </w:r>
+          </w:p>
+        </w:tc>
+      </w:tr>
+      <w:tr>
+        <w:trPr/>
+        <w:tc>
+          <w:tcPr>
+            <w:tcW w:w="2198" w:type="dxa"/>
+            <w:tcBorders/>
+            <w:vAlign w:val="center"/>
+          </w:tcPr>
+          <w:p>
+            <w:pPr>
+              <w:pStyle w:val="TableContents"/>
+              <w:rPr/>
+            </w:pPr>
+            <w:r>
+              <w:rPr/>
+              <w:t>Thumbnail (800px)</w:t>
+            </w:r>
+          </w:p>
+        </w:tc>
+        <w:tc>
+          <w:tcPr>
+            <w:tcW w:w="2622" w:type="dxa"/>
+            <w:tcBorders/>
+            <w:vAlign w:val="center"/>
+          </w:tcPr>
+          <w:p>
+            <w:pPr>
+              <w:pStyle w:val="TableContents"/>
+              <w:rPr/>
+            </w:pPr>
+            <w:r>
+              <w:rPr/>
+              <w:t>200–400 KB</w:t>
+            </w:r>
+          </w:p>
+        </w:tc>
+        <w:tc>
+          <w:tcPr>
+            <w:tcW w:w="1549" w:type="dxa"/>
+            <w:tcBorders/>
+            <w:vAlign w:val="center"/>
+          </w:tcPr>
+          <w:p>
+            <w:pPr>
+              <w:pStyle w:val="TableContents"/>
+              <w:rPr/>
+            </w:pPr>
+            <w:r>
+              <w:rPr/>
+              <w:t>200–400 MB</w:t>
+            </w:r>
+          </w:p>
+        </w:tc>
+      </w:tr>
+    </w:tbl>
+    <w:p>
+      <w:pPr>
+        <w:pStyle w:val="BodyText"/>
+        <w:spacing w:lineRule="auto" w:line="240"/>
+        <w:rPr>
+          <w:rFonts w:ascii="Times New Roman" w:hAnsi="Times New Roman"/>
+          <w:color w:val="000000"/>
+        </w:rPr>
+      </w:pPr>
+      <w:r>
+        <w:rPr>
+          <w:rFonts w:ascii="Times New Roman" w:hAnsi="Times New Roman"/>
+          <w:color w:val="000000"/>
+        </w:rPr>
+        <w:t xml:space="preserve">So 1000 photos in RAW needs about </w:t>
+      </w:r>
+      <w:r>
+        <w:rPr>
+          <w:rStyle w:val="Strong"/>
+          <w:rFonts w:ascii="Times New Roman" w:hAnsi="Times New Roman"/>
+          <w:color w:val="000000"/>
+        </w:rPr>
+        <w:t>30GB on your Mac</w:t>
+      </w:r>
+      <w:r>
+        <w:rPr>
+          <w:rFonts w:ascii="Times New Roman" w:hAnsi="Times New Roman"/>
+          <w:color w:val="000000"/>
+        </w:rPr>
+        <w:t xml:space="preserve"> and only </w:t>
+      </w:r>
+      <w:r>
+        <w:rPr>
+          <w:rStyle w:val="Strong"/>
+          <w:rFonts w:ascii="Times New Roman" w:hAnsi="Times New Roman"/>
+          <w:color w:val="000000"/>
+        </w:rPr>
+        <w:t>1–3GB on GitHub</w:t>
+      </w:r>
+      <w:r>
+        <w:rPr>
+          <w:rFonts w:ascii="Times New Roman" w:hAnsi="Times New Roman"/>
+          <w:color w:val="000000"/>
+        </w:rPr>
+        <w:t>.</w:t>
+      </w:r>
+    </w:p>
+    <w:p>
+      <w:pPr>
+        <w:pStyle w:val="HorizontalLine"/>
+        <w:spacing w:before="0" w:after="0"/>
+        <w:rPr>
+          <w:rFonts w:ascii="Times New Roman" w:hAnsi="Times New Roman"/>
+          <w:color w:val="000000"/>
+          <w:sz w:val="24"/>
+          <w:szCs w:val="24"/>
+        </w:rPr>
+      </w:pPr>
+      <w:r>
+        <w:rPr>
+          <w:rFonts w:ascii="Times New Roman" w:hAnsi="Times New Roman"/>
+          <w:color w:val="000000"/>
+          <w:sz w:val="24"/>
+          <w:szCs w:val="24"/>
+        </w:rPr>
+      </w:r>
+    </w:p>
+    <w:p>
+      <w:pPr>
+        <w:pStyle w:val="Heading2"/>
+        <w:spacing w:before="0" w:after="283"/>
+        <w:rPr>
+          <w:rFonts w:ascii="Times New Roman" w:hAnsi="Times New Roman"/>
+          <w:color w:val="000000"/>
+          <w:sz w:val="24"/>
+          <w:szCs w:val="24"/>
+        </w:rPr>
+      </w:pPr>
+      <w:r>
+        <w:rPr>
+          <w:rFonts w:ascii="Times New Roman" w:hAnsi="Times New Roman"/>
+          <w:color w:val="000000"/>
+          <w:sz w:val="24"/>
+          <w:szCs w:val="24"/>
+        </w:rPr>
+        <w:t>Bottom line</w:t>
+      </w:r>
+    </w:p>
+    <w:tbl>
+      <w:tblPr>
+        <w:tblW w:w="7970" w:type="dxa"/>
+        <w:jc w:val="start"/>
+        <w:tblInd w:w="0" w:type="dxa"/>
+        <w:tblLayout w:type="fixed"/>
+        <w:tblCellMar>
+          <w:top w:w="28" w:type="dxa"/>
+          <w:start w:w="28" w:type="dxa"/>
+          <w:bottom w:w="28" w:type="dxa"/>
+          <w:end w:w="28" w:type="dxa"/>
+        </w:tblCellMar>
+      </w:tblPr>
+      <w:tblGrid>
+        <w:gridCol w:w="2225"/>
+        <w:gridCol w:w="5745"/>
+      </w:tblGrid>
+      <w:tr>
+        <w:trPr>
+          <w:tblHeader w:val="true"/>
+        </w:trPr>
+        <w:tc>
+          <w:tcPr>
+            <w:tcW w:w="2225" w:type="dxa"/>
+            <w:tcBorders/>
+            <w:vAlign w:val="center"/>
+          </w:tcPr>
+          <w:p>
+            <w:pPr>
+              <w:pStyle w:val="TableHeading"/>
+              <w:rPr/>
+            </w:pPr>
+            <w:r>
+              <w:rPr/>
+              <w:t>Problem</w:t>
+            </w:r>
+          </w:p>
+        </w:tc>
+        <w:tc>
+          <w:tcPr>
+            <w:tcW w:w="5745" w:type="dxa"/>
+            <w:tcBorders/>
+            <w:vAlign w:val="center"/>
+          </w:tcPr>
+          <w:p>
+            <w:pPr>
+              <w:pStyle w:val="TableHeading"/>
+              <w:rPr/>
+            </w:pPr>
+            <w:r>
+              <w:rPr/>
+              <w:t>Solution</w:t>
+            </w:r>
+          </w:p>
+        </w:tc>
+      </w:tr>
+      <w:tr>
+        <w:trPr/>
+        <w:tc>
+          <w:tcPr>
+            <w:tcW w:w="2225" w:type="dxa"/>
+            <w:tcBorders/>
+            <w:vAlign w:val="center"/>
+          </w:tcPr>
+          <w:p>
+            <w:pPr>
+              <w:pStyle w:val="TableContents"/>
+              <w:rPr/>
+            </w:pPr>
+            <w:r>
+              <w:rPr/>
+              <w:t>Mac hard drive full</w:t>
+            </w:r>
+          </w:p>
+        </w:tc>
+        <w:tc>
+          <w:tcPr>
+            <w:tcW w:w="5745" w:type="dxa"/>
+            <w:tcBorders/>
+            <w:vAlign w:val="center"/>
+          </w:tcPr>
+          <w:p>
+            <w:pPr>
+              <w:pStyle w:val="TableContents"/>
+              <w:rPr/>
+            </w:pPr>
+            <w:r>
+              <w:rPr/>
+              <w:t>External drive ~₹7,000</w:t>
+            </w:r>
+          </w:p>
+        </w:tc>
+      </w:tr>
+      <w:tr>
+        <w:trPr/>
+        <w:tc>
+          <w:tcPr>
+            <w:tcW w:w="2225" w:type="dxa"/>
+            <w:tcBorders/>
+            <w:vAlign w:val="center"/>
+          </w:tcPr>
+          <w:p>
+            <w:pPr>
+              <w:pStyle w:val="TableContents"/>
+              <w:rPr/>
+            </w:pPr>
+            <w:r>
+              <w:rPr/>
+              <w:t>Too many originals</w:t>
+            </w:r>
+          </w:p>
+        </w:tc>
+        <w:tc>
+          <w:tcPr>
+            <w:tcW w:w="5745" w:type="dxa"/>
+            <w:tcBorders/>
+            <w:vAlign w:val="center"/>
+          </w:tcPr>
+          <w:p>
+            <w:pPr>
+              <w:pStyle w:val="TableContents"/>
+              <w:rPr/>
+            </w:pPr>
+            <w:r>
+              <w:rPr/>
+              <w:t>Archive older shoots to external, keep recent on Mac</w:t>
+            </w:r>
+          </w:p>
+        </w:tc>
+      </w:tr>
+      <w:tr>
+        <w:trPr/>
+        <w:tc>
+          <w:tcPr>
+            <w:tcW w:w="2225" w:type="dxa"/>
+            <w:tcBorders/>
+            <w:vAlign w:val="center"/>
+          </w:tcPr>
+          <w:p>
+            <w:pPr>
+              <w:pStyle w:val="TableContents"/>
+              <w:rPr/>
+            </w:pPr>
+            <w:r>
+              <w:rPr/>
+              <w:t>GitHub storage limit</w:t>
+            </w:r>
+          </w:p>
+        </w:tc>
+        <w:tc>
+          <w:tcPr>
+            <w:tcW w:w="5745" w:type="dxa"/>
+            <w:tcBorders/>
+            <w:vAlign w:val="center"/>
+          </w:tcPr>
+          <w:p>
+            <w:pPr>
+              <w:pStyle w:val="TableContents"/>
+              <w:rPr/>
+            </w:pPr>
+            <w:r>
+              <w:rPr/>
+              <w:t>Years away — web copies are small</w:t>
+            </w:r>
+          </w:p>
+        </w:tc>
+      </w:tr>
+      <w:tr>
+        <w:trPr/>
+        <w:tc>
+          <w:tcPr>
+            <w:tcW w:w="2225" w:type="dxa"/>
+            <w:tcBorders/>
+            <w:vAlign w:val="center"/>
+          </w:tcPr>
+          <w:p>
+            <w:pPr>
+              <w:pStyle w:val="TableContents"/>
+              <w:rPr/>
+            </w:pPr>
+            <w:r>
+              <w:rPr/>
+              <w:t>Originals lost</w:t>
+            </w:r>
+          </w:p>
+        </w:tc>
+        <w:tc>
+          <w:tcPr>
+            <w:tcW w:w="5745" w:type="dxa"/>
+            <w:tcBorders/>
+            <w:vAlign w:val="center"/>
+          </w:tcPr>
+          <w:p>
+            <w:pPr>
+              <w:pStyle w:val="TableContents"/>
+              <w:rPr/>
+            </w:pPr>
+            <w:r>
+              <w:rPr/>
+              <w:t>External drive + Time Machine backup</w:t>
+            </w:r>
+          </w:p>
+        </w:tc>
+      </w:tr>
+    </w:tbl>
+    <w:p>
+      <w:pPr>
+        <w:pStyle w:val="BodyText"/>
+        <w:spacing w:lineRule="auto" w:line="240"/>
+        <w:rPr>
+          <w:rFonts w:ascii="Times New Roman" w:hAnsi="Times New Roman"/>
+          <w:color w:val="000000"/>
+        </w:rPr>
+      </w:pPr>
+      <w:r>
+        <w:rPr>
+          <w:rStyle w:val="Strong"/>
+          <w:rFonts w:ascii="Times New Roman" w:hAnsi="Times New Roman"/>
+          <w:color w:val="000000"/>
+        </w:rPr>
+        <w:t>The most important thing</w:t>
+      </w:r>
+      <w:r>
+        <w:rPr>
+          <w:rFonts w:ascii="Times New Roman" w:hAnsi="Times New Roman"/>
+          <w:color w:val="000000"/>
+        </w:rPr>
+        <w:t xml:space="preserve"> — whatever you do, always have your originals backed up in </w:t>
+      </w:r>
+      <w:r>
+        <w:rPr>
+          <w:rStyle w:val="Strong"/>
+          <w:rFonts w:ascii="Times New Roman" w:hAnsi="Times New Roman"/>
+          <w:color w:val="000000"/>
+        </w:rPr>
+        <w:t>two places</w:t>
+      </w:r>
+      <w:r>
+        <w:rPr>
+          <w:rFonts w:ascii="Times New Roman" w:hAnsi="Times New Roman"/>
+          <w:color w:val="000000"/>
+        </w:rPr>
+        <w:t>. An external drive for working files and a second backup (another drive or cloud like iCloud/Google Photos for originals). Hard drives do fail.</w:t>
+      </w:r>
+    </w:p>
+    <w:p>
+      <w:pPr>
+        <w:pStyle w:val="Normal"/>
+        <w:spacing w:lineRule="auto" w:line="240" w:before="0" w:after="0"/>
+        <w:rPr>
+          <w:rFonts w:ascii="Times New Roman" w:hAnsi="Times New Roman"/>
+          <w:color w:val="000000"/>
+        </w:rPr>
+      </w:pPr>
+      <w:r>
+        <w:rPr>
+          <w:rFonts w:ascii="Times New Roman" w:hAnsi="Times New Roman"/>
+          <w:color w:val="000000"/>
+        </w:rPr>
       </w:r>
     </w:p>
     <w:sectPr>
@@ -16464,7 +17990,7 @@
         <w:sz w:val="20"/>
         <w:szCs w:val="20"/>
       </w:rPr>
-      <w:t>13</w:t>
+      <w:t>15</w:t>
     </w:r>
     <w:r>
       <w:rPr>
@@ -16592,7 +18118,7 @@
         <w:sz w:val="20"/>
         <w:szCs w:val="20"/>
       </w:rPr>
-      <w:t>13</w:t>
+      <w:t>15</w:t>
     </w:r>
     <w:r>
       <w:rPr>
@@ -18107,6 +19633,143 @@
   <w:abstractNum w:abstractNumId="12">
     <w:lvl w:ilvl="0">
       <w:start w:val="1"/>
+      <w:numFmt w:val="bullet"/>
+      <w:lvlText w:val=""/>
+      <w:lvlJc w:val="start"/>
+      <w:pPr>
+        <w:tabs>
+          <w:tab w:val="num" w:pos="709"/>
+        </w:tabs>
+        <w:ind w:start="709" w:hanging="283"/>
+      </w:pPr>
+      <w:rPr>
+        <w:rFonts w:ascii="Symbol" w:hAnsi="Symbol" w:cs="Symbol" w:hint="default"/>
+      </w:rPr>
+    </w:lvl>
+    <w:lvl w:ilvl="1">
+      <w:start w:val="1"/>
+      <w:numFmt w:val="bullet"/>
+      <w:lvlText w:val=""/>
+      <w:lvlJc w:val="start"/>
+      <w:pPr>
+        <w:tabs>
+          <w:tab w:val="num" w:pos="1418"/>
+        </w:tabs>
+        <w:ind w:start="1418" w:hanging="283"/>
+      </w:pPr>
+      <w:rPr>
+        <w:rFonts w:ascii="Symbol" w:hAnsi="Symbol" w:cs="Symbol" w:hint="default"/>
+      </w:rPr>
+    </w:lvl>
+    <w:lvl w:ilvl="2">
+      <w:start w:val="1"/>
+      <w:numFmt w:val="bullet"/>
+      <w:lvlText w:val=""/>
+      <w:lvlJc w:val="start"/>
+      <w:pPr>
+        <w:tabs>
+          <w:tab w:val="num" w:pos="2127"/>
+        </w:tabs>
+        <w:ind w:start="2127" w:hanging="283"/>
+      </w:pPr>
+      <w:rPr>
+        <w:rFonts w:ascii="Symbol" w:hAnsi="Symbol" w:cs="Symbol" w:hint="default"/>
+      </w:rPr>
+    </w:lvl>
+    <w:lvl w:ilvl="3">
+      <w:start w:val="1"/>
+      <w:numFmt w:val="bullet"/>
+      <w:lvlText w:val=""/>
+      <w:lvlJc w:val="start"/>
+      <w:pPr>
+        <w:tabs>
+          <w:tab w:val="num" w:pos="2836"/>
+        </w:tabs>
+        <w:ind w:start="2836" w:hanging="283"/>
+      </w:pPr>
+      <w:rPr>
+        <w:rFonts w:ascii="Symbol" w:hAnsi="Symbol" w:cs="Symbol" w:hint="default"/>
+      </w:rPr>
+    </w:lvl>
+    <w:lvl w:ilvl="4">
+      <w:start w:val="1"/>
+      <w:numFmt w:val="bullet"/>
+      <w:lvlText w:val=""/>
+      <w:lvlJc w:val="start"/>
+      <w:pPr>
+        <w:tabs>
+          <w:tab w:val="num" w:pos="3545"/>
+        </w:tabs>
+        <w:ind w:start="3545" w:hanging="283"/>
+      </w:pPr>
+      <w:rPr>
+        <w:rFonts w:ascii="Symbol" w:hAnsi="Symbol" w:cs="Symbol" w:hint="default"/>
+      </w:rPr>
+    </w:lvl>
+    <w:lvl w:ilvl="5">
+      <w:start w:val="1"/>
+      <w:numFmt w:val="bullet"/>
+      <w:lvlText w:val=""/>
+      <w:lvlJc w:val="start"/>
+      <w:pPr>
+        <w:tabs>
+          <w:tab w:val="num" w:pos="4254"/>
+        </w:tabs>
+        <w:ind w:start="4254" w:hanging="283"/>
+      </w:pPr>
+      <w:rPr>
+        <w:rFonts w:ascii="Symbol" w:hAnsi="Symbol" w:cs="Symbol" w:hint="default"/>
+      </w:rPr>
+    </w:lvl>
+    <w:lvl w:ilvl="6">
+      <w:start w:val="1"/>
+      <w:numFmt w:val="bullet"/>
+      <w:lvlText w:val=""/>
+      <w:lvlJc w:val="start"/>
+      <w:pPr>
+        <w:tabs>
+          <w:tab w:val="num" w:pos="4963"/>
+        </w:tabs>
+        <w:ind w:start="4963" w:hanging="283"/>
+      </w:pPr>
+      <w:rPr>
+        <w:rFonts w:ascii="Symbol" w:hAnsi="Symbol" w:cs="Symbol" w:hint="default"/>
+      </w:rPr>
+    </w:lvl>
+    <w:lvl w:ilvl="7">
+      <w:start w:val="1"/>
+      <w:numFmt w:val="bullet"/>
+      <w:lvlText w:val=""/>
+      <w:lvlJc w:val="start"/>
+      <w:pPr>
+        <w:tabs>
+          <w:tab w:val="num" w:pos="5672"/>
+        </w:tabs>
+        <w:ind w:start="5672" w:hanging="283"/>
+      </w:pPr>
+      <w:rPr>
+        <w:rFonts w:ascii="Symbol" w:hAnsi="Symbol" w:cs="Symbol" w:hint="default"/>
+      </w:rPr>
+    </w:lvl>
+    <w:lvl w:ilvl="8">
+      <w:start w:val="1"/>
+      <w:numFmt w:val="bullet"/>
+      <w:lvlText w:val=""/>
+      <w:lvlJc w:val="start"/>
+      <w:pPr>
+        <w:tabs>
+          <w:tab w:val="num" w:pos="6381"/>
+        </w:tabs>
+        <w:ind w:start="6381" w:hanging="283"/>
+      </w:pPr>
+      <w:rPr>
+        <w:rFonts w:ascii="Symbol" w:hAnsi="Symbol" w:cs="Symbol" w:hint="default"/>
+      </w:rPr>
+    </w:lvl>
+  </w:abstractNum>
+  <w:abstractNum w:abstractNumId="13">
+    <w:lvl w:ilvl="0">
+      <w:start w:val="1"/>
       <w:numFmt w:val="none"/>
       <w:suff w:val="nothing"/>
       <w:lvlText w:val=""/>
@@ -18260,6 +19923,9 @@
     <w:abstractNumId w:val="12"/>
   </w:num>
   <w:num w:numId="13">
+    <w:abstractNumId w:val="13"/>
+  </w:num>
+  <w:num w:numId="14">
     <w:abstractNumId w:val="2"/>
     <w:lvlOverride w:ilvl="0">
       <w:startOverride w:val="1"/>
@@ -18622,6 +20288,29 @@
       <w:szCs w:val="12"/>
     </w:rPr>
   </w:style>
+  <w:style w:type="paragraph" w:styleId="TableContents">
+    <w:name w:val="Table Contents"/>
+    <w:basedOn w:val="Normal"/>
+    <w:qFormat/>
+    <w:pPr>
+      <w:widowControl w:val="false"/>
+      <w:suppressLineNumbers/>
+    </w:pPr>
+    <w:rPr/>
+  </w:style>
+  <w:style w:type="paragraph" w:styleId="TableHeading">
+    <w:name w:val="Table Heading"/>
+    <w:basedOn w:val="TableContents"/>
+    <w:qFormat/>
+    <w:pPr>
+      <w:suppressLineNumbers/>
+      <w:jc w:val="center"/>
+    </w:pPr>
+    <w:rPr>
+      <w:b/>
+      <w:bCs/>
+    </w:rPr>
+  </w:style>
 </w:styles>
 </file>
 

</xml_diff>